<commit_message>
docs: avanzar en la memoria del proyecto
- Actualizar Documentacion/DOC-Digital-Fit.docx.
</commit_message>
<xml_diff>
--- a/Documentacion/DOC-Digital-Fit.docx
+++ b/Documentacion/DOC-Digital-Fit.docx
@@ -2544,21 +2544,7 @@
                 <w:rStyle w:val="Hipervnculo"/>
                 <w:noProof/>
               </w:rPr>
-              <w:t>Ejecuc</w:t>
-            </w:r>
-            <w:r>
-              <w:rPr>
-                <w:rStyle w:val="Hipervnculo"/>
-                <w:noProof/>
-              </w:rPr>
-              <w:t>i</w:t>
-            </w:r>
-            <w:r>
-              <w:rPr>
-                <w:rStyle w:val="Hipervnculo"/>
-                <w:noProof/>
-              </w:rPr>
-              <w:t>ón</w:t>
+              <w:t>Ejecución</w:t>
             </w:r>
             <w:r>
               <w:rPr>
@@ -10073,23 +10059,7 @@
     </w:p>
     <w:p>
       <w:r>
-        <w:t xml:space="preserve">Estos departamentos representan las funciones básicas que una aplicación como Digital-FIT necesita para poder salir adelante: programación del </w:t>
-      </w:r>
-      <w:proofErr w:type="spellStart"/>
-      <w:r>
-        <w:t>backend</w:t>
-      </w:r>
-      <w:proofErr w:type="spellEnd"/>
-      <w:r>
-        <w:t xml:space="preserve">, diseño del </w:t>
-      </w:r>
-      <w:proofErr w:type="spellStart"/>
-      <w:r>
-        <w:t>frontend</w:t>
-      </w:r>
-      <w:proofErr w:type="spellEnd"/>
-      <w:r>
-        <w:t xml:space="preserve">, gestión de datos, comunicación y soporte al usuario. </w:t>
+        <w:t xml:space="preserve">Estos departamentos representan las funciones básicas que una aplicación como Digital-FIT necesita para poder salir adelante: programación del backend, diseño del frontend, gestión de datos, comunicación y soporte al usuario. </w:t>
       </w:r>
     </w:p>
     <w:p>
@@ -10641,15 +10611,7 @@
         </w:numPr>
       </w:pPr>
       <w:r>
-        <w:t xml:space="preserve">Mantener una estructura limpia en el </w:t>
-      </w:r>
-      <w:proofErr w:type="spellStart"/>
-      <w:r>
-        <w:t>backend</w:t>
-      </w:r>
-      <w:proofErr w:type="spellEnd"/>
-      <w:r>
-        <w:t xml:space="preserve"> utilizando Spring Boot para organizar controladores y lógica de la aplicación.</w:t>
+        <w:t>Mantener una estructura limpia en el backend utilizando Spring Boot para organizar controladores y lógica de la aplicación.</w:t>
       </w:r>
     </w:p>
     <w:p>
@@ -10677,10 +10639,26 @@
     </w:p>
     <w:p>
       <w:r>
-        <w:t>Para preparar el lanzamiento de Digital-FIT se ha elaborado un presupuesto inicial con los costes necesarios para desarrollar la aplicación, ponerla en funcionamiento y mantenerla durante su primer año. La empresa se plantea como una startup pequeña, por lo que se opta por herramientas y servicios económicos pero suficientes para garantizar que la plataforma funcione sin problemas.</w:t>
-      </w:r>
-    </w:p>
-    <w:p>
+        <w:t>Para preparar el lanzamiento de Digital-FIT se ha elaborado un presupuesto inicial teniendo en cuenta que la aplicación ya cuenta con una parte práctica desarrollada: backend, frontend, base de datos, autenticación, mapa, valoraciones, estadísticas y panel de administración.</w:t>
+      </w:r>
+    </w:p>
+    <w:p>
+      <w:r>
+        <w:t xml:space="preserve">La empresa se plantea como una </w:t>
+      </w:r>
+      <w:proofErr w:type="gramStart"/>
+      <w:r>
+        <w:t>startup pequeña</w:t>
+      </w:r>
+      <w:proofErr w:type="gramEnd"/>
+      <w:r>
+        <w:t>, por lo que no se parte de una inversión muy elevada. Aun así, para poner la aplicación en funcionamiento de forma real sería necesario contar con dominio, servidor, base de datos, mantenimiento técnico, diseño visual y algunas acciones básicas de difusión.</w:t>
+      </w:r>
+    </w:p>
+    <w:p>
+      <w:r>
+        <w:t>Los precios son estimaciones aproximadas basadas en servicios habituales para proyectos pequeños. Por ejemplo, un dominio .es puede encontrarse en torno a 7–15 € anuales dependiendo del proveedor, y un VPS básico puede rondar entre 6 y 10 € mensuales en planes iniciales.</w:t>
+      </w:r>
       <w:r>
         <w:pict w14:anchorId="3C6448C4">
           <v:rect id="_x0000_i1030" style="width:0;height:1.5pt" o:hralign="center" o:hrstd="t" o:hr="t" fillcolor="#a0a0a0" stroked="f"/>
@@ -10823,15 +10801,7 @@
           </w:tcPr>
           <w:p>
             <w:r>
-              <w:t xml:space="preserve">Hosting para </w:t>
-            </w:r>
-            <w:proofErr w:type="spellStart"/>
-            <w:r>
-              <w:t>backend</w:t>
-            </w:r>
-            <w:proofErr w:type="spellEnd"/>
-            <w:r>
-              <w:t xml:space="preserve"> y base de datos</w:t>
+              <w:t>Hosting para backend y base de datos</w:t>
             </w:r>
           </w:p>
         </w:tc>
@@ -11003,11 +10973,28 @@
           <w:bCs/>
         </w:rPr>
       </w:pPr>
-      <w:r>
-        <w:rPr>
-          <w:b/>
-          <w:bCs/>
-        </w:rPr>
+    </w:p>
+    <w:p>
+      <w:pPr>
+        <w:rPr>
+          <w:b/>
+          <w:bCs/>
+        </w:rPr>
+      </w:pPr>
+    </w:p>
+    <w:p>
+      <w:pPr>
+        <w:rPr>
+          <w:b/>
+          <w:bCs/>
+        </w:rPr>
+      </w:pPr>
+      <w:r>
+        <w:rPr>
+          <w:b/>
+          <w:bCs/>
+        </w:rPr>
+        <w:lastRenderedPageBreak/>
         <w:t>Costes de funcionamiento y mantenimiento anual</w:t>
       </w:r>
     </w:p>
@@ -11176,7 +11163,6 @@
     </w:p>
     <w:p>
       <w:r>
-        <w:lastRenderedPageBreak/>
         <w:pict w14:anchorId="66197EB2">
           <v:rect id="_x0000_i1032" style="width:0;height:1.5pt" o:hralign="center" o:hrstd="t" o:hr="t" fillcolor="#a0a0a0" stroked="f"/>
         </w:pict>
@@ -11311,6 +11297,150 @@
       </w:r>
       <w:r>
         <w:t xml:space="preserve"> variable según acuerdo, pero suficiente para cubrir gastos básicos.</w:t>
+      </w:r>
+    </w:p>
+    <w:p/>
+    <w:p/>
+    <w:p>
+      <w:pPr>
+        <w:pStyle w:val="Ttulo2"/>
+        <w:rPr>
+          <w:sz w:val="32"/>
+        </w:rPr>
+      </w:pPr>
+      <w:bookmarkStart w:id="41" w:name="_Toc219506285"/>
+      <w:r>
+        <w:rPr>
+          <w:sz w:val="32"/>
+        </w:rPr>
+        <w:lastRenderedPageBreak/>
+        <w:t>Ejecución</w:t>
+      </w:r>
+      <w:bookmarkEnd w:id="41"/>
+    </w:p>
+    <w:p>
+      <w:pPr>
+        <w:pStyle w:val="Ttulo3"/>
+      </w:pPr>
+      <w:r>
+        <w:t>Desarrollo Técnico de la aplicación</w:t>
+      </w:r>
+    </w:p>
+    <w:p>
+      <w:r>
+        <w:t>La parte práctica de Digital-FIT se ha desarrollado como una aplicación web completa, formada por un backend, un frontend y una base de datos</w:t>
+      </w:r>
+      <w:r>
+        <w:t xml:space="preserve"> creada con JPA</w:t>
+      </w:r>
+      <w:r>
+        <w:t xml:space="preserve">. </w:t>
+      </w:r>
+    </w:p>
+    <w:p>
+      <w:r>
+        <w:t>El objetivo de esta estructura es separar correctamente las responsabilidades del proyecto: el backend se encarga de la lógica interna y la gestión de datos, mientras que el frontend se encarga de la interfaz visual y de la interacción con el usuario.</w:t>
+      </w:r>
+    </w:p>
+    <w:p>
+      <w:r>
+        <w:t>Esta organización permite que la aplicación sea más fácil de mantener, ampliar y corregir. Además, se adapta a una forma de trabajo bastante habitual en aplicaciones web actuales, donde el cliente y el servidor funcionan de manera separada pero conectados mediante peticiones HTTP.</w:t>
+      </w:r>
+    </w:p>
+    <w:p>
+      <w:pPr>
+        <w:pStyle w:val="Ttulo3"/>
+      </w:pPr>
+      <w:r>
+        <w:t>Arquitectura general del proyecto</w:t>
+      </w:r>
+    </w:p>
+    <w:p>
+      <w:r>
+        <w:t>Digital-FIT se ha construido siguiendo una arquitectura cliente-servidor. El usuario interactúa con la aplicación desde el navegador, utilizando la parte frontend desarrollada con Angular. Desde esta interfaz se envían peticiones al backend, desarrollado con Spring Boot, que procesa la información, aplica la lógica necesaria y se comunica con la base de datos</w:t>
+      </w:r>
+      <w:r>
+        <w:t xml:space="preserve"> mediante JPA.</w:t>
+      </w:r>
+    </w:p>
+    <w:p>
+      <w:r>
+        <w:t>La comunicación entre ambas partes se realiza mediante una API REST. Esto significa que el frontend no accede directamente a la base de datos, sino que solicita la información al backend a través de rutas concretas. Por ejemplo, cuando un usuario quiere ver sus entrenamientos, guardar un centro o añadir una valoración, Angular envía una petición al servidor y Spring Boot devuelve la respuesta correspondiente.</w:t>
+      </w:r>
+    </w:p>
+    <w:p>
+      <w:r>
+        <w:t>Esta separación ayuda a que el proyecto esté mejor organizado. Si en el futuro se quisiera cambiar el diseño visual o añadir una versión móvil, se podría reutilizar gran parte del backend. Del mismo modo, si se añadieran nuevas funcionalidades en el servidor, podrían integrarse en el frontend mediante nuevos servicios y componentes.</w:t>
+      </w:r>
+    </w:p>
+    <w:p/>
+    <w:p/>
+    <w:p/>
+    <w:p>
+      <w:pPr>
+        <w:pStyle w:val="Ttulo3"/>
+      </w:pPr>
+      <w:r>
+        <w:lastRenderedPageBreak/>
+        <w:t>Backend con Spring Boot</w:t>
+      </w:r>
+    </w:p>
+    <w:p>
+      <w:r>
+        <w:t>El backend es la parte encargada de gestionar la lógica principal de Digital-FIT. Se ha desarrollado con Spring Boot porque permite crear aplicaciones web en Java de forma ordenada, utilizando controladores, servicios, repositorios y entidades.</w:t>
+      </w:r>
+    </w:p>
+    <w:p>
+      <w:r>
+        <w:t>1.-</w:t>
+      </w:r>
+      <w:r>
+        <w:t>Los controladores reciben las peticiones que llegan desde el frontend. Por ejemplo, peticiones para listar centros, crear entrenamientos, guardar lugares desde el mapa o gestionar valoraciones. Estos controladores no contienen toda la lógica directamente, sino que llaman a los servicios correspondientes.</w:t>
+      </w:r>
+    </w:p>
+    <w:p>
+      <w:r>
+        <w:t>2.-</w:t>
+      </w:r>
+      <w:r>
+        <w:t>Los servicios contienen la lógica principal de cada apartado. Aquí se realizan comprobaciones como verificar qué usuario está autenticado, comprobar si un recurso pertenece a ese usuario o preparar los datos antes de guardarlos. Esta capa es importante porque evita que toda la lógica quede mezclada en los controladores.</w:t>
+      </w:r>
+    </w:p>
+    <w:p>
+      <w:r>
+        <w:t>3.-</w:t>
+      </w:r>
+      <w:r>
+        <w:t xml:space="preserve">Los repositorios se encargan del acceso a la base de datos mediante Spring Data JPA. Gracias a esto, la aplicación puede guardar, buscar, actualizar y eliminar datos sin tener que escribir SQL manualmente en la mayoría de </w:t>
+      </w:r>
+      <w:proofErr w:type="gramStart"/>
+      <w:r>
+        <w:t>operaciones</w:t>
+      </w:r>
+      <w:proofErr w:type="gramEnd"/>
+      <w:r>
+        <w:t>. Esto facilita mucho el trabajo y permite mantener el código más limpio.</w:t>
+      </w:r>
+    </w:p>
+    <w:p>
+      <w:r>
+        <w:t>4.-</w:t>
+      </w:r>
+      <w:r>
+        <w:t>También se han utilizado DTO para transportar datos entre el frontend y el backend. Esto permite controlar qué información se recibe y qué información se devuelve, evitando exponer directamente las entidades internas de la base de datos.</w:t>
+      </w:r>
+    </w:p>
+    <w:p>
+      <w:r>
+        <w:t xml:space="preserve">5.-Y por supuesto las entidades de las que se compone el proyecto como Usuario.java, Entrenamiento, LugarPublico, CentroPrivado, </w:t>
+      </w:r>
+      <w:proofErr w:type="spellStart"/>
+      <w:r>
+        <w:t>etc</w:t>
+      </w:r>
+      <w:proofErr w:type="spellEnd"/>
+      <w:r>
+        <w:t>…</w:t>
       </w:r>
     </w:p>
     <w:p/>
@@ -11320,115 +11450,836 @@
     <w:p/>
     <w:p/>
     <w:p/>
+    <w:p>
+      <w:pPr>
+        <w:pStyle w:val="Ttulo3"/>
+      </w:pPr>
+      <w:r>
+        <w:lastRenderedPageBreak/>
+        <w:t>Frontend con Angular</w:t>
+      </w:r>
+    </w:p>
+    <w:p>
+      <w:r>
+        <w:t>El frontend se ha desarrollado con Angular y es la parte que ve y utiliza el usuario. Está formado por componentes, servicios y rutas. Cada componente representa una parte de la interfaz, como el listado de centros, el detalle de un lugar, el formulario de entrenamiento o el selector de mapa.</w:t>
+      </w:r>
+    </w:p>
+    <w:p>
+      <w:r>
+        <w:t>1.-</w:t>
+      </w:r>
+      <w:r>
+        <w:t>Los servicios de Angular se encargan de comunicarse con el backend. Por ejemplo, hay servicios para obtener centros, crear lugares, gestionar entrenamientos o enviar valoraciones. De esta forma, los componentes no tienen que manejar directamente las peticiones HTTP, sino que llaman a métodos ya preparados en los servicios.</w:t>
+      </w:r>
+    </w:p>
+    <w:p>
+      <w:r>
+        <w:t>2.-</w:t>
+      </w:r>
+      <w:r>
+        <w:t>La navegación de la aplicación se organiza mediante rutas. Esto permite que el usuario pueda moverse entre las distintas pantallas, como inicio, centros, lugares públicos, entrenamientos, valoraciones o panel de administración.</w:t>
+      </w:r>
+      <w:r>
+        <w:t xml:space="preserve"> </w:t>
+      </w:r>
+    </w:p>
+    <w:p>
+      <w:r>
+        <w:t>3.-</w:t>
+      </w:r>
+      <w:r>
+        <w:t>Durante el desarrollo del frontend también se ha cuidado la parte visual. Se ha intentado que la interfaz sea clara, moderna y fácil de usar. La aplicación está pensada para que el usuario pueda encontrar rápidamente las funciones principales sin tener que realizar demasiados pasos.</w:t>
+      </w:r>
+    </w:p>
     <w:p/>
     <w:p>
       <w:pPr>
+        <w:pStyle w:val="Ttulo3"/>
+      </w:pPr>
+      <w:r>
+        <w:t>Base de datos y organización de la información</w:t>
+      </w:r>
+    </w:p>
+    <w:p>
+      <w:r>
+        <w:t>1.-</w:t>
+      </w:r>
+      <w:r>
+        <w:t>Digital-FIT utiliza una base de datos relacional</w:t>
+      </w:r>
+      <w:r>
+        <w:t xml:space="preserve"> creada con Spring mediante </w:t>
+      </w:r>
+      <w:proofErr w:type="spellStart"/>
+      <w:r>
+        <w:t>JPA.La</w:t>
+      </w:r>
+      <w:proofErr w:type="spellEnd"/>
+      <w:r>
+        <w:t xml:space="preserve"> </w:t>
+      </w:r>
+      <w:proofErr w:type="gramStart"/>
+      <w:r>
+        <w:t>app</w:t>
+      </w:r>
+      <w:proofErr w:type="gramEnd"/>
+      <w:r>
+        <w:t xml:space="preserve"> usa la base</w:t>
+      </w:r>
+      <w:r>
+        <w:t xml:space="preserve"> para almacenar la información principal de la aplicación. En ella se guardan usuarios, centros privados, lugares públicos, entrenamientos, valoraciones y otros datos necesarios para el funcionamiento del sistema.</w:t>
+      </w:r>
+    </w:p>
+    <w:p>
+      <w:pPr>
+        <w:jc w:val="left"/>
+      </w:pPr>
+      <w:r>
+        <w:t>2.-</w:t>
+      </w:r>
+      <w:r>
+        <w:t>La base de datos permite diferenciar entre información general de la aplicación e información propia de cada usuario. Por ejemplo, el administrador puede gestionar centros o lugares base, mientras que cada usuario puede guardar sus propios centros, lugares o entrenamientos personales.</w:t>
+      </w:r>
+    </w:p>
+    <w:p>
+      <w:pPr>
+        <w:jc w:val="left"/>
+      </w:pPr>
+      <w:r>
+        <w:t>3.-</w:t>
+      </w:r>
+      <w:r>
+        <w:t>Esta estructura hace que la aplicación sea más flexible. Un usuario puede tener su propio contenido sin afectar al resto, y al mismo tiempo la aplicación puede mantener datos generales que estén disponibles para todos.</w:t>
+      </w:r>
+    </w:p>
+    <w:p>
+      <w:pPr>
+        <w:jc w:val="left"/>
+      </w:pPr>
+    </w:p>
+    <w:p>
+      <w:pPr>
+        <w:pStyle w:val="Ttulo3"/>
+      </w:pPr>
+      <w:r>
+        <w:lastRenderedPageBreak/>
+        <w:t>Sistema de usuarios y roles</w:t>
+      </w:r>
+    </w:p>
+    <w:p>
+      <w:r>
+        <w:t>1.-</w:t>
+      </w:r>
+      <w:r>
+        <w:t>La aplicación cuenta con un sistema de autenticación que permite registrar usuarios e iniciar sesión. Cada usuario accede a su propia información y no puede modificar los datos personales de otros usuarios.</w:t>
+      </w:r>
+    </w:p>
+    <w:p>
+      <w:r>
+        <w:t>2.-</w:t>
+      </w:r>
+      <w:r>
+        <w:t xml:space="preserve">También se han diferenciado roles dentro del sistema. El usuario normal puede consultar centros y lugares, guardar ubicaciones, crear entrenamientos y realizar valoraciones. </w:t>
+      </w:r>
+      <w:r>
+        <w:t>Mientras que e</w:t>
+      </w:r>
+      <w:r>
+        <w:t>l administrador dispone de funciones adicionales para gestionar los datos base de la aplicación, como centros privados y lugares públicos.</w:t>
+      </w:r>
+    </w:p>
+    <w:p>
+      <w:r>
+        <w:t>3.-</w:t>
+      </w:r>
+      <w:r>
+        <w:t>Este sistema de roles permite separar las funciones de uso normal de las funciones de gestión. De esta manera, se evita que cualquier usuario pueda modificar información importante de la aplicación.</w:t>
+      </w:r>
+    </w:p>
+    <w:p/>
+    <w:p>
+      <w:pPr>
+        <w:pStyle w:val="Ttulo3"/>
+      </w:pPr>
+      <w:r>
+        <w:t>Mapa interactivo con Leaflet y OpenStreetMap</w:t>
+      </w:r>
+    </w:p>
+    <w:p>
+      <w:r>
+        <w:t>1.-</w:t>
+      </w:r>
+      <w:r>
+        <w:t>Una de las funcionalidades más importantes de Digital-FIT es el mapa interactivo. Para implementarlo se ha utilizado Leaflet junto con OpenStreetMap. Esta parte permite trabajar con ubicaciones reales dentro de la aplicación.</w:t>
+      </w:r>
+    </w:p>
+    <w:p>
+      <w:r>
+        <w:t>2.-</w:t>
+      </w:r>
+      <w:r>
+        <w:t>El mapa permite seleccionar una ubicación manualmente haciendo clic sobre el mapa. Al hacerlo, se guardan las coordenadas de latitud y longitud, que posteriormente se envían al backend para almacenar el centro o lugar correspondiente.</w:t>
+      </w:r>
+    </w:p>
+    <w:p>
+      <w:r>
+        <w:t>3.-</w:t>
+      </w:r>
+      <w:r>
+        <w:t>También se ha incorporado una barra de búsqueda para localizar direcciones o zonas de la Comunidad Valenciana. Esto resulta útil para añadir centros o lugares sin tener que buscar manualmente en el mapa. Además, el mapa se ha limitado para evitar que el usuario se desplace fuera de la zona prevista para el proyecto.</w:t>
+      </w:r>
+    </w:p>
+    <w:p>
+      <w:pPr>
+        <w:jc w:val="left"/>
+      </w:pPr>
+      <w:r>
+        <w:t>4.-</w:t>
+      </w:r>
+      <w:r>
+        <w:t>Esta funcionalidad aporta mucho valor a la aplicación, ya que Digital-FIT no solo muestra información escrita, sino que también trabaja con ubicaciones reales y permite situar centros y espacios deportivos de forma visual.</w:t>
+      </w:r>
+    </w:p>
+    <w:p>
+      <w:pPr>
+        <w:jc w:val="left"/>
+      </w:pPr>
+    </w:p>
+    <w:p>
+      <w:pPr>
+        <w:jc w:val="left"/>
+      </w:pPr>
+    </w:p>
+    <w:p>
+      <w:pPr>
+        <w:pStyle w:val="Ttulo3"/>
+      </w:pPr>
+      <w:r>
+        <w:lastRenderedPageBreak/>
+        <w:t>Entrenamientos y gestión personal del usuario</w:t>
+      </w:r>
+    </w:p>
+    <w:p>
+      <w:pPr>
+        <w:jc w:val="left"/>
+      </w:pPr>
+      <w:r>
+        <w:t>1.-</w:t>
+      </w:r>
+      <w:r>
+        <w:t>La aplicación incluye un apartado de entrenamientos donde el usuario puede gestionar sus propias rutinas. El objetivo de esta parte es que Digital-FIT no sea solo una herramienta para buscar instalaciones, sino también una aplicación útil para organizar el entrenamiento personal.</w:t>
+      </w:r>
+    </w:p>
+    <w:p>
+      <w:pPr>
+        <w:jc w:val="left"/>
+      </w:pPr>
+      <w:r>
+        <w:t>2.-</w:t>
+      </w:r>
+      <w:r>
+        <w:t>El usuario puede crear entrenamientos, consultar sus datos y eliminarlos cuando ya no los necesite. Esta funcionalidad está vinculada a su cuenta, por lo que cada usuario trabaja con sus propios entrenamientos.</w:t>
+      </w:r>
+    </w:p>
+    <w:p>
+      <w:pPr>
+        <w:jc w:val="left"/>
+      </w:pPr>
+    </w:p>
+    <w:p>
+      <w:pPr>
+        <w:pStyle w:val="Ttulo3"/>
+      </w:pPr>
+      <w:r>
+        <w:t>Sistema de valoraciones</w:t>
+      </w:r>
+    </w:p>
+    <w:p>
+      <w:pPr>
+        <w:jc w:val="left"/>
+      </w:pPr>
+      <w:r>
+        <w:t>1.-</w:t>
+      </w:r>
+      <w:r>
+        <w:t>Digital-FIT también incluye un sistema de valoraciones. Los usuarios pueden puntuar y comentar centros o lugares, aportando información útil para otras personas que quieran conocer mejor una instalación antes de acudir a ella.</w:t>
+      </w:r>
+    </w:p>
+    <w:p>
+      <w:pPr>
+        <w:jc w:val="left"/>
+      </w:pPr>
+      <w:r>
+        <w:t>2.-</w:t>
+      </w:r>
+      <w:r>
+        <w:t>Esta parte mejora la interacción dentro de la aplicación y hace que el contenido no dependa únicamente del administrador. Las valoraciones ayudan a que la información sea más completa y cercana a la experiencia real de los usuarios.</w:t>
+      </w:r>
+    </w:p>
+    <w:p>
+      <w:pPr>
+        <w:jc w:val="left"/>
+      </w:pPr>
+    </w:p>
+    <w:p>
+      <w:pPr>
+        <w:pStyle w:val="Ttulo3"/>
+      </w:pPr>
+      <w:r>
+        <w:t>Estadísticas automáticas</w:t>
+      </w:r>
+    </w:p>
+    <w:p>
+      <w:r>
+        <w:t>1.- Digital-FIT también incorpora un apartado de estadísticas automáticas. Esta funcionalidad permite mostrar información resumida sobre el uso de la aplicación y los datos registrados en el sistema.</w:t>
+      </w:r>
+    </w:p>
+    <w:p>
+      <w:r>
+        <w:t>2.- Estas estadísticas ayudan a visualizar de forma rápida algunos datos importantes, como el número de centros, lugares, usuarios, entrenamientos o valoraciones existentes. De esta manera, el administrador puede tener una visión general del estado de la aplicación sin tener que revisar cada apartado manualmente.</w:t>
+      </w:r>
+    </w:p>
+    <w:p>
+      <w:pPr>
+        <w:jc w:val="left"/>
+      </w:pPr>
+      <w:r>
+        <w:t>3.- Este apartado aporta valor a la parte de administración, ya que permite controlar mejor la evolución de la aplicación y detectar si el sistema va creciendo con el tiempo. En una versión futura, estas estadísticas podrían ampliarse con gráficos, filtros por fechas o análisis más detallados del comportamiento de los usuarios.</w:t>
+      </w:r>
+    </w:p>
+    <w:p>
+      <w:pPr>
+        <w:pStyle w:val="Ttulo3"/>
+      </w:pPr>
+      <w:r>
+        <w:lastRenderedPageBreak/>
+        <w:t>Panel de administración</w:t>
+      </w:r>
+    </w:p>
+    <w:p>
+      <w:r>
+        <w:t>1.-</w:t>
+      </w:r>
+      <w:r>
+        <w:t>El panel de administración permite gestionar información importante de la aplicación. Desde esta parte, el administrador puede controlar los datos base que después estarán disponibles para los usuarios.</w:t>
+      </w:r>
+    </w:p>
+    <w:p>
+      <w:r>
+        <w:t>2.-</w:t>
+      </w:r>
+      <w:r>
+        <w:t>Esta función es necesaria para mantener la aplicación ordenada y actualizada. En una versión real, este panel permitiría revisar centros, lugares, datos incorrectos o nuevos elementos añadidos al sistema.</w:t>
+      </w:r>
+    </w:p>
+    <w:p/>
+    <w:p>
+      <w:pPr>
+        <w:pStyle w:val="Ttulo3"/>
+      </w:pPr>
+      <w:r>
+        <w:t>Soporte y contacto</w:t>
+      </w:r>
+    </w:p>
+    <w:p>
+      <w:r>
+        <w:t>1.- La aplicación también incluye un apartado de soporte y contacto, pensado para que los usuarios puedan comunicar dudas, sugerencias o posibles incidencias relacionadas con el uso de Digital-FIT.</w:t>
+      </w:r>
+    </w:p>
+    <w:p>
+      <w:r>
+        <w:t>2.- Esta funcionalidad es importante porque permite mantener una vía de comunicación entre los usuarios y la administración de la aplicación. Si un usuario encuentra un error, tiene problemas con su cuenta o quiere proponer una mejora, puede utilizar este apartado para enviar la información correspondiente.</w:t>
+      </w:r>
+    </w:p>
+    <w:p>
+      <w:r>
+        <w:t>3.- El sistema de soporte ayuda a mejorar la aplicación de forma progresiva, ya que permite recoger feedback real de los usuarios. Además, aporta una imagen más profesional al proyecto, porque muestra que la aplicación no solo ofrece funcionalidades, sino que también contempla la atención al usuario y la mejora continua.</w:t>
+      </w:r>
+    </w:p>
+    <w:p>
+      <w:pPr>
+        <w:jc w:val="left"/>
+      </w:pPr>
+    </w:p>
+    <w:p>
+      <w:pPr>
+        <w:jc w:val="left"/>
+      </w:pPr>
+    </w:p>
+    <w:p>
+      <w:pPr>
+        <w:jc w:val="left"/>
+      </w:pPr>
+    </w:p>
+    <w:p>
+      <w:pPr>
+        <w:jc w:val="left"/>
+      </w:pPr>
+    </w:p>
+    <w:p>
+      <w:pPr>
+        <w:jc w:val="left"/>
+      </w:pPr>
+    </w:p>
+    <w:p>
+      <w:pPr>
+        <w:jc w:val="left"/>
+      </w:pPr>
+    </w:p>
+    <w:p>
+      <w:pPr>
+        <w:jc w:val="left"/>
+      </w:pPr>
+    </w:p>
+    <w:p>
+      <w:pPr>
         <w:pStyle w:val="Ttulo2"/>
-        <w:rPr>
-          <w:sz w:val="32"/>
-        </w:rPr>
-      </w:pPr>
-      <w:bookmarkStart w:id="41" w:name="_Toc219506285"/>
-      <w:r>
-        <w:rPr>
-          <w:sz w:val="32"/>
-        </w:rPr>
+      </w:pPr>
+      <w:r>
         <w:lastRenderedPageBreak/>
-        <w:t>Ejecución</w:t>
-      </w:r>
-      <w:bookmarkEnd w:id="41"/>
+        <w:t>Secuenciación y temporalización del desarrollo</w:t>
+      </w:r>
+    </w:p>
+    <w:p>
+      <w:r>
+        <w:t xml:space="preserve">El desarrollo </w:t>
+      </w:r>
+      <w:r>
+        <w:t>se</w:t>
+      </w:r>
+      <w:r>
+        <w:t xml:space="preserve"> ha realizado de forma progresiva, dividiendo el trabajo en distintas fases. </w:t>
+      </w:r>
     </w:p>
     <w:p>
       <w:pPr>
         <w:pStyle w:val="Ttulo3"/>
       </w:pPr>
-      <w:bookmarkStart w:id="42" w:name="_Toc219506286"/>
-      <w:r>
-        <w:t>Seguridad y protección de datos</w:t>
-      </w:r>
-      <w:bookmarkEnd w:id="42"/>
-    </w:p>
-    <w:p>
-      <w:r>
-        <w:t xml:space="preserve">Digital-FIT gestiona información básica de los usuarios, como el nombre, el correo electrónico y los entrenamientos personales registrados en la aplicación. Además, la aplicación permite realizar búsquedas de centros deportivos y zonas públicas a partir de ubicaciones introducidas por el usuario, por lo que también se tiene en cuenta el tratamiento responsable de este tipo de datos. </w:t>
-      </w:r>
-    </w:p>
-    <w:p>
-      <w:r>
-        <w:t>Por este motivo, se considera importante aplicar medidas de seguridad básicas que garanticen la protección de la información y el uso correcto de la plataforma</w:t>
-      </w:r>
-      <w:r>
-        <w:t>:</w:t>
-      </w:r>
-    </w:p>
-    <w:p>
-      <w:r>
-        <w:t>En primer lugar, el acceso a la aplicación se realiza mediante un sistema de registro e inicio de sesión, lo que permite que cada usuario solo pueda acceder a su propia información. Las contraseñas no se almacenan en texto plano, sino que se guardan de forma cifrada para evitar accesos no autorizados en caso de incidencia.</w:t>
-      </w:r>
-    </w:p>
-    <w:p>
-      <w:r>
-        <w:t>Además, la aplicación solo recoge los datos estrictamente necesarios para su funcionamiento, evitando almacenar información sensible que no sea relevante para el uso de</w:t>
-      </w:r>
-      <w:r>
-        <w:t xml:space="preserve"> la app.</w:t>
-      </w:r>
-    </w:p>
-    <w:p>
-      <w:r>
-        <w:t>En el caso de las búsquedas por ubicación, estos datos se utilizan únicamente para mostrar resultados cercanos y no se almacenan de forma permanente. De esta manera, se cumple con los principios básicos de protección de datos y se reduce el riesgo en caso de fallos de seguridad.</w:t>
-      </w:r>
-    </w:p>
-    <w:p>
-      <w:r>
-        <w:t xml:space="preserve">Por último, Digital-FIT tiene en cuenta la normativa vigente en materia de protección de datos, como el RGPD, informando al usuario del uso de sus datos y permitiendo su eliminación si así lo solicita. </w:t>
+      <w:r>
+        <w:t>1.- Primera fase: definición de la idea y análisis inicial</w:t>
+      </w:r>
+    </w:p>
+    <w:p>
+      <w:r>
+        <w:t>La primera fase consistió en definir la idea principal del proyecto y concretar qué problema quería resolver Digital-FIT. En esta etapa se trabajó la parte teórica del proyecto, el público objetivo, el análisis del entorno, la competencia, la viabilidad inicial, los objetivos y la identidad de la aplicación.</w:t>
+      </w:r>
+    </w:p>
+    <w:p>
+      <w:r>
+        <w:t>También se diseñaron los primeros mockups y el modelo conceptual de la base de datos. Esto sirvió como base para saber qué pantallas serían necesarias, qué datos debía almacenar la aplicación y qué funcionalidades principales debía tener.</w:t>
+      </w:r>
+    </w:p>
+    <w:p/>
+    <w:p>
+      <w:pPr>
+        <w:pStyle w:val="Ttulo3"/>
+      </w:pPr>
+      <w:r>
+        <w:t>2.- Segunda fase: diseño de la base de datos y estructura del backend</w:t>
+      </w:r>
+    </w:p>
+    <w:p>
+      <w:r>
+        <w:t>Una vez definida la idea, se comenzó con la parte técnica del backend. En esta fase se plantearon las entidades principales de la aplicación, como usuarios, centros privados, lugares públicos, entrenamientos, valoraciones y soporte.</w:t>
+      </w:r>
+    </w:p>
+    <w:p>
+      <w:r>
+        <w:t xml:space="preserve">También se crearon los </w:t>
+      </w:r>
+      <w:proofErr w:type="gramStart"/>
+      <w:r>
+        <w:t>repositorios</w:t>
+      </w:r>
+      <w:r>
+        <w:t>,dto</w:t>
+      </w:r>
+      <w:proofErr w:type="gramEnd"/>
+      <w:r>
+        <w:t>,controllers</w:t>
+      </w:r>
+      <w:r>
+        <w:t xml:space="preserve"> y servicios necesarios para trabajar con la base de datos. La prioridad fue conseguir una estructura clara que permitiera crear, consultar, modificar y eliminar información de forma ordenada.</w:t>
+      </w:r>
+    </w:p>
+    <w:p/>
+    <w:p>
+      <w:pPr>
+        <w:pStyle w:val="Ttulo3"/>
+      </w:pPr>
+      <w:r>
+        <w:t>3.- Tercera fase: implementación de autenticación y roles</w:t>
+      </w:r>
+    </w:p>
+    <w:p>
+      <w:r>
+        <w:t>Después de crear la base del backend, se implementó el sistema de autenticación. Esta fase fue importante porque muchas funcionalidades dependen de saber qué usuario está utilizando la aplicación.</w:t>
+      </w:r>
+    </w:p>
+    <w:p>
+      <w:r>
+        <w:t>Se configuró el registro, el inicio de sesión, las sesiones y los roles de usuario. Con esto se pudo separar el funcionamiento entre usuario normal y administrador, limitando el acceso a determinadas acciones según el tipo de cuenta.</w:t>
+      </w:r>
+    </w:p>
+    <w:p/>
+    <w:p/>
+    <w:p>
+      <w:pPr>
+        <w:pStyle w:val="Ttulo3"/>
+      </w:pPr>
+      <w:r>
+        <w:lastRenderedPageBreak/>
+        <w:t>4.- Cuarta fase: desarrollo de funcionalidades principales</w:t>
+      </w:r>
+    </w:p>
+    <w:p>
+      <w:r>
+        <w:t>En esta fase se desarrollaron las funcionalidades principales de Digital-FIT. Se implementó la gestión de centros privados, lugares públicos, entrenamientos personales, valoraciones, estadísticas y soporte.</w:t>
+      </w:r>
+    </w:p>
+    <w:p>
+      <w:r>
+        <w:t>El objetivo era que el usuario pudiera utilizar la aplicación de forma completa: consultar información, guardar elementos en su cuenta, crear sus propios entrenamientos, valorar centros o lugares y contactar con soporte. También se preparó la parte de administración para gestionar los datos base de la aplicación.</w:t>
+      </w:r>
+      <w:r>
+        <w:t xml:space="preserve"> Y se creo la parte de estadísticas automáticas y soporte (Todo funcional pero no visual testeado mediante Postman)</w:t>
+      </w:r>
+    </w:p>
+    <w:p/>
+    <w:p>
+      <w:pPr>
+        <w:pStyle w:val="Ttulo3"/>
+      </w:pPr>
+      <w:r>
+        <w:t>5.- Quinta fase: desarrollo del frontend con Angular</w:t>
+      </w:r>
+    </w:p>
+    <w:p>
+      <w:r>
+        <w:t>Una vez que el backend tenía las funcionalidades principales, se desarrolló el frontend con Angular. En esta fase se crearon las pantallas, componentes, servicios y rutas necesarias para que el usuario pudiera interactuar con la aplicación.</w:t>
+      </w:r>
+    </w:p>
+    <w:p>
+      <w:r>
+        <w:t>Se trabajó en la navegación, los listados, formularios, detalles, panel de usuario y panel de administración. Además, se conectaron los servicios de Angular con los endpoints del backend para que la aplicación funcionara de forma completa.</w:t>
+      </w:r>
+    </w:p>
+    <w:p/>
+    <w:p>
+      <w:pPr>
+        <w:pStyle w:val="Ttulo3"/>
+      </w:pPr>
+      <w:r>
+        <w:t>6.- Sexta fase: integración del mapa</w:t>
+      </w:r>
+    </w:p>
+    <w:p>
+      <w:r>
+        <w:t>Una de las últimas funcionalidades importantes fue la integración del mapa mediante Leaflet y OpenStreetMap. Esta parte permitió añadir centros y lugares desde una ubicación real, buscar direcciones y guardar coordenadas.</w:t>
+      </w:r>
+    </w:p>
+    <w:p>
+      <w:r>
+        <w:t>Durante esta fase se realizaron varias pruebas para ajustar el funcionamiento del mapa, el buscador de direcciones y la limitación de la zona de uso. Finalmente, se consiguió que el mapa se integrara correctamente con los formularios y con el backend.</w:t>
+      </w:r>
+    </w:p>
+    <w:p/>
+    <w:p/>
+    <w:p>
+      <w:pPr>
+        <w:pStyle w:val="Ttulo3"/>
+      </w:pPr>
+      <w:r>
+        <w:lastRenderedPageBreak/>
+        <w:t>7.- Séptima fase: pruebas, correcciones y pulido visual</w:t>
+      </w:r>
+    </w:p>
+    <w:p>
+      <w:r>
+        <w:t>La última fase se centró en revisar la aplicación completa. Se probaron las funcionalidades principales, se corrigieron errores y se mejoró la parte visual para que la aplicación quedara más clara y cuidada.</w:t>
+      </w:r>
+    </w:p>
+    <w:p>
+      <w:r>
+        <w:t>También se revisó el funcionamiento del mapa, las valoraciones, los permisos de usuario, el panel de administración, las estadísticas, el soporte y la navegación general. Esta fase fue necesaria para dejar la aplicación en un estado funcional y presentable</w:t>
+      </w:r>
+      <w:r>
+        <w:t>.</w:t>
+      </w:r>
+    </w:p>
+    <w:p/>
+    <w:p>
+      <w:pPr>
+        <w:pStyle w:val="Ttulo3"/>
+      </w:pPr>
+      <w:r>
+        <w:t>Conclusión de la temporalización</w:t>
+      </w:r>
+    </w:p>
+    <w:p>
+      <w:r>
+        <w:t>Gracias a esta secuenciación, el desarrollo de Digital-FIT se realizó de forma ordenada. Primero se planteó la idea y la estructura, después se desarrolló el backend, posteriormente el frontend y finalmente se integraron funcionalidades más avanzadas como el mapa, las valoraciones, las estadísticas y el soporte.</w:t>
+      </w:r>
+      <w:r>
+        <w:t xml:space="preserve"> Todo para terminar con el pulido visual y testeo completo de la App</w:t>
+      </w:r>
+    </w:p>
+    <w:p>
+      <w:r>
+        <w:t>Este proceso permitió construir una aplicación completa paso a paso, corrigiendo errores durante el desarrollo y asegurando que las partes principales funcionaran correctamente antes de avanzar a las siguientes.</w:t>
       </w:r>
     </w:p>
     <w:p/>
     <w:p/>
     <w:p/>
     <w:p/>
+    <w:p/>
+    <w:p/>
+    <w:p/>
+    <w:p>
+      <w:pPr>
+        <w:pStyle w:val="Ttulo2"/>
+      </w:pPr>
+      <w:r>
+        <w:lastRenderedPageBreak/>
+        <w:t>Funcionalidades implementadas</w:t>
+      </w:r>
+    </w:p>
+    <w:p>
+      <w:r>
+        <w:t>Durante el desarrollo de Digital-FIT se han implementado distintas funcionalidades que permiten que la aplicación sea usable tanto por usuarios normales como por administradores.</w:t>
+      </w:r>
+    </w:p>
     <w:p>
       <w:pPr>
         <w:pStyle w:val="Ttulo3"/>
       </w:pPr>
-      <w:bookmarkStart w:id="43" w:name="_Toc219506287"/>
+      <w:r>
+        <w:t>Funcionalidades del usuario normal</w:t>
+      </w:r>
+    </w:p>
+    <w:p>
+      <w:r>
+        <w:t>El usuario normal puede registrarse e iniciar sesión en la aplicación. Una vez dentro, puede acceder a las secciones principales y utilizar las funciones pensadas para organizar su actividad deportiva.</w:t>
+      </w:r>
+    </w:p>
+    <w:p>
+      <w:pPr>
+        <w:rPr>
+          <w:b/>
+          <w:bCs/>
+        </w:rPr>
+      </w:pPr>
+      <w:r>
+        <w:rPr>
+          <w:b/>
+          <w:bCs/>
+        </w:rPr>
+        <w:t>Entre las funcionalidades principales del usuario se encuentran:</w:t>
+      </w:r>
+    </w:p>
+    <w:p>
+      <w:r>
+        <w:t>1.- Consultar centros privados disponibles en la aplicación, como gimnasios o instalaciones deportivas.</w:t>
+      </w:r>
+    </w:p>
+    <w:p>
+      <w:r>
+        <w:t>2.- Consultar lugares públicos donde se pueden realizar actividades deportivas, como parques, pistas o zonas al aire libre.</w:t>
+      </w:r>
+    </w:p>
+    <w:p>
+      <w:r>
+        <w:t>3.- Guardar centros privados en su apartado personal de “Mis centros”.</w:t>
+      </w:r>
+    </w:p>
+    <w:p>
+      <w:r>
+        <w:t>4.- Guardar lugares públicos en su apartado personal de “Mis lugares”.</w:t>
+      </w:r>
+    </w:p>
+    <w:p>
+      <w:r>
+        <w:t>5.- Añadir centros o lugares desde el mapa, seleccionando una ubicación real y guardando sus coordenadas.</w:t>
+      </w:r>
+    </w:p>
+    <w:p>
+      <w:r>
+        <w:t>6.- Buscar direcciones o zonas desde el mapa para localizar ubicaciones dentro de la Comunidad Valenciana.</w:t>
+      </w:r>
+    </w:p>
+    <w:p>
+      <w:r>
+        <w:t>7.- Crear y gestionar entrenamientos personales.</w:t>
+      </w:r>
+    </w:p>
+    <w:p>
+      <w:r>
+        <w:t>8.- Consultar el detalle de centros, lugares y entrenamientos.</w:t>
+      </w:r>
+    </w:p>
+    <w:p>
+      <w:r>
+        <w:t>9.- Realizar valoraciones sobre centros o lugares, aportando puntuaciones y comentarios.</w:t>
+      </w:r>
+    </w:p>
+    <w:p>
+      <w:r>
+        <w:t>10.- Utilizar el apartado de soporte para enviar dudas, incidencias o sugerencias.</w:t>
+      </w:r>
+    </w:p>
+    <w:p/>
+    <w:p/>
+    <w:p/>
+    <w:p>
+      <w:pPr>
+        <w:pStyle w:val="Ttulo3"/>
+      </w:pPr>
       <w:r>
         <w:lastRenderedPageBreak/>
-        <w:t>Control de calidad del proyecto</w:t>
-      </w:r>
-      <w:bookmarkEnd w:id="43"/>
-    </w:p>
-    <w:p>
-      <w:r>
-        <w:t>Para asegurar que Digital-FIT funcione correctamente y ofrezca una buena experiencia al usuario, se tendrá en cuenta un control de calidad básico durante el desarrollo de la aplicación. El objetivo es detectar errores</w:t>
-      </w:r>
-      <w:r>
-        <w:t xml:space="preserve"> </w:t>
-      </w:r>
-      <w:r>
-        <w:t>y comprobar que las funcionalidades principales funcionan como se espera.</w:t>
+        <w:t>Funcionalidades del administrador</w:t>
+      </w:r>
+    </w:p>
+    <w:p>
+      <w:r>
+        <w:t>Además del usuario normal, Digital-FIT incluye un perfil de administrador. Este perfil tiene acceso a funciones de gestión que permiten mantener la información base de la aplicación.</w:t>
+      </w:r>
+    </w:p>
+    <w:p>
+      <w:pPr>
+        <w:rPr>
+          <w:b/>
+          <w:bCs/>
+        </w:rPr>
+      </w:pPr>
+      <w:r>
+        <w:rPr>
+          <w:b/>
+          <w:bCs/>
+        </w:rPr>
+        <w:t>Entre las funcionalidades principales del administrador se encuentran:</w:t>
+      </w:r>
+    </w:p>
+    <w:p>
+      <w:r>
+        <w:t>1.- Gestionar centros privados base de la aplicación.</w:t>
+      </w:r>
+    </w:p>
+    <w:p>
+      <w:r>
+        <w:t>2.- Gestionar lugares públicos base.</w:t>
+      </w:r>
+    </w:p>
+    <w:p>
+      <w:r>
+        <w:t>3.- Crear nuevos centros o lugares desde formularios.</w:t>
+      </w:r>
+    </w:p>
+    <w:p>
+      <w:r>
+        <w:t>4.- Añadir centros o lugares desde el mapa, utilizando ubicaciones reales.</w:t>
+      </w:r>
+    </w:p>
+    <w:p>
+      <w:r>
+        <w:t>5.- Editar información existente cuando sea necesario.</w:t>
+      </w:r>
+    </w:p>
+    <w:p>
+      <w:r>
+        <w:t>6.- Eliminar datos incorrectos o que ya no deban aparecer en la aplicación.</w:t>
+      </w:r>
+    </w:p>
+    <w:p>
+      <w:r>
+        <w:t>7</w:t>
+      </w:r>
+      <w:r>
+        <w:t>.- Revisar información relacionada con el soporte o contacto de usuarios.</w:t>
       </w:r>
     </w:p>
     <w:p/>
     <w:p>
-      <w:r>
-        <w:t>S</w:t>
-      </w:r>
-      <w:r>
-        <w:t>e revisarán aspectos como el correcto funcionamiento del registro y el inicio de sesión, la búsqueda de centros deportivos y zonas públicas, y la gestión de los entrenamientos personales. También se comprobará que la información mostrada al usuario sea clara y que la navegación entre pantallas resulte sencilla.</w:t>
+      <w:pPr>
+        <w:pStyle w:val="Ttulo3"/>
+      </w:pPr>
+      <w:r>
+        <w:t>Funcionalidades relacionadas con el mapa</w:t>
+      </w:r>
+    </w:p>
+    <w:p>
+      <w:r>
+        <w:t>El mapa es una de las partes más destacadas de Digital-FIT. Esta funcionalidad permite trabajar con ubicaciones reales y facilita que los centros y lugares deportivos estén mejor situados dentro de la aplicación.</w:t>
+      </w:r>
+    </w:p>
+    <w:p>
+      <w:pPr>
+        <w:rPr>
+          <w:b/>
+          <w:bCs/>
+        </w:rPr>
+      </w:pPr>
+      <w:r>
+        <w:rPr>
+          <w:b/>
+          <w:bCs/>
+        </w:rPr>
+        <w:t>Las funciones principales del mapa son:</w:t>
+      </w:r>
+    </w:p>
+    <w:p>
+      <w:r>
+        <w:t>1.- Mostrar un mapa interactivo basado en Leaflet y OpenStreetMap.</w:t>
+      </w:r>
+    </w:p>
+    <w:p>
+      <w:r>
+        <w:t>2.- Iniciar el mapa centrado en Valencia.</w:t>
+      </w:r>
+    </w:p>
+    <w:p>
+      <w:r>
+        <w:t>3.- Limitar la zona de uso a la Comunidad Valenciana.</w:t>
+      </w:r>
+    </w:p>
+    <w:p>
+      <w:r>
+        <w:t>4.- Permitir seleccionar una ubicación haciendo clic sobre el mapa.</w:t>
+      </w:r>
+    </w:p>
+    <w:p>
+      <w:r>
+        <w:t>5.- Obtener automáticamente la latitud y longitud de la ubicación seleccionada.</w:t>
+      </w:r>
+    </w:p>
+    <w:p>
+      <w:r>
+        <w:t>6.- Buscar direcciones o zonas mediante la barra de búsqueda.</w:t>
+      </w:r>
+    </w:p>
+    <w:p>
+      <w:r>
+        <w:t>7.- Guardar centros y lugares con coordenadas reales.</w:t>
       </w:r>
     </w:p>
     <w:p/>
     <w:p>
-      <w:r>
-        <w:t>Por último, se tendrá en cuenta la usabilidad y el diseño de la interfaz, comprobando que la aplicación sea fácil de usar incluso para personas</w:t>
-      </w:r>
-      <w:r>
-        <w:t xml:space="preserve"> de avanzada edad // C</w:t>
-      </w:r>
-      <w:r>
-        <w:t>on poca experiencia tecnológica.</w:t>
+      <w:pPr>
+        <w:pStyle w:val="Ttulo3"/>
+      </w:pPr>
+      <w:r>
+        <w:lastRenderedPageBreak/>
+        <w:t>Funcionalidades de entrenamientos</w:t>
+      </w:r>
+    </w:p>
+    <w:p>
+      <w:r>
+        <w:t>El apartado de entrenamientos permite que el usuario gestione sus propias rutinas personales. Esta parte está pensada para que Digital-FIT también sirva como herramienta de organización deportiva.</w:t>
+      </w:r>
+    </w:p>
+    <w:p>
+      <w:r>
+        <w:t>El usuario puede crear entrenamientos indicando su información básica, consultar los entrenamientos guardados y eliminarlos cuando ya no los necesite. Cada entrenamiento queda asociado al usuario que lo ha creado, por lo que la información se mantiene separada entre cuentas.</w:t>
       </w:r>
     </w:p>
     <w:p/>
@@ -11436,367 +12287,711 @@
       <w:pPr>
         <w:pStyle w:val="Ttulo3"/>
       </w:pPr>
-      <w:bookmarkStart w:id="44" w:name="_Toc219506288"/>
-      <w:r>
+      <w:r>
+        <w:t>Funcionalidades de valoraciones</w:t>
+      </w:r>
+    </w:p>
+    <w:p>
+      <w:r>
+        <w:t>El sistema de valoraciones permite que los usuarios puedan puntuar y comentar centros o lugares. Esta función mejora la utilidad de la aplicación porque permite consultar opiniones basadas en la experiencia de otros usuarios.</w:t>
+      </w:r>
+    </w:p>
+    <w:p>
+      <w:r>
+        <w:t>Las valoraciones ayudan a que los centros y lugares tengan información más completa, no solo datos básicos como nombre o dirección. Además, fomentan la participación dentro de la aplicación.</w:t>
+      </w:r>
+    </w:p>
+    <w:p/>
+    <w:p>
+      <w:pPr>
+        <w:pStyle w:val="Ttulo3"/>
+      </w:pPr>
+      <w:r>
+        <w:t>Funcionalidades de soporte</w:t>
+      </w:r>
+    </w:p>
+    <w:p>
+      <w:r>
+        <w:t>Digital-FIT incluye un apartado de soporte para que los usuarios puedan comunicar dudas, problemas o sugerencias. Esta función es importante porque permite recoger feedback y mejorar la aplicación a partir del uso real.</w:t>
+      </w:r>
+    </w:p>
+    <w:p/>
+    <w:p>
+      <w:pPr>
+        <w:pStyle w:val="Ttulo3"/>
+      </w:pPr>
+      <w:r>
+        <w:t>Funcionalidades de estadísticas</w:t>
+      </w:r>
+    </w:p>
+    <w:p>
+      <w:r>
+        <w:t>La aplicación también dispone de estadísticas automáticas. Estas estadísticas permiten consultar datos generales del sistema de forma rápida, como el número de usuarios, centros, lugares, entrenamientos o valoraciones registrados.</w:t>
+      </w:r>
+    </w:p>
+    <w:p/>
+    <w:p/>
+    <w:p>
+      <w:pPr>
+        <w:pStyle w:val="Ttulo3"/>
+      </w:pPr>
+      <w:r>
+        <w:lastRenderedPageBreak/>
+        <w:t>Conclusión sobre las funcionalidades</w:t>
+      </w:r>
+    </w:p>
+    <w:p>
+      <w:r>
+        <w:t>En conjunto, las funcionalidades implementadas hacen que Digital-FIT sea una aplicación completa y funcional. El proyecto no solo permite consultar información deportiva, sino que también incluye gestión personal, administración, mapas, valoraciones, soporte y estadísticas.</w:t>
+      </w:r>
+    </w:p>
+    <w:p>
+      <w:r>
+        <w:t>Gracias a esto, la aplicación cumple con la idea inicial de centralizar en una sola plataforma varias herramientas relacionadas con el deporte y la organización personal.</w:t>
+      </w:r>
+    </w:p>
+    <w:p/>
+    <w:p>
+      <w:pPr>
+        <w:pStyle w:val="Ttulo2"/>
+      </w:pPr>
+      <w:r>
+        <w:t xml:space="preserve">Seguridad y protección de datos </w:t>
+      </w:r>
+    </w:p>
+    <w:p>
+      <w:r>
+        <w:t>Digital-FIT gestiona datos básicos de los usuarios, como nombre, correo electrónico, contraseña, entrenamientos personales, centros guardados, lugares guardados y valoraciones realizadas. Por este motivo, durante el desarrollo se han aplicado medidas de seguridad para proteger la información y evitar accesos no autorizados.</w:t>
+      </w:r>
+    </w:p>
+    <w:p>
+      <w:pPr>
+        <w:pStyle w:val="Ttulo3"/>
+      </w:pPr>
+      <w:r>
+        <w:t>Autenticación de usuarios</w:t>
+      </w:r>
+    </w:p>
+    <w:p>
+      <w:r>
+        <w:t>La aplicación cuenta con un sistema de registro e inicio de sesión. Cada usuario debe autenticarse para acceder a sus funciones personales. Esto permite que la información de cada cuenta esté separada y que un usuario no pueda acceder directamente a los datos de otro.</w:t>
+      </w:r>
+    </w:p>
+    <w:p>
+      <w:r>
+        <w:t>El inicio de sesión permite identificar al usuario que está utilizando la aplicación. A partir de esa identificación, el backend puede comprobar qué datos le pertenecen y qué acciones puede realizar.</w:t>
+      </w:r>
+    </w:p>
+    <w:p>
+      <w:pPr>
+        <w:pStyle w:val="Ttulo3"/>
+      </w:pPr>
+      <w:r>
+        <w:t>Contraseñas cifradas</w:t>
+      </w:r>
+    </w:p>
+    <w:p>
+      <w:r>
+        <w:t>Las contraseñas de los usuarios no se almacenan en texto plano. Se guardan cifradas, de forma que no puedan consultarse directamente desde la base de datos.</w:t>
+      </w:r>
+    </w:p>
+    <w:p>
+      <w:r>
+        <w:t>Esta medida es importante porque protege las credenciales de los usuarios en caso de que hubiera algún problema de seguridad. Aunque el proyecto sea académico, se ha intentado aplicar una práctica básica y necesaria en cualquier aplicación real.</w:t>
+      </w:r>
+    </w:p>
+    <w:p/>
+    <w:p>
+      <w:pPr>
+        <w:pStyle w:val="Ttulo3"/>
+      </w:pPr>
+      <w:r>
+        <w:lastRenderedPageBreak/>
+        <w:t>Control de acceso mediante roles</w:t>
+      </w:r>
+    </w:p>
+    <w:p>
+      <w:r>
+        <w:t>Digital-FIT diferencia entre usuario normal y administrador. El usuario normal puede utilizar las funciones principales de la aplicación, como consultar centros y lugares, guardar elementos, crear entrenamientos o realizar valoraciones.</w:t>
+      </w:r>
+    </w:p>
+    <w:p>
+      <w:r>
+        <w:t>El administrador tiene acceso a funciones de gestión, como crear, editar o eliminar centros y lugares base, consultar estadísticas y revisar información general del sistema.</w:t>
+      </w:r>
+    </w:p>
+    <w:p>
+      <w:r>
+        <w:t>Esta separación evita que cualquier usuario pueda modificar datos importantes de la aplicación. De esta forma, las funciones administrativas quedan protegidas y solo pueden ser usadas por una cuenta autorizada.</w:t>
+      </w:r>
+    </w:p>
+    <w:p/>
+    <w:p>
+      <w:pPr>
+        <w:pStyle w:val="Ttulo3"/>
+      </w:pPr>
+      <w:r>
+        <w:t>Protección de datos personales</w:t>
+      </w:r>
+    </w:p>
+    <w:p>
+      <w:r>
+        <w:t>La aplicación solo utiliza los datos necesarios para su funcionamiento. No se solicita información sensible que no sea imprescindible para el uso de Digital-FIT.</w:t>
+      </w:r>
+    </w:p>
+    <w:p>
+      <w:r>
+        <w:t>Los datos personales se utilizan únicamente para identificar al usuario dentro de la aplicación y asociar correctamente su información, como entrenamientos, centros guardados o valoraciones.</w:t>
+      </w:r>
+    </w:p>
+    <w:p>
+      <w:r>
+        <w:t>Además, cada usuario trabaja con sus propios datos. Por ejemplo, un usuario no puede borrar entrenamientos de otra cuenta ni modificar lugares guardados por otra persona.</w:t>
+      </w:r>
+    </w:p>
+    <w:p/>
+    <w:p>
+      <w:pPr>
+        <w:pStyle w:val="Ttulo3"/>
+      </w:pPr>
+      <w:r>
+        <w:t>Uso de ubicaciones</w:t>
+      </w:r>
+    </w:p>
+    <w:p>
+      <w:r>
+        <w:t>Digital-FIT utiliza ubicaciones para permitir la búsqueda y guardado de centros o lugares deportivos. Estas ubicaciones se trabajan mediante coordenadas de latitud y longitud, necesarias para situar los elementos en el mapa.</w:t>
+      </w:r>
+    </w:p>
+    <w:p>
+      <w:r>
+        <w:t>Las búsquedas de direcciones se utilizan únicamente para localizar puntos en el mapa y facilitar el uso de la aplicación. La finalidad de estos datos es funcional, ya que permiten añadir o consultar instalaciones deportivas de forma visual.</w:t>
+      </w:r>
+    </w:p>
+    <w:p>
+      <w:pPr>
+        <w:pStyle w:val="Ttulo3"/>
+      </w:pPr>
+      <w:r>
+        <w:lastRenderedPageBreak/>
+        <w:t>Validaciones y control de errores</w:t>
+      </w:r>
+    </w:p>
+    <w:p>
+      <w:r>
+        <w:t>En el backend se han aplicado validaciones para controlar que los datos enviados desde el frontend sean correctos antes de guardarlos en la base de datos. Por ejemplo, se comprueba que los campos obligatorios no estén vacíos y que las coordenadas o valores necesarios se reciban correctamente.</w:t>
+      </w:r>
+    </w:p>
+    <w:p>
+      <w:r>
+        <w:t>También se controla que los usuarios solo puedan realizar acciones sobre información que les pertenece. Esto es especialmente importante en apartados como entrenamientos, centros guardados, lugares guardados y valoraciones.</w:t>
+      </w:r>
+    </w:p>
+    <w:p/>
+    <w:p>
+      <w:pPr>
+        <w:pStyle w:val="Ttulo3"/>
+      </w:pPr>
+      <w:r>
+        <w:t>Conclusión sobre la seguridad</w:t>
+      </w:r>
+    </w:p>
+    <w:p>
+      <w:r>
+        <w:t>Las medidas de seguridad aplicadas permiten que Digital-FIT funcione de forma más controlada y fiable. Aunque se trata de un proyecto académico, se han tenido en cuenta aspectos básicos de una aplicación real, como autenticación, cifrado de contraseñas, roles, validación de datos y protección de la información personal.</w:t>
+      </w:r>
+    </w:p>
+    <w:p/>
+    <w:p>
+      <w:pPr>
+        <w:pStyle w:val="Ttulo2"/>
+      </w:pPr>
+      <w:r>
+        <w:t xml:space="preserve">Control de calidad </w:t>
+      </w:r>
+    </w:p>
+    <w:p>
+      <w:r>
+        <w:t>El control de calidad de Digital-FIT se ha realizado mediante pruebas manuales durante el desarrollo y al finalizar las funcionalidades principales. El objetivo ha sido comprobar que la aplicación funciona correctamente, que los datos se guardan de forma adecuada y que el usuario puede utilizar las distintas secciones sin errores graves.</w:t>
+      </w:r>
+    </w:p>
+    <w:p>
+      <w:pPr>
+        <w:pStyle w:val="Ttulo3"/>
+      </w:pPr>
+      <w:r>
+        <w:t>Pruebas de autenticación</w:t>
+      </w:r>
+    </w:p>
+    <w:p>
+      <w:r>
+        <w:t>Se han probado las funciones de registro, inicio de sesión y cierre de sesión. Estas pruebas permiten comprobar que el usuario puede crear una cuenta, acceder correctamente a la aplicación y salir de su sesión cuando lo necesite.</w:t>
+      </w:r>
+    </w:p>
+    <w:p>
+      <w:r>
+        <w:t>También se ha revisado que las zonas privadas de la aplicación no sean accesibles sin iniciar sesión y que las funciones de administrador solo estén disponibles para usuarios con ese rol.</w:t>
+      </w:r>
+    </w:p>
+    <w:p/>
+    <w:p>
+      <w:pPr>
+        <w:pStyle w:val="Ttulo3"/>
+      </w:pPr>
+      <w:r>
+        <w:lastRenderedPageBreak/>
+        <w:t>Pruebas de gestión de centros y lugares</w:t>
+      </w:r>
+    </w:p>
+    <w:p>
+      <w:r>
+        <w:t>Se han comprobado las funciones relacionadas con centros privados y lugares públicos. Entre ellas se encuentran la consulta de listados, la visualización de detalles, el guardado de elementos en los apartados personales del usuario y la eliminación cuando corresponde.</w:t>
+      </w:r>
+    </w:p>
+    <w:p>
+      <w:r>
+        <w:t>También se ha probado la gestión desde el panel de administración, verificando que el administrador pueda crear, modificar y eliminar información base de la aplicación.</w:t>
+      </w:r>
+    </w:p>
+    <w:p/>
+    <w:p>
+      <w:pPr>
+        <w:pStyle w:val="Ttulo3"/>
+      </w:pPr>
+      <w:r>
+        <w:t>Pruebas del mapa</w:t>
+      </w:r>
+    </w:p>
+    <w:p>
+      <w:r>
+        <w:t>El mapa ha sido una de las partes que más pruebas ha requerido. Se ha comprobado que se cargue correctamente, que aparezca centrado en Valencia y que el usuario no pueda utilizarlo fuera de la zona prevista para el proyecto.</w:t>
+      </w:r>
+    </w:p>
+    <w:p>
+      <w:r>
+        <w:t>También se ha probado la selección manual de ubicaciones, el marcador del mapa, la obtención de coordenadas y la búsqueda de direcciones dentro de la Comunidad Valenciana. Estas pruebas han sido importantes porque el mapa se conecta con los formularios de centros y lugares.</w:t>
+      </w:r>
+    </w:p>
+    <w:p/>
+    <w:p>
+      <w:pPr>
+        <w:pStyle w:val="Ttulo3"/>
+      </w:pPr>
+      <w:r>
+        <w:t>Pruebas de entrenamientos</w:t>
+      </w:r>
+    </w:p>
+    <w:p>
+      <w:r>
+        <w:t>En el apartado de entrenamientos se ha revisado que el usuario pueda crear sus propias rutinas, consultarlas y eliminarlas. También se ha comprobado que cada entrenamiento quede asociado al usuario correspondiente y que no aparezca mezclado con información de otras cuentas.</w:t>
+      </w:r>
+    </w:p>
+    <w:p/>
+    <w:p>
+      <w:pPr>
+        <w:pStyle w:val="Ttulo3"/>
+      </w:pPr>
+      <w:r>
+        <w:t>Pruebas de valoraciones</w:t>
+      </w:r>
+    </w:p>
+    <w:p>
+      <w:r>
+        <w:t>Se ha probado el sistema de valoraciones para comprobar que los usuarios puedan añadir puntuaciones y comentarios a centros o lugares. También se ha revisado que las valoraciones se guarden correctamente y que aparezcan asociadas al elemento correspondiente.</w:t>
+      </w:r>
+    </w:p>
+    <w:p/>
+    <w:p>
+      <w:pPr>
+        <w:pStyle w:val="Ttulo3"/>
+      </w:pPr>
+      <w:r>
+        <w:lastRenderedPageBreak/>
+        <w:t>Pruebas de soporte y estadísticas</w:t>
+      </w:r>
+    </w:p>
+    <w:p>
+      <w:r>
+        <w:t>En el apartado de soporte se ha comprobado que el usuario pueda enviar consultas o incidencias. Esta parte permite recoger información útil para mejorar la aplicación.</w:t>
+      </w:r>
+    </w:p>
+    <w:p>
+      <w:r>
+        <w:t>También se han revisado las estadísticas automáticas, comprobando que los datos mostrados sean coherentes con la información registrada en la aplicación.</w:t>
+      </w:r>
+    </w:p>
+    <w:p/>
+    <w:p>
+      <w:pPr>
+        <w:pStyle w:val="Ttulo3"/>
+      </w:pPr>
+      <w:r>
+        <w:t>Pruebas visuales y de navegación</w:t>
+      </w:r>
+    </w:p>
+    <w:p>
+      <w:r>
+        <w:t>Además de las pruebas funcionales, se ha revisado la parte visual de la aplicación. Se ha comprobado que las pantallas sean claras, que los botones estén bien colocados y que la navegación entre secciones sea sencilla.</w:t>
+      </w:r>
+    </w:p>
+    <w:p>
+      <w:r>
+        <w:t>Durante esta fase se realizaron ajustes de diseño para mejorar la apariencia general de la aplicación y hacerla más cómoda de usar.</w:t>
+      </w:r>
+    </w:p>
+    <w:p/>
+    <w:p>
+      <w:pPr>
+        <w:pStyle w:val="Ttulo3"/>
+      </w:pPr>
+      <w:r>
+        <w:t>Corrección de errores</w:t>
+      </w:r>
+    </w:p>
+    <w:p>
+      <w:r>
+        <w:t>Durante el desarrollo se han detectado y corregido errores relacionados con validaciones, permisos, comunicación entre frontend y backend y funcionamiento del mapa. Estas correcciones han permitido mejorar la estabilidad de la aplicación y dejarla en un estado más completo para la entrega final.</w:t>
+      </w:r>
+    </w:p>
+    <w:p/>
+    <w:p>
+      <w:pPr>
+        <w:pStyle w:val="Ttulo3"/>
+      </w:pPr>
+      <w:r>
+        <w:t>Conclusión sobre el control de calidad</w:t>
+      </w:r>
+    </w:p>
+    <w:p>
+      <w:r>
+        <w:t>El control de calidad ha permitido comprobar que Digital-FIT cumple sus funciones principales y que la aplicación puede utilizarse de forma estable. Aunque no se han realizado pruebas automatizadas avanzadas, las pruebas manuales han sido suficientes para revisar los apartados más importantes del proyecto y corregir los errores encontrados durante el desarrollo.</w:t>
+      </w:r>
+    </w:p>
+    <w:p>
+      <w:r>
+        <w:t xml:space="preserve">(El backend fue testeado antes de que el frontend siquiera fuera </w:t>
+      </w:r>
+      <w:proofErr w:type="spellStart"/>
+      <w:proofErr w:type="gramStart"/>
+      <w:r>
+        <w:t>creado,se</w:t>
+      </w:r>
+      <w:proofErr w:type="spellEnd"/>
+      <w:proofErr w:type="gramEnd"/>
+      <w:r>
+        <w:t xml:space="preserve"> usó </w:t>
+      </w:r>
+      <w:proofErr w:type="spellStart"/>
+      <w:r>
+        <w:t>postman</w:t>
+      </w:r>
+      <w:proofErr w:type="spellEnd"/>
+      <w:r>
+        <w:t xml:space="preserve"> para testear el backend y luego para testear el frontend se uso la propia vista del </w:t>
+      </w:r>
+      <w:proofErr w:type="spellStart"/>
+      <w:proofErr w:type="gramStart"/>
+      <w:r>
+        <w:t>usuario,la</w:t>
+      </w:r>
+      <w:proofErr w:type="spellEnd"/>
+      <w:proofErr w:type="gramEnd"/>
+      <w:r>
+        <w:t xml:space="preserve"> consola del navegador y el </w:t>
+      </w:r>
+      <w:proofErr w:type="spellStart"/>
+      <w:r>
+        <w:t>cmd</w:t>
+      </w:r>
+      <w:proofErr w:type="spellEnd"/>
+      <w:r>
+        <w:t xml:space="preserve"> para ver que todos los procesos tiraban bien y demás)</w:t>
+      </w:r>
+    </w:p>
+    <w:p>
+      <w:pPr>
+        <w:pStyle w:val="Ttulo2"/>
+      </w:pPr>
+      <w:r>
+        <w:lastRenderedPageBreak/>
         <w:t>Difusión del proyecto</w:t>
       </w:r>
-      <w:bookmarkEnd w:id="44"/>
-    </w:p>
-    <w:p>
-      <w:pPr>
-        <w:rPr>
-          <w:sz w:val="22"/>
-          <w:szCs w:val="22"/>
-        </w:rPr>
-      </w:pPr>
-      <w:r>
-        <w:rPr>
-          <w:b/>
-          <w:bCs/>
-          <w:sz w:val="22"/>
-          <w:szCs w:val="22"/>
-        </w:rPr>
-        <w:t>Principales canales de difusión:</w:t>
-      </w:r>
-    </w:p>
-    <w:p>
-      <w:pPr>
-        <w:numPr>
-          <w:ilvl w:val="0"/>
-          <w:numId w:val="50"/>
-        </w:numPr>
-      </w:pPr>
-      <w:r>
-        <w:rPr>
-          <w:b/>
-          <w:bCs/>
-        </w:rPr>
-        <w:t>Redes sociales</w:t>
-      </w:r>
-      <w:r>
-        <w:t xml:space="preserve"> como Instagram o TikTok, donde se podrían publicar contenidos breves mostrando el funcionamiento de la aplicación, ejemplos de búsquedas de centros deportivos o zonas públicas y capturas de la interfaz.</w:t>
-      </w:r>
-    </w:p>
-    <w:p>
-      <w:pPr>
-        <w:numPr>
-          <w:ilvl w:val="0"/>
-          <w:numId w:val="50"/>
-        </w:numPr>
-      </w:pPr>
-      <w:r>
-        <w:rPr>
-          <w:b/>
-          <w:bCs/>
-        </w:rPr>
-        <w:t>Colaboraciones con gimnasios y centros deportivos locales</w:t>
-      </w:r>
-      <w:r>
-        <w:t>, que pueden recomendar la aplicación a sus usuarios como una herramienta complementaria para entrenar.</w:t>
-      </w:r>
-    </w:p>
-    <w:p>
-      <w:pPr>
-        <w:numPr>
-          <w:ilvl w:val="0"/>
-          <w:numId w:val="50"/>
-        </w:numPr>
-      </w:pPr>
-      <w:r>
-        <w:rPr>
-          <w:b/>
-          <w:bCs/>
-        </w:rPr>
-        <w:t>Recomendación entre usuarios</w:t>
-      </w:r>
-      <w:r>
-        <w:t xml:space="preserve"> </w:t>
-      </w:r>
-      <w:r>
-        <w:t>que entrenan por su cuenta y buscan una forma más sencilla de organizar sus entrenamientos y localizar instalaciones cercanas.</w:t>
-      </w:r>
-    </w:p>
-    <w:p>
-      <w:pPr>
-        <w:jc w:val="left"/>
-      </w:pPr>
-      <w:r>
-        <w:rPr>
-          <w:b/>
-          <w:bCs/>
-        </w:rPr>
-        <w:t>Objetivo de la difusión:</w:t>
-      </w:r>
-      <w:r>
-        <w:br/>
-        <w:t>El objetivo es dar visibilidad sin necesidad de grandes inversiones, apostando por un crecimiento progresivo y natural dentro del entorno local.</w:t>
+    </w:p>
+    <w:p>
+      <w:r>
+        <w:t>La difusión de Digital-FIT es una parte importante del proyecto, ya que la aplicación está pensada para usuarios que practican deporte en Valencia y necesitan una herramienta sencilla para encontrar centros, lugares públicos y organizar sus entrenamientos.</w:t>
       </w:r>
     </w:p>
     <w:p>
       <w:pPr>
         <w:pStyle w:val="Ttulo3"/>
       </w:pPr>
-      <w:bookmarkStart w:id="45" w:name="_Toc219506289"/>
-      <w:r>
+      <w:r>
+        <w:t>Canales de difusión</w:t>
+      </w:r>
+    </w:p>
+    <w:p>
+      <w:pPr>
+        <w:rPr>
+          <w:b/>
+          <w:bCs/>
+        </w:rPr>
+      </w:pPr>
+      <w:r>
+        <w:rPr>
+          <w:b/>
+          <w:bCs/>
+        </w:rPr>
+        <w:t>1.- Redes sociales</w:t>
+      </w:r>
+    </w:p>
+    <w:p>
+      <w:r>
+        <w:t>Uno de los principales canales de difusión serían redes sociales como Instagram, TikTok o X, ya que gran parte del público objetivo utiliza estas plataformas de forma habitual.</w:t>
+      </w:r>
+    </w:p>
+    <w:p>
+      <w:r>
+        <w:t>En estas redes se podrían publicar vídeos cortos mostrando el funcionamiento de la aplicación, ejemplos de búsqueda de centros, uso del mapa, creación de entrenamientos o valoraciones de lugares deportivos.</w:t>
+      </w:r>
+    </w:p>
+    <w:p>
+      <w:pPr>
+        <w:rPr>
+          <w:b/>
+          <w:bCs/>
+        </w:rPr>
+      </w:pPr>
+      <w:r>
+        <w:rPr>
+          <w:b/>
+          <w:bCs/>
+        </w:rPr>
+        <w:t>2.- Colaboración con gimnasios y centros deportivos</w:t>
+      </w:r>
+    </w:p>
+    <w:p>
+      <w:r>
+        <w:t>Digital-FIT también podría darse a conocer mediante colaboraciones con gimnasios, centros deportivos y clubes locales. Estos espacios podrían recomendar la aplicación a sus usuarios, ya que les ayudaría a encontrar instalaciones, organizar entrenamientos y consultar información deportiva cercana.</w:t>
+      </w:r>
+    </w:p>
+    <w:p>
+      <w:r>
+        <w:t>Además, estas colaboraciones podrían beneficiar también a los propios centros, ya que aparecer dentro de la aplicación les daría más visibilidad.</w:t>
+      </w:r>
+    </w:p>
+    <w:p>
+      <w:pPr>
+        <w:rPr>
+          <w:b/>
+          <w:bCs/>
+        </w:rPr>
+      </w:pPr>
+      <w:r>
+        <w:rPr>
+          <w:b/>
+          <w:bCs/>
+        </w:rPr>
+        <w:t>3.- Difusión en centros educativos</w:t>
+      </w:r>
+    </w:p>
+    <w:p>
+      <w:r>
+        <w:t>Al tratarse de una aplicación pensada también para gente joven, estudiantes y personas que empiezan a entrenar, podría promocionarse en centros educativos, ciclos formativos o entornos universitarios.</w:t>
+      </w:r>
+    </w:p>
+    <w:p/>
+    <w:p>
+      <w:r>
+        <w:t>Esta difusión sería útil porque muchos estudiantes entrenan por su cuenta y utilizan herramientas digitales para organizarse.</w:t>
+      </w:r>
+    </w:p>
+    <w:p/>
+    <w:p>
+      <w:pPr>
+        <w:rPr>
+          <w:b/>
+          <w:bCs/>
+        </w:rPr>
+      </w:pPr>
+      <w:r>
+        <w:rPr>
+          <w:b/>
+          <w:bCs/>
+        </w:rPr>
         <w:lastRenderedPageBreak/>
-        <w:t>Servicio posventa y atención al usuario</w:t>
-      </w:r>
-      <w:bookmarkEnd w:id="45"/>
-    </w:p>
-    <w:p>
-      <w:pPr>
-        <w:jc w:val="left"/>
-      </w:pPr>
-      <w:r>
-        <w:t>Digital-FIT contempla un servicio básico de atención al usuario para resolver dudas, recoger sugerencias y detectar posibles errores en la aplicación una vez esté en uso. Este servicio es importante para mejorar la experiencia del usuario y permitir la evolución del proyecto con el tiempo.</w:t>
-      </w:r>
-    </w:p>
-    <w:p>
-      <w:pPr>
-        <w:jc w:val="left"/>
-      </w:pPr>
-      <w:r>
-        <w:rPr>
-          <w:b/>
-          <w:bCs/>
-        </w:rPr>
-        <w:t>Canales de atención al usuario:</w:t>
-      </w:r>
-    </w:p>
-    <w:p>
-      <w:pPr>
-        <w:numPr>
-          <w:ilvl w:val="0"/>
-          <w:numId w:val="51"/>
-        </w:numPr>
-        <w:jc w:val="left"/>
-      </w:pPr>
-      <w:r>
-        <w:rPr>
-          <w:b/>
-          <w:bCs/>
-        </w:rPr>
-        <w:t>Correo electrónico de soporte</w:t>
-      </w:r>
-      <w:r>
-        <w:t>, donde los usuarios podrán contactar en caso de problemas técnicos o dudas generales sobre el uso de la aplicación.</w:t>
-      </w:r>
-    </w:p>
-    <w:p>
-      <w:pPr>
-        <w:numPr>
-          <w:ilvl w:val="0"/>
-          <w:numId w:val="51"/>
-        </w:numPr>
-        <w:jc w:val="left"/>
-      </w:pPr>
-      <w:r>
-        <w:rPr>
-          <w:b/>
-          <w:bCs/>
-        </w:rPr>
-        <w:t>Formulario de contacto</w:t>
-      </w:r>
-      <w:r>
-        <w:t xml:space="preserve"> dentro de la aplicación para enviar consultas o sugerencias de forma sencilla.</w:t>
-      </w:r>
-    </w:p>
-    <w:p>
-      <w:pPr>
-        <w:numPr>
-          <w:ilvl w:val="0"/>
-          <w:numId w:val="51"/>
-        </w:numPr>
-        <w:jc w:val="left"/>
-      </w:pPr>
-      <w:r>
-        <w:rPr>
-          <w:b/>
-          <w:bCs/>
-        </w:rPr>
-        <w:t>Sección de preguntas frecuentes (FAQ)</w:t>
-      </w:r>
-      <w:r>
-        <w:t xml:space="preserve"> con respuestas a las dudas más comunes relacionadas con el registro, las búsquedas o la gestión de entrenamientos.</w:t>
-      </w:r>
-    </w:p>
-    <w:p>
-      <w:pPr>
-        <w:jc w:val="left"/>
-      </w:pPr>
-      <w:r>
-        <w:rPr>
-          <w:b/>
-          <w:bCs/>
-        </w:rPr>
-        <w:t>Gestión del feedback:</w:t>
-      </w:r>
-      <w:r>
-        <w:br/>
-        <w:t xml:space="preserve">Las consultas y sugerencias recibidas permitirán detectar errores, mejorar funcionalidades existentes y adaptar la aplicación a las necesidades reales de los usuarios. </w:t>
-      </w:r>
-    </w:p>
-    <w:p>
-      <w:pPr>
-        <w:jc w:val="left"/>
-      </w:pPr>
-    </w:p>
-    <w:p>
-      <w:pPr>
-        <w:jc w:val="left"/>
-      </w:pPr>
-    </w:p>
-    <w:p>
-      <w:pPr>
-        <w:jc w:val="left"/>
-      </w:pPr>
-    </w:p>
-    <w:p>
-      <w:pPr>
-        <w:jc w:val="left"/>
-      </w:pPr>
-    </w:p>
-    <w:p>
-      <w:pPr>
-        <w:jc w:val="left"/>
-      </w:pPr>
-    </w:p>
-    <w:p>
-      <w:pPr>
-        <w:jc w:val="left"/>
-      </w:pPr>
-    </w:p>
-    <w:p>
-      <w:pPr>
-        <w:jc w:val="left"/>
-      </w:pPr>
-    </w:p>
-    <w:p>
-      <w:pPr>
-        <w:jc w:val="left"/>
-      </w:pPr>
+        <w:t>4.- Recomendación entre usuarios</w:t>
+      </w:r>
+    </w:p>
+    <w:p>
+      <w:r>
+        <w:t>Otra forma de difusión sería el boca a boca entre usuarios. Si la aplicación resulta útil, los propios usuarios pueden recomendarla a amigos, compañeros de gimnasio o personas que entrenan en zonas públicas.</w:t>
+      </w:r>
+    </w:p>
+    <w:p>
+      <w:r>
+        <w:t>Este tipo de crecimiento es más lento, pero suele ser efectivo en proyectos locales porque se basa en la utilidad real de la aplicación.</w:t>
+      </w:r>
     </w:p>
     <w:p/>
     <w:p>
       <w:pPr>
-        <w:pStyle w:val="Ttulo2"/>
-        <w:rPr>
-          <w:sz w:val="32"/>
-        </w:rPr>
-      </w:pPr>
-      <w:bookmarkStart w:id="46" w:name="_Toc219506290"/>
-      <w:r>
-        <w:rPr>
-          <w:sz w:val="32"/>
-        </w:rPr>
-        <w:lastRenderedPageBreak/>
-        <w:t>Evaluación</w:t>
-      </w:r>
-      <w:bookmarkEnd w:id="46"/>
-    </w:p>
-    <w:p>
-      <w:r>
-        <w:t xml:space="preserve">La evaluación del proyecto permite revisar si Digital-FIT cumple los objetivos planteados, si la estructura técnica es adecuada y si el proyecto es viable a nivel económico y funcional. </w:t>
-      </w:r>
-    </w:p>
-    <w:p>
-      <w:pPr>
         <w:pStyle w:val="Ttulo3"/>
       </w:pPr>
-      <w:bookmarkStart w:id="47" w:name="_Toc219506291"/>
-      <w:r>
-        <w:t>Procedimiento de evaluación del proyecto</w:t>
-      </w:r>
-      <w:bookmarkEnd w:id="47"/>
-    </w:p>
-    <w:p>
-      <w:r>
-        <w:t xml:space="preserve">La evaluación de Digital-FIT se realizará comprobando que los objetivos definidos al inicio del proyecto se cumplen correctamente y que la aplicación funciona de manera adecuada. </w:t>
-      </w:r>
-    </w:p>
-    <w:p>
-      <w:r>
-        <w:rPr>
-          <w:b/>
-          <w:bCs/>
-        </w:rPr>
-        <w:t>Aspectos a evaluar:</w:t>
-      </w:r>
-    </w:p>
-    <w:p>
-      <w:pPr>
-        <w:numPr>
-          <w:ilvl w:val="0"/>
-          <w:numId w:val="52"/>
-        </w:numPr>
-      </w:pPr>
-      <w:r>
-        <w:t>Funcionamiento del registro e inicio de sesión.</w:t>
-      </w:r>
-    </w:p>
-    <w:p>
-      <w:pPr>
-        <w:numPr>
-          <w:ilvl w:val="0"/>
-          <w:numId w:val="52"/>
-        </w:numPr>
-      </w:pPr>
-      <w:r>
-        <w:t>Búsqueda correcta de centros deportivos y zonas públicas según los criterios introducidos.</w:t>
-      </w:r>
-    </w:p>
-    <w:p>
-      <w:pPr>
-        <w:numPr>
-          <w:ilvl w:val="0"/>
-          <w:numId w:val="52"/>
-        </w:numPr>
-      </w:pPr>
-      <w:r>
-        <w:t>Gestión adecuada de los entrenamientos personales (crear, ver y eliminar).</w:t>
-      </w:r>
-    </w:p>
-    <w:p>
-      <w:pPr>
-        <w:numPr>
-          <w:ilvl w:val="0"/>
-          <w:numId w:val="52"/>
-        </w:numPr>
-      </w:pPr>
-      <w:r>
-        <w:t>Correcta visualización de la información y navegación entre pantallas.</w:t>
-      </w:r>
-    </w:p>
-    <w:p>
-      <w:pPr>
-        <w:numPr>
-          <w:ilvl w:val="0"/>
-          <w:numId w:val="52"/>
-        </w:numPr>
-      </w:pPr>
-      <w:r>
-        <w:t>Estabilidad general de la aplicación durante su uso.</w:t>
-      </w:r>
-    </w:p>
-    <w:p>
-      <w:pPr>
-        <w:jc w:val="left"/>
-      </w:pPr>
-      <w:r>
-        <w:rPr>
-          <w:b/>
-          <w:bCs/>
-        </w:rPr>
-        <w:t>Método de evaluación:</w:t>
-      </w:r>
-      <w:r>
-        <w:br/>
-        <w:t>La evaluación se basará principalmente en pruebas manuales realizadas durante el desarrollo y al finalizar cada fase del proyecto. Además, se tendrá en cuenta la opinión de usuarios de prueba, que permitirán detectar errores, problemas de usabilidad o posibles mejoras.</w:t>
-      </w:r>
-    </w:p>
-    <w:p>
-      <w:r>
-        <w:t>Mediante este procedimiento se podrá comprobar si Digital-FIT cumple los objetivos planteados y si está preparada para pasar a fases posteriores de desarrollo o mejora.</w:t>
+      <w:r>
+        <w:t>Acciones concretas de promoción</w:t>
+      </w:r>
+    </w:p>
+    <w:p>
+      <w:r>
+        <w:t>Para dar visibilidad a Digital-FIT se podrían realizar acciones sencillas como:</w:t>
+      </w:r>
+    </w:p>
+    <w:p>
+      <w:pPr>
+        <w:rPr>
+          <w:b/>
+          <w:bCs/>
+        </w:rPr>
+      </w:pPr>
+      <w:r>
+        <w:rPr>
+          <w:b/>
+          <w:bCs/>
+        </w:rPr>
+        <w:t xml:space="preserve">1.- Publicar vídeos cortos explicando cómo buscar centros y lugares </w:t>
+      </w:r>
+      <w:r>
+        <w:rPr>
+          <w:b/>
+          <w:bCs/>
+        </w:rPr>
+        <w:t>en el mapa.</w:t>
+      </w:r>
+    </w:p>
+    <w:p>
+      <w:pPr>
+        <w:rPr>
+          <w:b/>
+          <w:bCs/>
+        </w:rPr>
+      </w:pPr>
+      <w:r>
+        <w:rPr>
+          <w:b/>
+          <w:bCs/>
+        </w:rPr>
+        <w:t>2.- Crear publicaciones con ejemplos de entrenamientos y zonas recomendadas.</w:t>
+      </w:r>
+    </w:p>
+    <w:p>
+      <w:pPr>
+        <w:rPr>
+          <w:b/>
+          <w:bCs/>
+        </w:rPr>
+      </w:pPr>
+      <w:r>
+        <w:rPr>
+          <w:b/>
+          <w:bCs/>
+        </w:rPr>
+        <w:t xml:space="preserve">3.- Diseñar carteles o </w:t>
+      </w:r>
+      <w:proofErr w:type="spellStart"/>
+      <w:r>
+        <w:rPr>
+          <w:b/>
+          <w:bCs/>
+        </w:rPr>
+        <w:t>flyers</w:t>
+      </w:r>
+      <w:proofErr w:type="spellEnd"/>
+      <w:r>
+        <w:rPr>
+          <w:b/>
+          <w:bCs/>
+        </w:rPr>
+        <w:t xml:space="preserve"> con un código QR hacia la aplicación.</w:t>
+      </w:r>
+    </w:p>
+    <w:p>
+      <w:pPr>
+        <w:rPr>
+          <w:b/>
+          <w:bCs/>
+        </w:rPr>
+      </w:pPr>
+      <w:r>
+        <w:rPr>
+          <w:b/>
+          <w:bCs/>
+        </w:rPr>
+        <w:t>4.- Contactar con gimnasios locales para proponer colaboración.</w:t>
+      </w:r>
+    </w:p>
+    <w:p>
+      <w:pPr>
+        <w:rPr>
+          <w:b/>
+          <w:bCs/>
+        </w:rPr>
+      </w:pPr>
+      <w:r>
+        <w:rPr>
+          <w:b/>
+          <w:bCs/>
+        </w:rPr>
+        <w:t>5.- Crear una cuenta oficial de Digital-FIT en redes sociales.</w:t>
+      </w:r>
+    </w:p>
+    <w:p>
+      <w:pPr>
+        <w:rPr>
+          <w:b/>
+          <w:bCs/>
+        </w:rPr>
+      </w:pPr>
+      <w:r>
+        <w:rPr>
+          <w:b/>
+          <w:bCs/>
+        </w:rPr>
+        <w:t>6.- Publicar novedades y mejoras de la aplicación para mantener el interés de los usuarios.</w:t>
+      </w:r>
+    </w:p>
+    <w:p/>
+    <w:p>
+      <w:pPr>
+        <w:pStyle w:val="Ttulo3"/>
+      </w:pPr>
+      <w:r>
+        <w:t>Eslogan propuesto</w:t>
+      </w:r>
+    </w:p>
+    <w:p>
+      <w:r>
+        <w:t>Un posible eslogan para Digital-FIT sería:</w:t>
+      </w:r>
+    </w:p>
+    <w:p>
+      <w:pPr>
+        <w:rPr>
+          <w:b/>
+          <w:bCs/>
+        </w:rPr>
+      </w:pPr>
+      <w:r>
+        <w:rPr>
+          <w:b/>
+          <w:bCs/>
+        </w:rPr>
+        <w:t>“Encuentra dónde entrenar. Organiza cómo mejorar.”</w:t>
+      </w:r>
+    </w:p>
+    <w:p>
+      <w:r>
+        <w:t>Este eslogan resume la idea principal de la aplicación, ya que une la búsqueda de instalaciones deportivas con la organización personal del entrenamiento.</w:t>
       </w:r>
     </w:p>
     <w:p/>
@@ -11807,121 +13002,70 @@
       <w:pPr>
         <w:pStyle w:val="Ttulo3"/>
       </w:pPr>
-      <w:bookmarkStart w:id="48" w:name="_Toc219506292"/>
       <w:r>
         <w:lastRenderedPageBreak/>
-        <w:t>Medidas ante desviaciones del proyecto</w:t>
-      </w:r>
-      <w:bookmarkEnd w:id="48"/>
-    </w:p>
-    <w:p>
-      <w:pPr>
-        <w:jc w:val="left"/>
-      </w:pPr>
-      <w:r>
-        <w:t>Durante el desarrollo</w:t>
-      </w:r>
-      <w:r>
-        <w:t xml:space="preserve"> </w:t>
-      </w:r>
-      <w:r>
-        <w:t>pueden surgir desviaciones respecto a lo planificado inicialmente. Estas desviaciones pueden estar relacionadas con el tiempo de desarrollo, la aparición de errores técnicos o la necesidad de ajustar algunas funcionalidades.</w:t>
-      </w:r>
-      <w:r>
-        <w:t xml:space="preserve"> </w:t>
-      </w:r>
-      <w:r>
-        <w:t>Para minimizar su impacto, se plantean una serie de medidas correctoras.</w:t>
-      </w:r>
-    </w:p>
-    <w:p>
-      <w:r>
-        <w:rPr>
-          <w:b/>
-          <w:bCs/>
-        </w:rPr>
-        <w:t>Posibles desviaciones y soluciones:</w:t>
-      </w:r>
-    </w:p>
-    <w:p>
-      <w:pPr>
-        <w:numPr>
-          <w:ilvl w:val="0"/>
-          <w:numId w:val="53"/>
-        </w:numPr>
-        <w:jc w:val="left"/>
-      </w:pPr>
-      <w:r>
-        <w:rPr>
-          <w:b/>
-          <w:bCs/>
-        </w:rPr>
-        <w:t>Retrasos en el desarrollo:</w:t>
-      </w:r>
-      <w:r>
-        <w:t xml:space="preserve"> reajustar la planificación y priorizar las funcionalidades básicas para asegurar una versión funcional de la aplicación.</w:t>
-      </w:r>
-    </w:p>
-    <w:p>
-      <w:pPr>
-        <w:numPr>
-          <w:ilvl w:val="0"/>
-          <w:numId w:val="53"/>
-        </w:numPr>
-        <w:jc w:val="left"/>
-      </w:pPr>
-      <w:r>
-        <w:rPr>
-          <w:b/>
-          <w:bCs/>
-        </w:rPr>
-        <w:t>Errores técnicos o fallos de funcionamiento:</w:t>
-      </w:r>
-      <w:r>
-        <w:t xml:space="preserve"> realizar revisiones más frecuentes y pruebas manuales antes de avanzar a nuevas fases.</w:t>
-      </w:r>
-    </w:p>
-    <w:p>
-      <w:pPr>
-        <w:numPr>
-          <w:ilvl w:val="0"/>
-          <w:numId w:val="53"/>
-        </w:numPr>
-        <w:jc w:val="left"/>
-      </w:pPr>
-      <w:r>
-        <w:rPr>
-          <w:b/>
-          <w:bCs/>
-        </w:rPr>
-        <w:t>Problemas de usabilidad:</w:t>
-      </w:r>
-      <w:r>
-        <w:t xml:space="preserve"> simplificar la interfaz o modificar la navegación según el feedback de los usuarios de prueba.</w:t>
-      </w:r>
-    </w:p>
-    <w:p>
-      <w:pPr>
-        <w:numPr>
-          <w:ilvl w:val="0"/>
-          <w:numId w:val="53"/>
-        </w:numPr>
-        <w:jc w:val="left"/>
-      </w:pPr>
-      <w:r>
-        <w:rPr>
-          <w:b/>
-          <w:bCs/>
-        </w:rPr>
-        <w:t>Cambios en el alcance del proyecto:</w:t>
-      </w:r>
-      <w:r>
-        <w:t xml:space="preserve"> reducir o aplazar funcionalidades no esenciales para mantener la estabilidad del proyecto.</w:t>
-      </w:r>
-    </w:p>
-    <w:p>
-      <w:r>
-        <w:t>Estas medidas permiten adaptar el desarrollo de Digital-FIT a posibles imprevistos sin comprometer los objetivos principales del proyecto.</w:t>
+        <w:t>Presupuesto de difusión</w:t>
+      </w:r>
+    </w:p>
+    <w:p>
+      <w:r>
+        <w:t xml:space="preserve">Al tratarse de un proyecto inicial, la difusión se plantea con un presupuesto reducido. La mayoría de </w:t>
+      </w:r>
+      <w:proofErr w:type="gramStart"/>
+      <w:r>
+        <w:t>acciones</w:t>
+      </w:r>
+      <w:proofErr w:type="gramEnd"/>
+      <w:r>
+        <w:t xml:space="preserve"> podrían realizarse de forma gratuita o con bajo coste, utilizando redes sociales, colaboraciones locales y material digital.</w:t>
+      </w:r>
+    </w:p>
+    <w:p>
+      <w:pPr>
+        <w:rPr>
+          <w:b/>
+          <w:bCs/>
+        </w:rPr>
+      </w:pPr>
+      <w:r>
+        <w:rPr>
+          <w:b/>
+          <w:bCs/>
+        </w:rPr>
+        <w:t>Un presupuesto básico podría ser:</w:t>
+      </w:r>
+    </w:p>
+    <w:p>
+      <w:r>
+        <w:t xml:space="preserve">1.- Diseño de carteles o </w:t>
+      </w:r>
+      <w:proofErr w:type="spellStart"/>
+      <w:r>
+        <w:t>flyers</w:t>
+      </w:r>
+      <w:proofErr w:type="spellEnd"/>
+      <w:r>
+        <w:t>: 20–40 €.</w:t>
+      </w:r>
+    </w:p>
+    <w:p>
+      <w:r>
+        <w:t>2.- Promoción inicial en redes sociales: 30–60 €.</w:t>
+      </w:r>
+    </w:p>
+    <w:p>
+      <w:r>
+        <w:t>3.- Material gráfico básico: 10–20 €.</w:t>
+      </w:r>
+    </w:p>
+    <w:p>
+      <w:r>
+        <w:t>4.- Publicaciones orgánicas en redes sociales: sin coste.</w:t>
+      </w:r>
+    </w:p>
+    <w:p>
+      <w:r>
+        <w:t>Con este presupuesto reducido se podría iniciar una primera campaña local sin asumir grandes gastos.</w:t>
       </w:r>
     </w:p>
     <w:p/>
@@ -11929,115 +13073,201 @@
       <w:pPr>
         <w:pStyle w:val="Ttulo3"/>
       </w:pPr>
-      <w:bookmarkStart w:id="49" w:name="_Toc219506293"/>
-      <w:r>
-        <w:t>Viabilidad Económica del Proyecto</w:t>
-      </w:r>
-      <w:bookmarkEnd w:id="49"/>
-    </w:p>
-    <w:p>
-      <w:pPr>
-        <w:jc w:val="left"/>
-      </w:pPr>
-      <w:r>
-        <w:t xml:space="preserve">Digital-FIT presenta una estructura de costes reducida, lo que facilita su mantenimiento incluso en las primeras fases del proyecto. </w:t>
-      </w:r>
-    </w:p>
-    <w:p>
-      <w:pPr>
-        <w:jc w:val="left"/>
-      </w:pPr>
-      <w:r>
-        <w:t xml:space="preserve">Tanto el dominio como el servidor y el mantenimiento anual tienen un coste asumible para una </w:t>
-      </w:r>
-      <w:proofErr w:type="gramStart"/>
-      <w:r>
-        <w:t>startup pequeña</w:t>
-      </w:r>
-      <w:proofErr w:type="gramEnd"/>
-      <w:r>
-        <w:t xml:space="preserve"> que quiere lanzar una aplicación enfocada al ámbito local.</w:t>
-      </w:r>
-    </w:p>
-    <w:p>
-      <w:pPr>
-        <w:jc w:val="left"/>
-      </w:pPr>
-      <w:r>
-        <w:t xml:space="preserve">A nivel de ingresos, el proyecto puede mantenerse mediante métodos sencillos que no requieren desarrollar funciones avanzadas dentro de la aplicación. </w:t>
-      </w:r>
-    </w:p>
-    <w:p>
-      <w:pPr>
-        <w:jc w:val="left"/>
-      </w:pPr>
-      <w:r>
-        <w:t xml:space="preserve">Las colaboraciones con gimnasios y centros deportivos locales permiten que estos tengan más visibilidad dentro de la plataforma, mientras que la publicidad no intrusiva genera ingresos estables sin afectar a la experiencia del usuario. </w:t>
-      </w:r>
-    </w:p>
-    <w:p>
-      <w:pPr>
-        <w:jc w:val="left"/>
+      <w:r>
+        <w:t>Conclusión sobre la difusión</w:t>
+      </w:r>
+    </w:p>
+    <w:p>
+      <w:r>
+        <w:t>La estrategia de difusión de Digital-FIT se basa en empezar de forma local, aprovechando redes sociales, colaboraciones con centros deportivos y recomendaciones entre usuarios. Esta forma de promoción encaja con el tipo de proyecto, ya que permite crecer poco a poco y comprobar si la aplicación realmente despierta interés en su público objetivo.</w:t>
+      </w:r>
+    </w:p>
+    <w:p/>
+    <w:p/>
+    <w:p/>
+    <w:p/>
+    <w:p/>
+    <w:p/>
+    <w:p/>
+    <w:p>
+      <w:pPr>
+        <w:pStyle w:val="Ttulo2"/>
       </w:pPr>
       <w:r>
         <w:lastRenderedPageBreak/>
-        <w:t>También es posible establecer acuerdos con tiendas deportivas para recomendar material adecuado según el tipo de entrenamiento, aportando una fuente extra de ingresos sin complicar el funcionamiento de la app.</w:t>
-      </w:r>
-    </w:p>
-    <w:p>
-      <w:pPr>
-        <w:jc w:val="left"/>
-      </w:pPr>
-      <w:r>
-        <w:t>En conjunto, estos factores permiten que Digital-FIT pueda operar sin necesidad de grandes inversiones y que su crecimiento dependa principalmente del aumento de usuarios y de la participación de centros deportivos interesados en aparecer dentro de la plataforma.</w:t>
-      </w:r>
-    </w:p>
-    <w:p>
-      <w:pPr>
-        <w:jc w:val="left"/>
-      </w:pPr>
-    </w:p>
-    <w:p>
-      <w:pPr>
-        <w:jc w:val="left"/>
-        <w:rPr>
-          <w:b/>
-          <w:bCs/>
-        </w:rPr>
-      </w:pPr>
-      <w:r>
-        <w:rPr>
-          <w:b/>
-          <w:bCs/>
-        </w:rPr>
-        <w:t>Conclusión sobre la viabilidad económica</w:t>
-      </w:r>
-    </w:p>
-    <w:p>
-      <w:pPr>
-        <w:jc w:val="left"/>
-      </w:pPr>
-      <w:r>
-        <w:t xml:space="preserve">El proyecto es viable porque los costes operativos de Digital-FIT son reducidos y pueden cubrirse fácilmente mediante colaboraciones locales y publicidad sencilla. </w:t>
-      </w:r>
-    </w:p>
-    <w:p>
-      <w:pPr>
-        <w:jc w:val="left"/>
-      </w:pPr>
-      <w:r>
-        <w:t xml:space="preserve">Esto permite mantener la aplicación activa sin necesidad de grandes inversiones. </w:t>
-      </w:r>
-    </w:p>
-    <w:p>
-      <w:pPr>
-        <w:jc w:val="left"/>
-      </w:pPr>
-      <w:r>
-        <w:t>A medida que la base de usuarios crezca y más centros deportivos se interesen por aparecer en la plataforma, los ingresos aumentarán y podrán invertirse en mejorar y ampliar la aplicación en el futuro.</w:t>
+        <w:t>Servicio Posventa y atención al usuario</w:t>
+      </w:r>
+    </w:p>
+    <w:p>
+      <w:r>
+        <w:t>Aunque Digital-FIT es una aplicación digital, también necesita contar con un sistema básico de atención al usuario. El objetivo de este servicio es resolver dudas, recoger sugerencias, detectar errores y mejorar la aplicación a partir del uso real de los usuarios.</w:t>
+      </w:r>
+    </w:p>
+    <w:p>
+      <w:pPr>
+        <w:pStyle w:val="Ttulo3"/>
+      </w:pPr>
+      <w:r>
+        <w:t>Canales de atención al usuario</w:t>
+      </w:r>
+    </w:p>
+    <w:p>
+      <w:pPr>
+        <w:rPr>
+          <w:b/>
+          <w:bCs/>
+        </w:rPr>
+      </w:pPr>
+      <w:r>
+        <w:rPr>
+          <w:b/>
+          <w:bCs/>
+        </w:rPr>
+        <w:t>1.- Apartado de soporte dentro de la aplicación</w:t>
+      </w:r>
+    </w:p>
+    <w:p>
+      <w:r>
+        <w:t>La aplicación incluye un apartado de soporte para que los usuarios puedan enviar dudas, incidencias o sugerencias. Este sistema permite centralizar la comunicación dentro de la propia plataforma y facilita que el usuario no tenga que buscar otros medios externos para contactar.</w:t>
+      </w:r>
+    </w:p>
+    <w:p>
+      <w:r>
+        <w:t>Desde este apartado, el usuario puede explicar el problema que ha encontrado o enviar una propuesta de mejora. Esta información sería revisada posteriormente por el administrador o por el equipo responsable del mantenimiento de la aplicación.</w:t>
+      </w:r>
+    </w:p>
+    <w:p>
+      <w:pPr>
+        <w:rPr>
+          <w:b/>
+          <w:bCs/>
+        </w:rPr>
+      </w:pPr>
+      <w:r>
+        <w:rPr>
+          <w:b/>
+          <w:bCs/>
+        </w:rPr>
+        <w:t>2.- Correo electrónico de soporte</w:t>
+      </w:r>
+    </w:p>
+    <w:p>
+      <w:r>
+        <w:t>Además del apartado interno, Digital-FIT podría contar con un correo electrónico de soporte. Este canal serviría para atender problemas más específicos relacionados con cuentas de usuario, errores técnicos o dudas generales sobre el funcionamiento de la aplicación.</w:t>
+      </w:r>
+    </w:p>
+    <w:p>
+      <w:r>
+        <w:t>El correo de soporte también sería útil para usuarios que no puedan acceder correctamente a su cuenta y necesiten contactar desde fuera de la plataforma.</w:t>
+      </w:r>
+    </w:p>
+    <w:p>
+      <w:pPr>
+        <w:rPr>
+          <w:b/>
+          <w:bCs/>
+        </w:rPr>
+      </w:pPr>
+      <w:r>
+        <w:rPr>
+          <w:b/>
+          <w:bCs/>
+        </w:rPr>
+        <w:t>3.- Preguntas frecuentes</w:t>
+      </w:r>
+    </w:p>
+    <w:p>
+      <w:r>
+        <w:t>En una versión futura, se podría añadir una sección de preguntas frecuentes. Esta sección recogería las dudas más habituales sobre el registro, inicio de sesión, búsqueda de centros, uso del mapa, entrenamientos o valoraciones.</w:t>
+      </w:r>
+    </w:p>
+    <w:p>
+      <w:r>
+        <w:t>Las preguntas frecuentes ayudarían a reducir consultas repetidas y permitirían que el usuario resolviera problemas básicos de forma rápida.</w:t>
       </w:r>
     </w:p>
     <w:p/>
+    <w:p/>
+    <w:p>
+      <w:pPr>
+        <w:pStyle w:val="Ttulo3"/>
+      </w:pPr>
+      <w:r>
+        <w:lastRenderedPageBreak/>
+        <w:t>Gestión de incidencias</w:t>
+      </w:r>
+    </w:p>
+    <w:p>
+      <w:r>
+        <w:t>Cuando un usuario comunique un problema, se revisaría la incidencia para clasificarla según su importancia. Por ejemplo, no tendría la misma prioridad un error visual pequeño que un fallo que impida iniciar sesión o guardar un entrenamiento.</w:t>
+      </w:r>
+    </w:p>
+    <w:p>
+      <w:r>
+        <w:t>Las incidencias más graves se atenderían primero, especialmente aquellas que afecten al acceso, a la seguridad o al funcionamiento principal de la aplicación.</w:t>
+      </w:r>
+    </w:p>
+    <w:p>
+      <w:r>
+        <w:t>Las sugerencias de mejora se guardarían para valorar si pueden añadirse en futuras versiones del proyecto. De esta forma, el feedback de los usuarios serviría para evolucionar Digital-FIT de forma más realista.</w:t>
+      </w:r>
+    </w:p>
+    <w:p/>
+    <w:p>
+      <w:pPr>
+        <w:pStyle w:val="Ttulo3"/>
+      </w:pPr>
+      <w:r>
+        <w:t>Mantenimiento de la aplicación</w:t>
+      </w:r>
+    </w:p>
+    <w:p>
+      <w:r>
+        <w:t>El servicio posventa también incluye el mantenimiento técnico de la aplicación. Esto implica revisar errores, actualizar datos, comprobar que el mapa siga funcionando correctamente y mantener la base de datos organizada.</w:t>
+      </w:r>
+    </w:p>
+    <w:p>
+      <w:r>
+        <w:t>Además, el administrador podría revisar periódicamente los centros, lugares, valoraciones y mensajes recibidos para asegurar que la información de la aplicación se mantiene útil y actualizada.</w:t>
+      </w:r>
+    </w:p>
+    <w:p/>
+    <w:p>
+      <w:pPr>
+        <w:pStyle w:val="Ttulo3"/>
+      </w:pPr>
+      <w:r>
+        <w:t>Conclusión sobre el servicio posventa</w:t>
+      </w:r>
+    </w:p>
+    <w:p>
+      <w:r>
+        <w:t>El servicio posventa de Digital-FIT se plantea como un sistema sencillo pero útil para mantener la comunicación con los usuarios, resolver problemas y recoger sugerencias. Gracias a este servicio, la aplicación podría mejorar con el tiempo y ofrecer una experiencia más completa y fiable.</w:t>
+      </w:r>
+    </w:p>
+    <w:p/>
+    <w:p/>
+    <w:p/>
+    <w:p/>
+    <w:p/>
+    <w:p>
+      <w:pPr>
+        <w:pStyle w:val="Ttulo2"/>
+        <w:rPr>
+          <w:sz w:val="32"/>
+        </w:rPr>
+      </w:pPr>
+      <w:bookmarkStart w:id="42" w:name="_Toc219506290"/>
+      <w:r>
+        <w:rPr>
+          <w:sz w:val="32"/>
+        </w:rPr>
+        <w:lastRenderedPageBreak/>
+        <w:t>Evaluación</w:t>
+      </w:r>
+      <w:bookmarkEnd w:id="42"/>
+    </w:p>
+    <w:p/>
     <w:p>
       <w:r>
         <w:br w:type="page"/>
@@ -12047,12 +13277,12 @@
       <w:pPr>
         <w:pStyle w:val="Ttulo1"/>
       </w:pPr>
-      <w:bookmarkStart w:id="50" w:name="_Toc219506294"/>
+      <w:bookmarkStart w:id="43" w:name="_Toc219506294"/>
       <w:r>
         <w:lastRenderedPageBreak/>
         <w:t>Conclusiones</w:t>
       </w:r>
-      <w:bookmarkEnd w:id="50"/>
+      <w:bookmarkEnd w:id="43"/>
     </w:p>
     <w:p>
       <w:pPr>
@@ -12099,95 +13329,16 @@
         <w:br w:type="page"/>
       </w:r>
     </w:p>
-    <w:bookmarkStart w:id="51" w:name="_Toc219506295" w:displacedByCustomXml="next"/>
-    <w:sdt>
-      <w:sdtPr>
-        <w:rPr>
-          <w:rFonts w:eastAsiaTheme="minorHAnsi" w:cstheme="minorBidi"/>
-          <w:b w:val="0"/>
-          <w:color w:val="auto"/>
-          <w:sz w:val="24"/>
-          <w:szCs w:val="24"/>
-        </w:rPr>
-        <w:id w:val="1231964758"/>
-        <w:docPartObj>
-          <w:docPartGallery w:val="Bibliographies"/>
-          <w:docPartUnique/>
-        </w:docPartObj>
-      </w:sdtPr>
-      <w:sdtContent>
-        <w:p>
-          <w:pPr>
-            <w:pStyle w:val="Ttulo1"/>
-            <w:ind w:left="709" w:hanging="709"/>
-          </w:pPr>
-          <w:r>
-            <w:t>Bibliografía</w:t>
-          </w:r>
-          <w:bookmarkEnd w:id="51"/>
-        </w:p>
-        <w:sdt>
-          <w:sdtPr>
-            <w:id w:val="111145805"/>
-            <w:bibliography/>
-          </w:sdtPr>
-          <w:sdtContent>
-            <w:p>
-              <w:pPr>
-                <w:ind w:left="709" w:hanging="709"/>
-              </w:pPr>
-              <w:r>
-                <w:fldChar w:fldCharType="begin"/>
-              </w:r>
-              <w:r>
-                <w:instrText>BIBLIOGRAPHY</w:instrText>
-              </w:r>
-              <w:r>
-                <w:fldChar w:fldCharType="separate"/>
-              </w:r>
-              <w:r>
-                <w:rPr>
-                  <w:b/>
-                  <w:bCs/>
-                  <w:noProof/>
-                </w:rPr>
-                <w:t>No hay ninguna fuente en el documento actual.</w:t>
-              </w:r>
-              <w:r>
-                <w:rPr>
-                  <w:b/>
-                  <w:bCs/>
-                </w:rPr>
-                <w:fldChar w:fldCharType="end"/>
-              </w:r>
-            </w:p>
-          </w:sdtContent>
-        </w:sdt>
-      </w:sdtContent>
-    </w:sdt>
-    <w:p>
-      <w:pPr>
-        <w:rPr>
-          <w:rFonts w:eastAsiaTheme="majorEastAsia" w:cstheme="majorBidi"/>
-          <w:color w:val="0F4761" w:themeColor="accent1" w:themeShade="BF"/>
-          <w:sz w:val="32"/>
-          <w:szCs w:val="40"/>
-        </w:rPr>
-      </w:pPr>
-      <w:r>
-        <w:br w:type="page"/>
-      </w:r>
-    </w:p>
     <w:p>
       <w:pPr>
         <w:pStyle w:val="Ttulo1"/>
       </w:pPr>
-      <w:bookmarkStart w:id="52" w:name="_Toc219506296"/>
+      <w:bookmarkStart w:id="44" w:name="_Toc219506296"/>
       <w:r>
         <w:lastRenderedPageBreak/>
         <w:t>Anexos</w:t>
       </w:r>
-      <w:bookmarkEnd w:id="52"/>
+      <w:bookmarkEnd w:id="44"/>
     </w:p>
     <w:p>
       <w:pPr>

</xml_diff>

<commit_message>
docs: revisar la memoria del proyecto
- Actualizar Documentacion/DOC-Digital-Fit.docx.
</commit_message>
<xml_diff>
--- a/Documentacion/DOC-Digital-Fit.docx
+++ b/Documentacion/DOC-Digital-Fit.docx
@@ -139,639 +139,280 @@
           <w:szCs w:val="32"/>
           <w:lang w:val="en-US"/>
         </w:rPr>
-        <w:t>Abstract/</w:t>
-      </w:r>
-      <w:proofErr w:type="spellStart"/>
-      <w:r>
+        <w:t>Abstract/Extracte/Extracto</w:t>
+      </w:r>
+    </w:p>
+    <w:p>
+      <w:pPr>
+        <w:rPr>
+          <w:lang w:val="en-US"/>
+        </w:rPr>
+      </w:pPr>
+      <w:r>
+        <w:rPr>
+          <w:b/>
+          <w:bCs/>
+          <w:lang w:val="en-US"/>
+        </w:rPr>
+        <w:t>Abstract (EN)</w:t>
+      </w:r>
+      <w:r>
+        <w:rPr>
+          <w:lang w:val="en-US"/>
+        </w:rPr>
+        <w:br/>
+        <w:t xml:space="preserve">This project consists of a web application designed to guide people in doing sports with more autonomy. </w:t>
+      </w:r>
+    </w:p>
+    <w:p>
+      <w:pPr>
+        <w:rPr>
+          <w:lang w:val="en-US"/>
+        </w:rPr>
+      </w:pPr>
+      <w:r>
+        <w:rPr>
+          <w:lang w:val="en-US"/>
+        </w:rPr>
+        <w:t>The app will include basic training routines depending on the user’s goal, a search for gyms and sports facilities (such as padel courts, public or private). The idea is to make it easier for anyone who wants to start training or improve their practice to have everything organized in one place.</w:t>
+      </w:r>
+    </w:p>
+    <w:p>
+      <w:pPr>
+        <w:rPr>
+          <w:lang w:val="en-US"/>
+        </w:rPr>
+      </w:pPr>
+    </w:p>
+    <w:p>
+      <w:r>
+        <w:rPr>
+          <w:b/>
+          <w:bCs/>
+        </w:rPr>
+        <w:t>Extracte</w:t>
+      </w:r>
+      <w:r>
+        <w:rPr>
+          <w:b/>
+          <w:bCs/>
+        </w:rPr>
+        <w:t xml:space="preserve"> (VA)</w:t>
+      </w:r>
+      <w:r>
+        <w:br/>
+        <w:t xml:space="preserve">Aquest projecte consisteix en una aplicació web pensada per a guiar les persones en la pràctica esportiva amb més autonomia. </w:t>
+      </w:r>
+    </w:p>
+    <w:p>
+      <w:r>
+        <w:t>L’app inclourà rutines bàsiques d’entrenament segons l’objectiu de l’usuari, un cercador de gimnasos i instal·lacions esportives (com pistes de pàdel, públiques o privades)</w:t>
+      </w:r>
+      <w:r>
+        <w:t xml:space="preserve">. </w:t>
+      </w:r>
+      <w:r>
+        <w:t>La idea és facilitar que qualsevol persona que vulga començar a entrenar o millorar la seua pràctica tinga tota la informació ordenada en un sol lloc.</w:t>
+      </w:r>
+    </w:p>
+    <w:p/>
+    <w:p>
+      <w:r>
+        <w:rPr>
+          <w:b/>
+          <w:bCs/>
+        </w:rPr>
+        <w:t>Extracto</w:t>
+      </w:r>
+      <w:r>
+        <w:rPr>
+          <w:b/>
+          <w:bCs/>
+        </w:rPr>
+        <w:t xml:space="preserve"> (ES)</w:t>
+      </w:r>
+      <w:r>
+        <w:br/>
+        <w:t xml:space="preserve">Este proyecto consiste en una aplicación web pensada para guiar a las personas en la práctica deportiva con más autonomía. </w:t>
+      </w:r>
+    </w:p>
+    <w:p>
+      <w:r>
+        <w:t>La app incluirá rutinas básicas de entrenamiento según el objetivo del usuario, un buscador de gimnasios e instalaciones deportivas (como pistas de pádel, públicas o privadas)</w:t>
+      </w:r>
+      <w:r>
+        <w:t xml:space="preserve">. </w:t>
+      </w:r>
+      <w:r>
+        <w:t>La idea es facilitar que cualquier persona que quiera empezar a entrenar o mejorar su práctica tenga todo organizado en un mismo sitio.</w:t>
+      </w:r>
+    </w:p>
+    <w:p>
+      <w:pPr>
+        <w:spacing w:line="278" w:lineRule="auto"/>
+        <w:jc w:val="left"/>
+      </w:pPr>
+      <w:r>
+        <w:br w:type="page"/>
+      </w:r>
+    </w:p>
+    <w:p>
+      <w:pPr>
         <w:rPr>
           <w:b/>
           <w:bCs/>
           <w:sz w:val="32"/>
           <w:szCs w:val="32"/>
-          <w:lang w:val="en-US"/>
-        </w:rPr>
-        <w:t>Extracte</w:t>
-      </w:r>
-      <w:proofErr w:type="spellEnd"/>
+        </w:rPr>
+      </w:pPr>
       <w:r>
         <w:rPr>
           <w:b/>
           <w:bCs/>
           <w:sz w:val="32"/>
           <w:szCs w:val="32"/>
+        </w:rPr>
+        <w:lastRenderedPageBreak/>
+        <w:t>Keywords/Paraules Clau/Palabras clave</w:t>
+      </w:r>
+    </w:p>
+    <w:p>
+      <w:pPr>
+        <w:rPr>
+          <w:b/>
+          <w:bCs/>
+        </w:rPr>
+      </w:pPr>
+      <w:r>
+        <w:rPr>
+          <w:b/>
+          <w:bCs/>
+        </w:rPr>
+        <w:t>Keywords (EN)</w:t>
+      </w:r>
+    </w:p>
+    <w:p>
+      <w:pPr>
+        <w:rPr>
           <w:lang w:val="en-US"/>
         </w:rPr>
-        <w:t>/Extracto</w:t>
-      </w:r>
-    </w:p>
-    <w:p>
-      <w:pPr>
+      </w:pPr>
+      <w:r>
         <w:rPr>
           <w:lang w:val="en-US"/>
         </w:rPr>
-      </w:pPr>
-      <w:r>
-        <w:rPr>
-          <w:b/>
-          <w:bCs/>
+        <w:t>S</w:t>
+      </w:r>
+      <w:r>
+        <w:rPr>
           <w:lang w:val="en-US"/>
         </w:rPr>
-        <w:t>Abstract (EN)</w:t>
+        <w:t xml:space="preserve">ports app; </w:t>
       </w:r>
       <w:r>
         <w:rPr>
           <w:lang w:val="en-US"/>
         </w:rPr>
-        <w:br/>
-        <w:t xml:space="preserve">This project consists of a web application designed to guide people in doing sports with more autonomy. </w:t>
-      </w:r>
-    </w:p>
-    <w:p>
-      <w:pPr>
+        <w:t>T</w:t>
+      </w:r>
+      <w:r>
         <w:rPr>
           <w:lang w:val="en-US"/>
         </w:rPr>
-      </w:pPr>
+        <w:t xml:space="preserve">raining routines; </w:t>
+      </w:r>
       <w:r>
         <w:rPr>
           <w:lang w:val="en-US"/>
         </w:rPr>
-        <w:t>The app will include basic training routines depending on the user’s goal, a search for gyms and sports facilities (such as padel courts, public or private). The idea is to make it easier for anyone who wants to start training or improve their practice to have everything organized in one place.</w:t>
-      </w:r>
-    </w:p>
-    <w:p>
-      <w:pPr>
+        <w:t>G</w:t>
+      </w:r>
+      <w:r>
         <w:rPr>
           <w:lang w:val="en-US"/>
         </w:rPr>
-      </w:pPr>
-    </w:p>
-    <w:p>
-      <w:r>
-        <w:rPr>
-          <w:b/>
-          <w:bCs/>
-        </w:rPr>
-        <w:t>Extracte</w:t>
-      </w:r>
-      <w:r>
-        <w:rPr>
-          <w:b/>
-          <w:bCs/>
-        </w:rPr>
-        <w:t xml:space="preserve"> (VA)</w:t>
-      </w:r>
-      <w:r>
-        <w:br/>
-      </w:r>
-      <w:proofErr w:type="spellStart"/>
-      <w:r>
-        <w:t>Aquest</w:t>
-      </w:r>
-      <w:proofErr w:type="spellEnd"/>
-      <w:r>
-        <w:t xml:space="preserve"> </w:t>
-      </w:r>
-      <w:proofErr w:type="spellStart"/>
-      <w:r>
-        <w:t>projecte</w:t>
-      </w:r>
-      <w:proofErr w:type="spellEnd"/>
-      <w:r>
-        <w:t xml:space="preserve"> </w:t>
-      </w:r>
-      <w:proofErr w:type="spellStart"/>
-      <w:r>
-        <w:t>consisteix</w:t>
-      </w:r>
-      <w:proofErr w:type="spellEnd"/>
-      <w:r>
-        <w:t xml:space="preserve"> en una </w:t>
-      </w:r>
-      <w:proofErr w:type="spellStart"/>
-      <w:r>
-        <w:t>aplicació</w:t>
-      </w:r>
-      <w:proofErr w:type="spellEnd"/>
-      <w:r>
-        <w:t xml:space="preserve"> web pensada per a guiar les persones en la </w:t>
-      </w:r>
-      <w:proofErr w:type="spellStart"/>
-      <w:r>
-        <w:t>pràctica</w:t>
-      </w:r>
-      <w:proofErr w:type="spellEnd"/>
-      <w:r>
-        <w:t xml:space="preserve"> esportiva </w:t>
-      </w:r>
-      <w:proofErr w:type="spellStart"/>
-      <w:r>
-        <w:t>amb</w:t>
-      </w:r>
-      <w:proofErr w:type="spellEnd"/>
-      <w:r>
-        <w:t xml:space="preserve"> </w:t>
-      </w:r>
-      <w:proofErr w:type="spellStart"/>
-      <w:r>
-        <w:t>més</w:t>
-      </w:r>
-      <w:proofErr w:type="spellEnd"/>
-      <w:r>
-        <w:t xml:space="preserve"> </w:t>
-      </w:r>
-      <w:proofErr w:type="spellStart"/>
-      <w:r>
-        <w:t>autonomia</w:t>
-      </w:r>
-      <w:proofErr w:type="spellEnd"/>
-      <w:r>
-        <w:t xml:space="preserve">. </w:t>
-      </w:r>
-    </w:p>
-    <w:p>
-      <w:proofErr w:type="spellStart"/>
-      <w:r>
-        <w:t>L’app</w:t>
-      </w:r>
-      <w:proofErr w:type="spellEnd"/>
-      <w:r>
-        <w:t xml:space="preserve"> </w:t>
-      </w:r>
-      <w:proofErr w:type="spellStart"/>
-      <w:r>
-        <w:t>inclourà</w:t>
-      </w:r>
-      <w:proofErr w:type="spellEnd"/>
-      <w:r>
-        <w:t xml:space="preserve"> </w:t>
-      </w:r>
-      <w:proofErr w:type="spellStart"/>
-      <w:r>
-        <w:t>rutines</w:t>
-      </w:r>
-      <w:proofErr w:type="spellEnd"/>
-      <w:r>
-        <w:t xml:space="preserve"> </w:t>
-      </w:r>
-      <w:proofErr w:type="spellStart"/>
-      <w:r>
-        <w:t>bàsiques</w:t>
-      </w:r>
-      <w:proofErr w:type="spellEnd"/>
-      <w:r>
-        <w:t xml:space="preserve"> </w:t>
-      </w:r>
-      <w:proofErr w:type="spellStart"/>
-      <w:r>
-        <w:t>d’entrenament</w:t>
-      </w:r>
-      <w:proofErr w:type="spellEnd"/>
-      <w:r>
-        <w:t xml:space="preserve"> </w:t>
-      </w:r>
-      <w:proofErr w:type="spellStart"/>
-      <w:r>
-        <w:t>segons</w:t>
-      </w:r>
-      <w:proofErr w:type="spellEnd"/>
-      <w:r>
-        <w:t xml:space="preserve"> </w:t>
-      </w:r>
-      <w:proofErr w:type="spellStart"/>
-      <w:r>
-        <w:t>l’objectiu</w:t>
-      </w:r>
-      <w:proofErr w:type="spellEnd"/>
-      <w:r>
-        <w:t xml:space="preserve"> de </w:t>
-      </w:r>
-      <w:proofErr w:type="spellStart"/>
-      <w:r>
-        <w:t>l’usuari</w:t>
-      </w:r>
-      <w:proofErr w:type="spellEnd"/>
-      <w:r>
-        <w:t xml:space="preserve">, un cercador de </w:t>
-      </w:r>
-      <w:proofErr w:type="spellStart"/>
-      <w:r>
-        <w:t>gimnasos</w:t>
-      </w:r>
-      <w:proofErr w:type="spellEnd"/>
-      <w:r>
-        <w:t xml:space="preserve"> i </w:t>
-      </w:r>
-      <w:proofErr w:type="spellStart"/>
-      <w:r>
-        <w:t>instal·lacions</w:t>
-      </w:r>
-      <w:proofErr w:type="spellEnd"/>
-      <w:r>
-        <w:t xml:space="preserve"> esportives (</w:t>
-      </w:r>
-      <w:proofErr w:type="spellStart"/>
-      <w:r>
-        <w:t>com</w:t>
-      </w:r>
-      <w:proofErr w:type="spellEnd"/>
-      <w:r>
-        <w:t xml:space="preserve"> pistes de </w:t>
-      </w:r>
-      <w:proofErr w:type="spellStart"/>
-      <w:r>
-        <w:t>pàdel</w:t>
-      </w:r>
-      <w:proofErr w:type="spellEnd"/>
-      <w:r>
-        <w:t>, públiques o privades)</w:t>
-      </w:r>
-      <w:r>
-        <w:t xml:space="preserve">. </w:t>
-      </w:r>
-      <w:r>
-        <w:t xml:space="preserve">La idea </w:t>
-      </w:r>
-      <w:proofErr w:type="spellStart"/>
-      <w:r>
-        <w:t>és</w:t>
-      </w:r>
-      <w:proofErr w:type="spellEnd"/>
-      <w:r>
-        <w:t xml:space="preserve"> facilitar que </w:t>
-      </w:r>
-      <w:proofErr w:type="spellStart"/>
-      <w:r>
-        <w:t>qualsevol</w:t>
-      </w:r>
-      <w:proofErr w:type="spellEnd"/>
-      <w:r>
-        <w:t xml:space="preserve"> persona que </w:t>
-      </w:r>
-      <w:proofErr w:type="spellStart"/>
-      <w:r>
-        <w:t>vulga</w:t>
-      </w:r>
-      <w:proofErr w:type="spellEnd"/>
-      <w:r>
-        <w:t xml:space="preserve"> </w:t>
-      </w:r>
-      <w:proofErr w:type="spellStart"/>
-      <w:r>
-        <w:t>començar</w:t>
-      </w:r>
-      <w:proofErr w:type="spellEnd"/>
-      <w:r>
-        <w:t xml:space="preserve"> a entrenar o </w:t>
-      </w:r>
-      <w:proofErr w:type="spellStart"/>
-      <w:r>
-        <w:t>millorar</w:t>
-      </w:r>
-      <w:proofErr w:type="spellEnd"/>
-      <w:r>
-        <w:t xml:space="preserve"> la </w:t>
-      </w:r>
-      <w:proofErr w:type="spellStart"/>
-      <w:r>
-        <w:t>seua</w:t>
-      </w:r>
-      <w:proofErr w:type="spellEnd"/>
-      <w:r>
-        <w:t xml:space="preserve"> </w:t>
-      </w:r>
-      <w:proofErr w:type="spellStart"/>
-      <w:r>
-        <w:t>pràctica</w:t>
-      </w:r>
-      <w:proofErr w:type="spellEnd"/>
-      <w:r>
-        <w:t xml:space="preserve"> tinga tota la </w:t>
-      </w:r>
-      <w:proofErr w:type="spellStart"/>
-      <w:r>
-        <w:t>informació</w:t>
-      </w:r>
-      <w:proofErr w:type="spellEnd"/>
-      <w:r>
-        <w:t xml:space="preserve"> ordenada en un sol </w:t>
-      </w:r>
-      <w:proofErr w:type="spellStart"/>
-      <w:r>
-        <w:t>lloc</w:t>
-      </w:r>
-      <w:proofErr w:type="spellEnd"/>
-      <w:r>
-        <w:t>.</w:t>
-      </w:r>
-    </w:p>
-    <w:p/>
-    <w:p>
-      <w:r>
-        <w:rPr>
-          <w:b/>
-          <w:bCs/>
-        </w:rPr>
-        <w:t>Extracto</w:t>
-      </w:r>
-      <w:r>
-        <w:rPr>
-          <w:b/>
-          <w:bCs/>
-        </w:rPr>
-        <w:t xml:space="preserve"> (ES)</w:t>
-      </w:r>
-      <w:r>
-        <w:br/>
-        <w:t xml:space="preserve">Este proyecto consiste en una aplicación web pensada para guiar a las personas en la práctica deportiva con más autonomía. </w:t>
-      </w:r>
-    </w:p>
-    <w:p>
-      <w:r>
-        <w:t>La app incluirá rutinas básicas de entrenamiento según el objetivo del usuario, un buscador de gimnasios e instalaciones deportivas (como pistas de pádel, públicas o privadas)</w:t>
-      </w:r>
-      <w:r>
-        <w:t xml:space="preserve">. </w:t>
-      </w:r>
-      <w:r>
-        <w:t>La idea es facilitar que cualquier persona que quiera empezar a entrenar o mejorar su práctica tenga todo organizado en un mismo sitio.</w:t>
-      </w:r>
-    </w:p>
-    <w:p>
-      <w:pPr>
-        <w:spacing w:line="278" w:lineRule="auto"/>
-        <w:jc w:val="left"/>
-      </w:pPr>
-      <w:r>
-        <w:br w:type="page"/>
-      </w:r>
-    </w:p>
-    <w:p>
-      <w:pPr>
-        <w:rPr>
-          <w:b/>
-          <w:bCs/>
-          <w:sz w:val="32"/>
-          <w:szCs w:val="32"/>
-        </w:rPr>
-      </w:pPr>
-      <w:proofErr w:type="spellStart"/>
-      <w:r>
-        <w:rPr>
-          <w:b/>
-          <w:bCs/>
-          <w:sz w:val="32"/>
-          <w:szCs w:val="32"/>
-        </w:rPr>
-        <w:lastRenderedPageBreak/>
-        <w:t>Keywords</w:t>
-      </w:r>
-      <w:proofErr w:type="spellEnd"/>
-      <w:r>
-        <w:rPr>
-          <w:b/>
-          <w:bCs/>
-          <w:sz w:val="32"/>
-          <w:szCs w:val="32"/>
-        </w:rPr>
-        <w:t>/</w:t>
-      </w:r>
-      <w:proofErr w:type="spellStart"/>
-      <w:r>
-        <w:rPr>
-          <w:b/>
-          <w:bCs/>
-          <w:sz w:val="32"/>
-          <w:szCs w:val="32"/>
-        </w:rPr>
-        <w:t>Paraules</w:t>
-      </w:r>
-      <w:proofErr w:type="spellEnd"/>
-      <w:r>
-        <w:rPr>
-          <w:b/>
-          <w:bCs/>
-          <w:sz w:val="32"/>
-          <w:szCs w:val="32"/>
-        </w:rPr>
-        <w:t xml:space="preserve"> Clau/Palabras clave</w:t>
-      </w:r>
-    </w:p>
-    <w:p>
-      <w:pPr>
-        <w:rPr>
-          <w:b/>
-          <w:bCs/>
-        </w:rPr>
-      </w:pPr>
-      <w:proofErr w:type="spellStart"/>
-      <w:r>
-        <w:rPr>
-          <w:b/>
-          <w:bCs/>
-        </w:rPr>
-        <w:t>Keywords</w:t>
-      </w:r>
-      <w:proofErr w:type="spellEnd"/>
-      <w:r>
-        <w:rPr>
-          <w:b/>
-          <w:bCs/>
-        </w:rPr>
-        <w:t xml:space="preserve"> (EN)</w:t>
-      </w:r>
-    </w:p>
-    <w:p>
-      <w:pPr>
+        <w:t xml:space="preserve">yms; </w:t>
+      </w:r>
+      <w:r>
         <w:rPr>
           <w:lang w:val="en-US"/>
         </w:rPr>
-      </w:pPr>
+        <w:t>S</w:t>
+      </w:r>
       <w:r>
         <w:rPr>
           <w:lang w:val="en-US"/>
         </w:rPr>
-        <w:t>S</w:t>
+        <w:t xml:space="preserve">ports </w:t>
       </w:r>
       <w:r>
         <w:rPr>
           <w:lang w:val="en-US"/>
         </w:rPr>
-        <w:t xml:space="preserve">ports app; </w:t>
+        <w:t xml:space="preserve">Facilities; </w:t>
       </w:r>
       <w:r>
         <w:rPr>
           <w:lang w:val="en-US"/>
         </w:rPr>
-        <w:t>T</w:t>
+        <w:t>Autonomy</w:t>
       </w:r>
       <w:r>
         <w:rPr>
           <w:lang w:val="en-US"/>
         </w:rPr>
-        <w:t xml:space="preserve">raining routines; </w:t>
-      </w:r>
-      <w:r>
+        <w:t>; Recommendations.</w:t>
+      </w:r>
+    </w:p>
+    <w:p>
+      <w:pPr>
         <w:rPr>
           <w:lang w:val="en-US"/>
         </w:rPr>
+      </w:pPr>
+    </w:p>
+    <w:p>
+      <w:pPr>
+        <w:rPr>
+          <w:b/>
+          <w:bCs/>
+        </w:rPr>
+      </w:pPr>
+      <w:r>
+        <w:rPr>
+          <w:b/>
+          <w:bCs/>
+        </w:rPr>
+        <w:t>Paraules clau (VA)</w:t>
+      </w:r>
+    </w:p>
+    <w:p>
+      <w:r>
+        <w:t>A</w:t>
+      </w:r>
+      <w:r>
+        <w:t xml:space="preserve">plicació esportiva; </w:t>
+      </w:r>
+      <w:r>
+        <w:t>R</w:t>
+      </w:r>
+      <w:r>
+        <w:t xml:space="preserve">utines d’entrenament; </w:t>
+      </w:r>
+      <w:r>
         <w:t>G</w:t>
       </w:r>
       <w:r>
-        <w:rPr>
-          <w:lang w:val="en-US"/>
-        </w:rPr>
-        <w:t xml:space="preserve">yms; </w:t>
-      </w:r>
-      <w:r>
-        <w:rPr>
-          <w:lang w:val="en-US"/>
-        </w:rPr>
-        <w:t>S</w:t>
-      </w:r>
-      <w:r>
-        <w:rPr>
-          <w:lang w:val="en-US"/>
-        </w:rPr>
-        <w:t xml:space="preserve">ports </w:t>
-      </w:r>
-      <w:r>
-        <w:rPr>
-          <w:lang w:val="en-US"/>
-        </w:rPr>
-        <w:t xml:space="preserve">Facilities; </w:t>
-      </w:r>
-      <w:r>
-        <w:rPr>
-          <w:lang w:val="en-US"/>
-        </w:rPr>
-        <w:t>Autonomy</w:t>
-      </w:r>
-      <w:r>
-        <w:rPr>
-          <w:lang w:val="en-US"/>
-        </w:rPr>
-        <w:t>; Recommendations.</w:t>
-      </w:r>
-    </w:p>
-    <w:p>
-      <w:pPr>
-        <w:rPr>
-          <w:lang w:val="en-US"/>
-        </w:rPr>
-      </w:pPr>
-    </w:p>
-    <w:p>
-      <w:pPr>
-        <w:rPr>
-          <w:b/>
-          <w:bCs/>
-        </w:rPr>
-      </w:pPr>
-      <w:proofErr w:type="spellStart"/>
-      <w:r>
-        <w:rPr>
-          <w:b/>
-          <w:bCs/>
-        </w:rPr>
-        <w:t>Paraules</w:t>
-      </w:r>
-      <w:proofErr w:type="spellEnd"/>
-      <w:r>
-        <w:rPr>
-          <w:b/>
-          <w:bCs/>
-        </w:rPr>
-        <w:t xml:space="preserve"> </w:t>
-      </w:r>
-      <w:proofErr w:type="spellStart"/>
-      <w:r>
-        <w:rPr>
-          <w:b/>
-          <w:bCs/>
-        </w:rPr>
-        <w:t>clau</w:t>
-      </w:r>
-      <w:proofErr w:type="spellEnd"/>
-      <w:r>
-        <w:rPr>
-          <w:b/>
-          <w:bCs/>
-        </w:rPr>
-        <w:t xml:space="preserve"> (VA)</w:t>
-      </w:r>
-    </w:p>
-    <w:p>
-      <w:proofErr w:type="spellStart"/>
-      <w:r>
-        <w:t>A</w:t>
-      </w:r>
-      <w:r>
-        <w:t>plicació</w:t>
-      </w:r>
-      <w:proofErr w:type="spellEnd"/>
-      <w:r>
-        <w:t xml:space="preserve"> esportiva; </w:t>
-      </w:r>
-      <w:proofErr w:type="spellStart"/>
-      <w:r>
-        <w:t>R</w:t>
-      </w:r>
-      <w:r>
-        <w:t>utines</w:t>
-      </w:r>
-      <w:proofErr w:type="spellEnd"/>
-      <w:r>
-        <w:t xml:space="preserve"> </w:t>
-      </w:r>
-      <w:proofErr w:type="spellStart"/>
-      <w:r>
-        <w:t>d’entrenament</w:t>
-      </w:r>
-      <w:proofErr w:type="spellEnd"/>
-      <w:r>
-        <w:t xml:space="preserve">; </w:t>
-      </w:r>
-      <w:proofErr w:type="spellStart"/>
-      <w:r>
-        <w:t>G</w:t>
-      </w:r>
-      <w:r>
-        <w:t>imnasos</w:t>
-      </w:r>
-      <w:proofErr w:type="spellEnd"/>
-      <w:r>
-        <w:t xml:space="preserve">; </w:t>
-      </w:r>
-      <w:proofErr w:type="spellStart"/>
+        <w:t xml:space="preserve">imnasos; </w:t>
+      </w:r>
       <w:r>
         <w:t>I</w:t>
       </w:r>
       <w:r>
-        <w:t>nstal·lacions</w:t>
-      </w:r>
-      <w:proofErr w:type="spellEnd"/>
-      <w:r>
-        <w:t xml:space="preserve"> esportives;</w:t>
-      </w:r>
-      <w:r>
-        <w:t xml:space="preserve"> </w:t>
-      </w:r>
-      <w:proofErr w:type="spellStart"/>
-      <w:r>
-        <w:t>Autonomia</w:t>
-      </w:r>
-      <w:proofErr w:type="spellEnd"/>
-      <w:r>
-        <w:t xml:space="preserve">; </w:t>
-      </w:r>
-      <w:proofErr w:type="spellStart"/>
-      <w:r>
-        <w:t>Recomanacions</w:t>
-      </w:r>
-      <w:proofErr w:type="spellEnd"/>
-      <w:r>
-        <w:t>.</w:t>
+        <w:t>nstal·lacions esportives;</w:t>
+      </w:r>
+      <w:r>
+        <w:t xml:space="preserve"> Autonomia; Recomanacions.</w:t>
       </w:r>
     </w:p>
     <w:p/>
@@ -4987,41 +4628,13 @@
         </w:rPr>
         <w:t xml:space="preserve">, en el edificio </w:t>
       </w:r>
-      <w:proofErr w:type="gramStart"/>
       <w:r>
         <w:rPr>
           <w:rFonts w:cs="Arial"/>
           <w:b/>
           <w:bCs/>
         </w:rPr>
-        <w:t>Veles</w:t>
-      </w:r>
-      <w:proofErr w:type="gramEnd"/>
-      <w:r>
-        <w:rPr>
-          <w:rFonts w:cs="Arial"/>
-          <w:b/>
-          <w:bCs/>
-        </w:rPr>
-        <w:t xml:space="preserve"> e </w:t>
-      </w:r>
-      <w:proofErr w:type="spellStart"/>
-      <w:r>
-        <w:rPr>
-          <w:rFonts w:cs="Arial"/>
-          <w:b/>
-          <w:bCs/>
-        </w:rPr>
-        <w:t>Vents</w:t>
-      </w:r>
-      <w:proofErr w:type="spellEnd"/>
-      <w:r>
-        <w:rPr>
-          <w:rFonts w:cs="Arial"/>
-          <w:b/>
-          <w:bCs/>
-        </w:rPr>
-        <w:t xml:space="preserve"> (Moll de la Duana, s/n, 46024, Valencia)</w:t>
+        <w:t>Veles e Vents (Moll de la Duana, s/n, 46024, Valencia)</w:t>
       </w:r>
       <w:r>
         <w:rPr>
@@ -5181,52 +4794,14 @@
         </w:rPr>
         <w:t xml:space="preserve">En el entorno local, la competencia directa no es muy grande. Existen apps internacionales como </w:t>
       </w:r>
-      <w:proofErr w:type="spellStart"/>
       <w:r>
         <w:rPr>
           <w:rFonts w:cs="Arial"/>
           <w:b/>
           <w:bCs/>
         </w:rPr>
-        <w:t>Gympass</w:t>
-      </w:r>
-      <w:proofErr w:type="spellEnd"/>
-      <w:r>
-        <w:rPr>
-          <w:rFonts w:cs="Arial"/>
-          <w:b/>
-          <w:bCs/>
-        </w:rPr>
-        <w:t xml:space="preserve">, </w:t>
-      </w:r>
-      <w:proofErr w:type="spellStart"/>
-      <w:r>
-        <w:rPr>
-          <w:rFonts w:cs="Arial"/>
-          <w:b/>
-          <w:bCs/>
-        </w:rPr>
-        <w:t>Freeletics</w:t>
-      </w:r>
-      <w:proofErr w:type="spellEnd"/>
-      <w:r>
-        <w:rPr>
-          <w:rFonts w:cs="Arial"/>
-          <w:b/>
-          <w:bCs/>
-        </w:rPr>
-        <w:t xml:space="preserve"> o </w:t>
-      </w:r>
-      <w:proofErr w:type="spellStart"/>
-      <w:r>
-        <w:rPr>
-          <w:rFonts w:cs="Arial"/>
-          <w:b/>
-          <w:bCs/>
-        </w:rPr>
-        <w:t>MyFitnessPal</w:t>
-      </w:r>
-      <w:proofErr w:type="spellEnd"/>
+        <w:t>Gympass, Freeletics o MyFitnessPal</w:t>
+      </w:r>
       <w:r>
         <w:rPr>
           <w:rFonts w:cs="Arial"/>
@@ -5338,20 +4913,12 @@
         </w:rPr>
       </w:pPr>
       <w:bookmarkStart w:id="6" w:name="_Toc219506268"/>
-      <w:proofErr w:type="spellStart"/>
       <w:r>
         <w:rPr>
           <w:lang w:val="en-US"/>
         </w:rPr>
         <w:lastRenderedPageBreak/>
-        <w:t>Demanda</w:t>
-      </w:r>
-      <w:proofErr w:type="spellEnd"/>
-      <w:r>
-        <w:rPr>
-          <w:lang w:val="en-US"/>
-        </w:rPr>
-        <w:t xml:space="preserve"> / target</w:t>
+        <w:t>Demanda / target</w:t>
       </w:r>
       <w:bookmarkEnd w:id="6"/>
     </w:p>
@@ -5384,42 +4951,14 @@
           <w:bCs/>
           <w:lang w:val="en-US"/>
         </w:rPr>
-        <w:t xml:space="preserve"> – </w:t>
-      </w:r>
-      <w:proofErr w:type="spellStart"/>
+        <w:t xml:space="preserve"> – Perfil Inicial</w:t>
+      </w:r>
       <w:r>
         <w:rPr>
           <w:b/>
           <w:bCs/>
           <w:lang w:val="en-US"/>
         </w:rPr>
-        <w:t>Perfil</w:t>
-      </w:r>
-      <w:proofErr w:type="spellEnd"/>
-      <w:r>
-        <w:rPr>
-          <w:b/>
-          <w:bCs/>
-          <w:lang w:val="en-US"/>
-        </w:rPr>
-        <w:t xml:space="preserve"> </w:t>
-      </w:r>
-      <w:proofErr w:type="spellStart"/>
-      <w:r>
-        <w:rPr>
-          <w:b/>
-          <w:bCs/>
-          <w:lang w:val="en-US"/>
-        </w:rPr>
-        <w:t>Inicial</w:t>
-      </w:r>
-      <w:proofErr w:type="spellEnd"/>
-      <w:r>
-        <w:rPr>
-          <w:b/>
-          <w:bCs/>
-          <w:lang w:val="en-US"/>
-        </w:rPr>
         <w:t>:</w:t>
       </w:r>
     </w:p>
@@ -5464,17 +5003,8 @@
           <w:b/>
           <w:bCs/>
         </w:rPr>
-        <w:t xml:space="preserve">playas de la Malvarrosa y la </w:t>
-      </w:r>
-      <w:proofErr w:type="spellStart"/>
-      <w:r>
-        <w:rPr>
-          <w:b/>
-          <w:bCs/>
-        </w:rPr>
-        <w:t>Patacona</w:t>
-      </w:r>
-      <w:proofErr w:type="spellEnd"/>
+        <w:t>playas de la Malvarrosa y la Patacona</w:t>
+      </w:r>
       <w:r>
         <w:t xml:space="preserve">, o parques y zonas deportivas de su barrio. Utiliza redes sociales como </w:t>
       </w:r>
@@ -5486,15 +5016,7 @@
         <w:t>YouTube, Instagram o TikTok</w:t>
       </w:r>
       <w:r>
-        <w:t xml:space="preserve"> para buscar rutinas, y Google </w:t>
-      </w:r>
-      <w:proofErr w:type="spellStart"/>
-      <w:r>
-        <w:t>Maps</w:t>
-      </w:r>
-      <w:proofErr w:type="spellEnd"/>
-      <w:r>
-        <w:t xml:space="preserve"> para localizar gimnasios o pistas, pero la información está muy dispersa y poco adaptada a lo que necesita. </w:t>
+        <w:t xml:space="preserve"> para buscar rutinas, y Google Maps para localizar gimnasios o pistas, pero la información está muy dispersa y poco adaptada a lo que necesita. </w:t>
       </w:r>
     </w:p>
     <w:p>
@@ -5656,23 +5178,7 @@
           <w:b/>
           <w:bCs/>
         </w:rPr>
-        <w:t xml:space="preserve">. Lienzo Early </w:t>
-      </w:r>
-      <w:proofErr w:type="spellStart"/>
-      <w:r>
-        <w:rPr>
-          <w:b/>
-          <w:bCs/>
-        </w:rPr>
-        <w:t>Adopter</w:t>
-      </w:r>
-      <w:proofErr w:type="spellEnd"/>
-      <w:r>
-        <w:rPr>
-          <w:b/>
-          <w:bCs/>
-        </w:rPr>
-        <w:t xml:space="preserve"> (Digital-FIT)</w:t>
+        <w:t>. Lienzo Early Adopter (Digital-FIT)</w:t>
       </w:r>
       <w:bookmarkEnd w:id="7"/>
     </w:p>
@@ -5721,13 +5227,8 @@
         <w:t>Como</w:t>
       </w:r>
       <w:r>
-        <w:t xml:space="preserve"> el Jardín del Turia o las playas de la Malvarrosa y la </w:t>
-      </w:r>
-      <w:proofErr w:type="spellStart"/>
-      <w:r>
-        <w:t>Patacona</w:t>
-      </w:r>
-      <w:proofErr w:type="spellEnd"/>
+        <w:t xml:space="preserve"> el Jardín del Turia o las playas de la Malvarrosa y la Patacona</w:t>
+      </w:r>
       <w:r>
         <w:t xml:space="preserve">, </w:t>
       </w:r>
@@ -5899,14 +5400,9 @@
       <w:bookmarkStart w:id="9" w:name="_Toc219506270"/>
       <w:r>
         <w:lastRenderedPageBreak/>
-        <w:t xml:space="preserve">Encuesta al Early </w:t>
-      </w:r>
-      <w:proofErr w:type="spellStart"/>
-      <w:r>
-        <w:t>Adopter</w:t>
+        <w:t>Encuesta al Early Adopter</w:t>
       </w:r>
       <w:bookmarkEnd w:id="9"/>
-      <w:proofErr w:type="spellEnd"/>
     </w:p>
     <w:p>
       <w:pPr>
@@ -5972,14 +5468,27 @@
       <w:r>
         <w:t xml:space="preserve">Figura </w:t>
       </w:r>
-      <w:fldSimple w:instr=" SEQ Figura \* ARABIC ">
-        <w:r>
-          <w:rPr>
-            <w:noProof/>
-          </w:rPr>
-          <w:t>2</w:t>
-        </w:r>
-      </w:fldSimple>
+      <w:r>
+        <w:fldChar w:fldCharType="begin"/>
+      </w:r>
+      <w:r>
+        <w:instrText xml:space="preserve"> SEQ Figura \* ARABIC </w:instrText>
+      </w:r>
+      <w:r>
+        <w:fldChar w:fldCharType="separate"/>
+      </w:r>
+      <w:r>
+        <w:rPr>
+          <w:noProof/>
+        </w:rPr>
+        <w:t>2</w:t>
+      </w:r>
+      <w:r>
+        <w:rPr>
+          <w:noProof/>
+        </w:rPr>
+        <w:fldChar w:fldCharType="end"/>
+      </w:r>
       <w:r>
         <w:t>. GrafEA_01</w:t>
       </w:r>
@@ -6064,14 +5573,27 @@
       <w:r>
         <w:t xml:space="preserve">Figura </w:t>
       </w:r>
-      <w:fldSimple w:instr=" SEQ Figura \* ARABIC ">
-        <w:r>
-          <w:rPr>
-            <w:noProof/>
-          </w:rPr>
-          <w:t>3</w:t>
-        </w:r>
-      </w:fldSimple>
+      <w:r>
+        <w:fldChar w:fldCharType="begin"/>
+      </w:r>
+      <w:r>
+        <w:instrText xml:space="preserve"> SEQ Figura \* ARABIC </w:instrText>
+      </w:r>
+      <w:r>
+        <w:fldChar w:fldCharType="separate"/>
+      </w:r>
+      <w:r>
+        <w:rPr>
+          <w:noProof/>
+        </w:rPr>
+        <w:t>3</w:t>
+      </w:r>
+      <w:r>
+        <w:rPr>
+          <w:noProof/>
+        </w:rPr>
+        <w:fldChar w:fldCharType="end"/>
+      </w:r>
       <w:r>
         <w:t>. GrafEA_02</w:t>
       </w:r>
@@ -6167,14 +5689,27 @@
         <w:lastRenderedPageBreak/>
         <w:t xml:space="preserve">Figura </w:t>
       </w:r>
-      <w:fldSimple w:instr=" SEQ Figura \* ARABIC ">
-        <w:r>
-          <w:rPr>
-            <w:noProof/>
-          </w:rPr>
-          <w:t>4</w:t>
-        </w:r>
-      </w:fldSimple>
+      <w:r>
+        <w:fldChar w:fldCharType="begin"/>
+      </w:r>
+      <w:r>
+        <w:instrText xml:space="preserve"> SEQ Figura \* ARABIC </w:instrText>
+      </w:r>
+      <w:r>
+        <w:fldChar w:fldCharType="separate"/>
+      </w:r>
+      <w:r>
+        <w:rPr>
+          <w:noProof/>
+        </w:rPr>
+        <w:t>4</w:t>
+      </w:r>
+      <w:r>
+        <w:rPr>
+          <w:noProof/>
+        </w:rPr>
+        <w:fldChar w:fldCharType="end"/>
+      </w:r>
       <w:r>
         <w:t>. GrafEA_03</w:t>
       </w:r>
@@ -6248,14 +5783,27 @@
       <w:r>
         <w:t xml:space="preserve">Figura </w:t>
       </w:r>
-      <w:fldSimple w:instr=" SEQ Figura \* ARABIC ">
-        <w:r>
-          <w:rPr>
-            <w:noProof/>
-          </w:rPr>
-          <w:t>5</w:t>
-        </w:r>
-      </w:fldSimple>
+      <w:r>
+        <w:fldChar w:fldCharType="begin"/>
+      </w:r>
+      <w:r>
+        <w:instrText xml:space="preserve"> SEQ Figura \* ARABIC </w:instrText>
+      </w:r>
+      <w:r>
+        <w:fldChar w:fldCharType="separate"/>
+      </w:r>
+      <w:r>
+        <w:rPr>
+          <w:noProof/>
+        </w:rPr>
+        <w:t>5</w:t>
+      </w:r>
+      <w:r>
+        <w:rPr>
+          <w:noProof/>
+        </w:rPr>
+        <w:fldChar w:fldCharType="end"/>
+      </w:r>
       <w:r>
         <w:t>. GrafEA_04</w:t>
       </w:r>
@@ -6329,14 +5877,27 @@
       <w:r>
         <w:t xml:space="preserve">Figura </w:t>
       </w:r>
-      <w:fldSimple w:instr=" SEQ Figura \* ARABIC ">
-        <w:r>
-          <w:rPr>
-            <w:noProof/>
-          </w:rPr>
-          <w:t>6</w:t>
-        </w:r>
-      </w:fldSimple>
+      <w:r>
+        <w:fldChar w:fldCharType="begin"/>
+      </w:r>
+      <w:r>
+        <w:instrText xml:space="preserve"> SEQ Figura \* ARABIC </w:instrText>
+      </w:r>
+      <w:r>
+        <w:fldChar w:fldCharType="separate"/>
+      </w:r>
+      <w:r>
+        <w:rPr>
+          <w:noProof/>
+        </w:rPr>
+        <w:t>6</w:t>
+      </w:r>
+      <w:r>
+        <w:rPr>
+          <w:noProof/>
+        </w:rPr>
+        <w:fldChar w:fldCharType="end"/>
+      </w:r>
       <w:r>
         <w:t>. GrafEA_05</w:t>
       </w:r>
@@ -6421,14 +5982,27 @@
         <w:lastRenderedPageBreak/>
         <w:t xml:space="preserve">Figura </w:t>
       </w:r>
-      <w:fldSimple w:instr=" SEQ Figura \* ARABIC ">
-        <w:r>
-          <w:rPr>
-            <w:noProof/>
-          </w:rPr>
-          <w:t>7</w:t>
-        </w:r>
-      </w:fldSimple>
+      <w:r>
+        <w:fldChar w:fldCharType="begin"/>
+      </w:r>
+      <w:r>
+        <w:instrText xml:space="preserve"> SEQ Figura \* ARABIC </w:instrText>
+      </w:r>
+      <w:r>
+        <w:fldChar w:fldCharType="separate"/>
+      </w:r>
+      <w:r>
+        <w:rPr>
+          <w:noProof/>
+        </w:rPr>
+        <w:t>7</w:t>
+      </w:r>
+      <w:r>
+        <w:rPr>
+          <w:noProof/>
+        </w:rPr>
+        <w:fldChar w:fldCharType="end"/>
+      </w:r>
       <w:r>
         <w:t>. GrafEA_06</w:t>
       </w:r>
@@ -6502,14 +6076,27 @@
       <w:r>
         <w:t xml:space="preserve">Figura </w:t>
       </w:r>
-      <w:fldSimple w:instr=" SEQ Figura \* ARABIC ">
-        <w:r>
-          <w:rPr>
-            <w:noProof/>
-          </w:rPr>
-          <w:t>8</w:t>
-        </w:r>
-      </w:fldSimple>
+      <w:r>
+        <w:fldChar w:fldCharType="begin"/>
+      </w:r>
+      <w:r>
+        <w:instrText xml:space="preserve"> SEQ Figura \* ARABIC </w:instrText>
+      </w:r>
+      <w:r>
+        <w:fldChar w:fldCharType="separate"/>
+      </w:r>
+      <w:r>
+        <w:rPr>
+          <w:noProof/>
+        </w:rPr>
+        <w:t>8</w:t>
+      </w:r>
+      <w:r>
+        <w:rPr>
+          <w:noProof/>
+        </w:rPr>
+        <w:fldChar w:fldCharType="end"/>
+      </w:r>
       <w:r>
         <w:t>. GrafEA_07</w:t>
       </w:r>
@@ -7065,14 +6652,27 @@
       <w:r>
         <w:t xml:space="preserve">Tabla </w:t>
       </w:r>
-      <w:fldSimple w:instr=" SEQ Tabla \* ARABIC ">
-        <w:r>
-          <w:rPr>
-            <w:noProof/>
-          </w:rPr>
-          <w:t>1</w:t>
-        </w:r>
-      </w:fldSimple>
+      <w:r>
+        <w:fldChar w:fldCharType="begin"/>
+      </w:r>
+      <w:r>
+        <w:instrText xml:space="preserve"> SEQ Tabla \* ARABIC </w:instrText>
+      </w:r>
+      <w:r>
+        <w:fldChar w:fldCharType="separate"/>
+      </w:r>
+      <w:r>
+        <w:rPr>
+          <w:noProof/>
+        </w:rPr>
+        <w:t>1</w:t>
+      </w:r>
+      <w:r>
+        <w:rPr>
+          <w:noProof/>
+        </w:rPr>
+        <w:fldChar w:fldCharType="end"/>
+      </w:r>
       <w:r>
         <w:t>.DAFO</w:t>
       </w:r>
@@ -7522,14 +7122,27 @@
       <w:r>
         <w:t xml:space="preserve">Tabla </w:t>
       </w:r>
-      <w:fldSimple w:instr=" SEQ Tabla \* ARABIC ">
-        <w:r>
-          <w:rPr>
-            <w:noProof/>
-          </w:rPr>
-          <w:t>2</w:t>
-        </w:r>
-      </w:fldSimple>
+      <w:r>
+        <w:fldChar w:fldCharType="begin"/>
+      </w:r>
+      <w:r>
+        <w:instrText xml:space="preserve"> SEQ Tabla \* ARABIC </w:instrText>
+      </w:r>
+      <w:r>
+        <w:fldChar w:fldCharType="separate"/>
+      </w:r>
+      <w:r>
+        <w:rPr>
+          <w:noProof/>
+        </w:rPr>
+        <w:t>2</w:t>
+      </w:r>
+      <w:r>
+        <w:rPr>
+          <w:noProof/>
+        </w:rPr>
+        <w:fldChar w:fldCharType="end"/>
+      </w:r>
       <w:r>
         <w:t>.CAME</w:t>
       </w:r>
@@ -8342,14 +7955,27 @@
       <w:r>
         <w:t xml:space="preserve">Figura </w:t>
       </w:r>
-      <w:fldSimple w:instr=" SEQ Figura \* ARABIC ">
-        <w:r>
-          <w:rPr>
-            <w:noProof/>
-          </w:rPr>
-          <w:t>9</w:t>
-        </w:r>
-      </w:fldSimple>
+      <w:r>
+        <w:fldChar w:fldCharType="begin"/>
+      </w:r>
+      <w:r>
+        <w:instrText xml:space="preserve"> SEQ Figura \* ARABIC </w:instrText>
+      </w:r>
+      <w:r>
+        <w:fldChar w:fldCharType="separate"/>
+      </w:r>
+      <w:r>
+        <w:rPr>
+          <w:noProof/>
+        </w:rPr>
+        <w:t>9</w:t>
+      </w:r>
+      <w:r>
+        <w:rPr>
+          <w:noProof/>
+        </w:rPr>
+        <w:fldChar w:fldCharType="end"/>
+      </w:r>
       <w:r>
         <w:t>.Logotipo / Isotipo</w:t>
       </w:r>
@@ -9254,14 +8880,27 @@
       <w:r>
         <w:t xml:space="preserve">Figura </w:t>
       </w:r>
-      <w:fldSimple w:instr=" SEQ Figura \* ARABIC ">
-        <w:r>
-          <w:rPr>
-            <w:noProof/>
-          </w:rPr>
-          <w:t>10</w:t>
-        </w:r>
-      </w:fldSimple>
+      <w:r>
+        <w:fldChar w:fldCharType="begin"/>
+      </w:r>
+      <w:r>
+        <w:instrText xml:space="preserve"> SEQ Figura \* ARABIC </w:instrText>
+      </w:r>
+      <w:r>
+        <w:fldChar w:fldCharType="separate"/>
+      </w:r>
+      <w:r>
+        <w:rPr>
+          <w:noProof/>
+        </w:rPr>
+        <w:t>10</w:t>
+      </w:r>
+      <w:r>
+        <w:rPr>
+          <w:noProof/>
+        </w:rPr>
+        <w:fldChar w:fldCharType="end"/>
+      </w:r>
       <w:r>
         <w:t>.ODS</w:t>
       </w:r>
@@ -9307,14 +8946,27 @@
       <w:r>
         <w:t xml:space="preserve">Figura </w:t>
       </w:r>
-      <w:fldSimple w:instr=" SEQ Figura \* ARABIC ">
-        <w:r>
-          <w:rPr>
-            <w:noProof/>
-          </w:rPr>
-          <w:t>11</w:t>
-        </w:r>
-      </w:fldSimple>
+      <w:r>
+        <w:fldChar w:fldCharType="begin"/>
+      </w:r>
+      <w:r>
+        <w:instrText xml:space="preserve"> SEQ Figura \* ARABIC </w:instrText>
+      </w:r>
+      <w:r>
+        <w:fldChar w:fldCharType="separate"/>
+      </w:r>
+      <w:r>
+        <w:rPr>
+          <w:noProof/>
+        </w:rPr>
+        <w:t>11</w:t>
+      </w:r>
+      <w:r>
+        <w:rPr>
+          <w:noProof/>
+        </w:rPr>
+        <w:fldChar w:fldCharType="end"/>
+      </w:r>
       <w:r>
         <w:t>.-Mockup Login</w:t>
       </w:r>
@@ -9413,14 +9065,27 @@
         <w:lastRenderedPageBreak/>
         <w:t xml:space="preserve">Figura </w:t>
       </w:r>
-      <w:fldSimple w:instr=" SEQ Figura \* ARABIC ">
-        <w:r>
-          <w:rPr>
-            <w:noProof/>
-          </w:rPr>
-          <w:t>12</w:t>
-        </w:r>
-      </w:fldSimple>
+      <w:r>
+        <w:fldChar w:fldCharType="begin"/>
+      </w:r>
+      <w:r>
+        <w:instrText xml:space="preserve"> SEQ Figura \* ARABIC </w:instrText>
+      </w:r>
+      <w:r>
+        <w:fldChar w:fldCharType="separate"/>
+      </w:r>
+      <w:r>
+        <w:rPr>
+          <w:noProof/>
+        </w:rPr>
+        <w:t>12</w:t>
+      </w:r>
+      <w:r>
+        <w:rPr>
+          <w:noProof/>
+        </w:rPr>
+        <w:fldChar w:fldCharType="end"/>
+      </w:r>
       <w:r>
         <w:t>.-Mockup Pag Inicio</w:t>
       </w:r>
@@ -9511,14 +9176,27 @@
         <w:lastRenderedPageBreak/>
         <w:t xml:space="preserve">Figura </w:t>
       </w:r>
-      <w:fldSimple w:instr=" SEQ Figura \* ARABIC ">
-        <w:r>
-          <w:rPr>
-            <w:noProof/>
-          </w:rPr>
-          <w:t>13</w:t>
-        </w:r>
-      </w:fldSimple>
+      <w:r>
+        <w:fldChar w:fldCharType="begin"/>
+      </w:r>
+      <w:r>
+        <w:instrText xml:space="preserve"> SEQ Figura \* ARABIC </w:instrText>
+      </w:r>
+      <w:r>
+        <w:fldChar w:fldCharType="separate"/>
+      </w:r>
+      <w:r>
+        <w:rPr>
+          <w:noProof/>
+        </w:rPr>
+        <w:t>13</w:t>
+      </w:r>
+      <w:r>
+        <w:rPr>
+          <w:noProof/>
+        </w:rPr>
+        <w:fldChar w:fldCharType="end"/>
+      </w:r>
       <w:r>
         <w:t>.-Mockup Lista Centros</w:t>
       </w:r>
@@ -9607,14 +9285,27 @@
         <w:lastRenderedPageBreak/>
         <w:t xml:space="preserve">Figura </w:t>
       </w:r>
-      <w:fldSimple w:instr=" SEQ Figura \* ARABIC ">
-        <w:r>
-          <w:rPr>
-            <w:noProof/>
-          </w:rPr>
-          <w:t>14</w:t>
-        </w:r>
-      </w:fldSimple>
+      <w:r>
+        <w:fldChar w:fldCharType="begin"/>
+      </w:r>
+      <w:r>
+        <w:instrText xml:space="preserve"> SEQ Figura \* ARABIC </w:instrText>
+      </w:r>
+      <w:r>
+        <w:fldChar w:fldCharType="separate"/>
+      </w:r>
+      <w:r>
+        <w:rPr>
+          <w:noProof/>
+        </w:rPr>
+        <w:t>14</w:t>
+      </w:r>
+      <w:r>
+        <w:rPr>
+          <w:noProof/>
+        </w:rPr>
+        <w:fldChar w:fldCharType="end"/>
+      </w:r>
       <w:r>
         <w:t>.-Mockup Lista Entrenamientos</w:t>
       </w:r>
@@ -9731,14 +9422,27 @@
       <w:r>
         <w:t xml:space="preserve">Figura </w:t>
       </w:r>
-      <w:fldSimple w:instr=" SEQ Figura \* ARABIC ">
-        <w:r>
-          <w:rPr>
-            <w:noProof/>
-          </w:rPr>
-          <w:t>15</w:t>
-        </w:r>
-      </w:fldSimple>
+      <w:r>
+        <w:fldChar w:fldCharType="begin"/>
+      </w:r>
+      <w:r>
+        <w:instrText xml:space="preserve"> SEQ Figura \* ARABIC </w:instrText>
+      </w:r>
+      <w:r>
+        <w:fldChar w:fldCharType="separate"/>
+      </w:r>
+      <w:r>
+        <w:rPr>
+          <w:noProof/>
+        </w:rPr>
+        <w:t>15</w:t>
+      </w:r>
+      <w:r>
+        <w:rPr>
+          <w:noProof/>
+        </w:rPr>
+        <w:fldChar w:fldCharType="end"/>
+      </w:r>
       <w:r>
         <w:t>.-Diseño BD V1</w:t>
       </w:r>
@@ -9825,15 +9529,7 @@
         <w:t>centros_privados:</w:t>
       </w:r>
       <w:r>
-        <w:t xml:space="preserve"> recoge información de los gimnasios y centros deportivos privados, incluyendo su dirección, tipo de centro y coordenadas (latitud y longitud) para poder localizarlo fácilmente en Google </w:t>
-      </w:r>
-      <w:proofErr w:type="spellStart"/>
-      <w:r>
-        <w:t>Maps</w:t>
-      </w:r>
-      <w:proofErr w:type="spellEnd"/>
-      <w:r>
-        <w:t>.</w:t>
+        <w:t xml:space="preserve"> recoge información de los gimnasios y centros deportivos privados, incluyendo su dirección, tipo de centro y coordenadas (latitud y longitud) para poder localizarlo fácilmente en Google Maps.</w:t>
       </w:r>
     </w:p>
     <w:p>
@@ -9973,14 +9669,27 @@
       <w:r>
         <w:t xml:space="preserve">Figura </w:t>
       </w:r>
-      <w:fldSimple w:instr=" SEQ Figura \* ARABIC ">
-        <w:r>
-          <w:rPr>
-            <w:noProof/>
-          </w:rPr>
-          <w:t>16</w:t>
-        </w:r>
-      </w:fldSimple>
+      <w:r>
+        <w:fldChar w:fldCharType="begin"/>
+      </w:r>
+      <w:r>
+        <w:instrText xml:space="preserve"> SEQ Figura \* ARABIC </w:instrText>
+      </w:r>
+      <w:r>
+        <w:fldChar w:fldCharType="separate"/>
+      </w:r>
+      <w:r>
+        <w:rPr>
+          <w:noProof/>
+        </w:rPr>
+        <w:t>16</w:t>
+      </w:r>
+      <w:r>
+        <w:rPr>
+          <w:noProof/>
+        </w:rPr>
+        <w:fldChar w:fldCharType="end"/>
+      </w:r>
       <w:r>
         <w:t>.-Organigrama Empresa</w:t>
       </w:r>
@@ -10437,15 +10146,7 @@
     </w:p>
     <w:p>
       <w:r>
-        <w:t xml:space="preserve">Lo que he visto es que la mayoría utiliza varias herramientas por separado: rutinas en YouTube o Instagram, gimnasios en Google </w:t>
-      </w:r>
-      <w:proofErr w:type="spellStart"/>
-      <w:r>
-        <w:t>Maps</w:t>
-      </w:r>
-      <w:proofErr w:type="spellEnd"/>
-      <w:r>
-        <w:t>, opiniones sueltas en foros y, en el caso de entrenar al aire libre, suelen ir directamente a zonas conocidas del Turia sin saber si realmente son adecuadas para su deporte. Además, muchos terminan apuntando sus entrenamientos en notas del móvil o en apps que no están pensadas para eso.</w:t>
+        <w:t>Lo que he visto es que la mayoría utiliza varias herramientas por separado: rutinas en YouTube o Instagram, gimnasios en Google Maps, opiniones sueltas en foros y, en el caso de entrenar al aire libre, suelen ir directamente a zonas conocidas del Turia sin saber si realmente son adecuadas para su deporte. Además, muchos terminan apuntando sus entrenamientos en notas del móvil o en apps que no están pensadas para eso.</w:t>
       </w:r>
     </w:p>
     <w:p>
@@ -10559,15 +10260,7 @@
         </w:numPr>
       </w:pPr>
       <w:r>
-        <w:t xml:space="preserve">Mostrar la información de cada centro o zona con un botón que permita abrir su ubicación directamente en Google </w:t>
-      </w:r>
-      <w:proofErr w:type="spellStart"/>
-      <w:r>
-        <w:t>Maps</w:t>
-      </w:r>
-      <w:proofErr w:type="spellEnd"/>
-      <w:r>
-        <w:t>.</w:t>
+        <w:t>Mostrar la información de cada centro o zona con un botón que permita abrir su ubicación directamente en Google Maps.</w:t>
       </w:r>
     </w:p>
     <w:p>
@@ -10644,45 +10337,41 @@
     </w:p>
     <w:p>
       <w:r>
-        <w:t xml:space="preserve">La empresa se plantea como una </w:t>
-      </w:r>
-      <w:proofErr w:type="gramStart"/>
-      <w:r>
-        <w:t>startup pequeña</w:t>
-      </w:r>
-      <w:proofErr w:type="gramEnd"/>
-      <w:r>
-        <w:t>, por lo que no se parte de una inversión muy elevada. Aun así, para poner la aplicación en funcionamiento de forma real sería necesario contar con dominio, servidor, base de datos, mantenimiento técnico, diseño visual y algunas acciones básicas de difusión.</w:t>
+        <w:t>La empresa se plantea como una startup pequeña, por lo que no se parte de una inversión muy elevada. Aun así, para poner la aplicación en funcionamiento de forma real sería necesario contar con dominio, servidor, base de datos, mantenimiento técnico, diseño visual y algunas acciones básicas de difusión.</w:t>
       </w:r>
     </w:p>
     <w:p>
       <w:r>
         <w:t>Los precios son estimaciones aproximadas basadas en servicios habituales para proyectos pequeños. Por ejemplo, un dominio .es puede encontrarse en torno a 7–15 € anuales dependiendo del proveedor, y un VPS básico puede rondar entre 6 y 10 € mensuales en planes iniciales.</w:t>
       </w:r>
-      <w:r>
+    </w:p>
+    <w:p>
+      <w:pPr>
+        <w:rPr>
+          <w:b/>
+          <w:bCs/>
+        </w:rPr>
+      </w:pPr>
+      <w:r>
+        <w:rPr>
+          <w:b/>
+          <w:bCs/>
+        </w:rPr>
+        <w:t>Coste de desarrollo y puesta en Marcha:</w:t>
+      </w:r>
+      <w:r>
+        <w:rPr>
+          <w:b/>
+          <w:bCs/>
+        </w:rPr>
         <w:pict w14:anchorId="3C6448C4">
           <v:rect id="_x0000_i1030" style="width:0;height:1.5pt" o:hralign="center" o:hrstd="t" o:hr="t" fillcolor="#a0a0a0" stroked="f"/>
         </w:pict>
       </w:r>
     </w:p>
-    <w:p>
-      <w:pPr>
-        <w:rPr>
-          <w:b/>
-          <w:bCs/>
-        </w:rPr>
-      </w:pPr>
-      <w:r>
-        <w:rPr>
-          <w:b/>
-          <w:bCs/>
-        </w:rPr>
-        <w:t>Costes de desarrollo y puesta en marcha</w:t>
-      </w:r>
-    </w:p>
     <w:tbl>
       <w:tblPr>
-        <w:tblW w:w="7754" w:type="dxa"/>
+        <w:tblW w:w="0" w:type="auto"/>
         <w:tblCellSpacing w:w="15" w:type="dxa"/>
         <w:tblCellMar>
           <w:top w:w="15" w:type="dxa"/>
@@ -10693,12 +10382,11 @@
         <w:tblLook w:val="04A0" w:firstRow="1" w:lastRow="0" w:firstColumn="1" w:lastColumn="0" w:noHBand="0" w:noVBand="1"/>
       </w:tblPr>
       <w:tblGrid>
-        <w:gridCol w:w="5320"/>
-        <w:gridCol w:w="2434"/>
+        <w:gridCol w:w="5479"/>
+        <w:gridCol w:w="1863"/>
       </w:tblGrid>
       <w:tr>
         <w:trPr>
-          <w:trHeight w:val="564"/>
           <w:tblHeader/>
           <w:tblCellSpacing w:w="15" w:type="dxa"/>
         </w:trPr>
@@ -10749,7 +10437,6 @@
       </w:tr>
       <w:tr>
         <w:trPr>
-          <w:trHeight w:val="579"/>
           <w:tblCellSpacing w:w="15" w:type="dxa"/>
         </w:trPr>
         <w:tc>
@@ -10760,15 +10447,7 @@
           </w:tcPr>
           <w:p>
             <w:r>
-              <w:t>Dominio web (.</w:t>
-            </w:r>
-            <w:proofErr w:type="spellStart"/>
-            <w:r>
-              <w:t>com</w:t>
-            </w:r>
-            <w:proofErr w:type="spellEnd"/>
-            <w:r>
-              <w:t xml:space="preserve"> / .es) – 1 año</w:t>
+              <w:t>Dominio web (.es) – 1 año</w:t>
             </w:r>
           </w:p>
         </w:tc>
@@ -10780,17 +10459,13 @@
           </w:tcPr>
           <w:p>
             <w:r>
-              <w:t xml:space="preserve"> </w:t>
-            </w:r>
-            <w:r>
-              <w:t>12 €</w:t>
+              <w:t>7–10 €</w:t>
             </w:r>
           </w:p>
         </w:tc>
       </w:tr>
       <w:tr>
         <w:trPr>
-          <w:trHeight w:val="564"/>
           <w:tblCellSpacing w:w="15" w:type="dxa"/>
         </w:trPr>
         <w:tc>
@@ -10801,7 +10476,7 @@
           </w:tcPr>
           <w:p>
             <w:r>
-              <w:t>Hosting para backend y base de datos</w:t>
+              <w:t>Hosting/VPS básico para backend y base de datos</w:t>
             </w:r>
           </w:p>
         </w:tc>
@@ -10813,17 +10488,13 @@
           </w:tcPr>
           <w:p>
             <w:r>
-              <w:t xml:space="preserve"> </w:t>
-            </w:r>
-            <w:r>
-              <w:t>80–120 € / año</w:t>
+              <w:t>12–60 € / año</w:t>
             </w:r>
           </w:p>
         </w:tc>
       </w:tr>
       <w:tr>
         <w:trPr>
-          <w:trHeight w:val="564"/>
           <w:tblCellSpacing w:w="15" w:type="dxa"/>
         </w:trPr>
         <w:tc>
@@ -10834,7 +10505,7 @@
           </w:tcPr>
           <w:p>
             <w:r>
-              <w:t>Certificado SSL</w:t>
+              <w:t>Frontend en hosting gratuito o repositorio público</w:t>
             </w:r>
           </w:p>
         </w:tc>
@@ -10846,17 +10517,13 @@
           </w:tcPr>
           <w:p>
             <w:r>
-              <w:t xml:space="preserve"> </w:t>
-            </w:r>
-            <w:r>
-              <w:t>Incluido en el hosting</w:t>
+              <w:t>0 €</w:t>
             </w:r>
           </w:p>
         </w:tc>
       </w:tr>
       <w:tr>
         <w:trPr>
-          <w:trHeight w:val="564"/>
           <w:tblCellSpacing w:w="15" w:type="dxa"/>
         </w:trPr>
         <w:tc>
@@ -10867,7 +10534,7 @@
           </w:tcPr>
           <w:p>
             <w:r>
-              <w:t>Servidor VPS básico para despliegue</w:t>
+              <w:t>Certificado SSL</w:t>
             </w:r>
           </w:p>
         </w:tc>
@@ -10879,17 +10546,13 @@
           </w:tcPr>
           <w:p>
             <w:r>
-              <w:t xml:space="preserve"> </w:t>
-            </w:r>
-            <w:r>
-              <w:t>60–100 € / año</w:t>
+              <w:t>Incluido / 0 €</w:t>
             </w:r>
           </w:p>
         </w:tc>
       </w:tr>
       <w:tr>
         <w:trPr>
-          <w:trHeight w:val="579"/>
           <w:tblCellSpacing w:w="15" w:type="dxa"/>
         </w:trPr>
         <w:tc>
@@ -10900,7 +10563,7 @@
           </w:tcPr>
           <w:p>
             <w:r>
-              <w:t>Recursos gráficos (iconos, imágenes, diseño UI)</w:t>
+              <w:t>Recursos gráficos básicos</w:t>
             </w:r>
           </w:p>
         </w:tc>
@@ -10912,17 +10575,13 @@
           </w:tcPr>
           <w:p>
             <w:r>
-              <w:t xml:space="preserve"> </w:t>
-            </w:r>
-            <w:r>
-              <w:t>20–40 €</w:t>
+              <w:t>0–20 €</w:t>
             </w:r>
           </w:p>
         </w:tc>
       </w:tr>
       <w:tr>
         <w:trPr>
-          <w:trHeight w:val="564"/>
           <w:tblCellSpacing w:w="15" w:type="dxa"/>
         </w:trPr>
         <w:tc>
@@ -10933,7 +10592,7 @@
           </w:tcPr>
           <w:p>
             <w:r>
-              <w:t>Trabajo de desarrollo y configuración inicial</w:t>
+              <w:t>Difusión inicial básica</w:t>
             </w:r>
           </w:p>
         </w:tc>
@@ -10945,10 +10604,36 @@
           </w:tcPr>
           <w:p>
             <w:r>
-              <w:t xml:space="preserve"> </w:t>
-            </w:r>
-            <w:r>
-              <w:t>300–400 €</w:t>
+              <w:t>20–50 €</w:t>
+            </w:r>
+          </w:p>
+        </w:tc>
+      </w:tr>
+      <w:tr>
+        <w:trPr>
+          <w:tblCellSpacing w:w="15" w:type="dxa"/>
+        </w:trPr>
+        <w:tc>
+          <w:tcPr>
+            <w:tcW w:w="0" w:type="auto"/>
+            <w:vAlign w:val="center"/>
+            <w:hideMark/>
+          </w:tcPr>
+          <w:p>
+            <w:r>
+              <w:t>Desarrollo inicial de la aplicación</w:t>
+            </w:r>
+          </w:p>
+        </w:tc>
+        <w:tc>
+          <w:tcPr>
+            <w:tcW w:w="0" w:type="auto"/>
+            <w:vAlign w:val="center"/>
+            <w:hideMark/>
+          </w:tcPr>
+          <w:p>
+            <w:r>
+              <w:t>0 €</w:t>
             </w:r>
           </w:p>
         </w:tc>
@@ -10956,32 +10641,13 @@
     </w:tbl>
     <w:p>
       <w:r>
-        <w:t>Estos costes cubren todo lo necesario para disponer de una primera versión funcional de Digital-FIT y ponerla en marcha públicamente.</w:t>
-      </w:r>
-    </w:p>
-    <w:p>
-      <w:r>
         <w:pict w14:anchorId="6E4848B0">
-          <v:rect id="_x0000_i1031" style="width:0;height:1.5pt" o:hralign="center" o:hrstd="t" o:hr="t" fillcolor="#a0a0a0" stroked="f"/>
+          <v:rect id="_x0000_i1041" style="width:0;height:1.5pt" o:hralign="center" o:bullet="t" o:hrstd="t" o:hr="t" fillcolor="#a0a0a0" stroked="f"/>
         </w:pict>
       </w:r>
     </w:p>
-    <w:p>
-      <w:pPr>
-        <w:rPr>
-          <w:b/>
-          <w:bCs/>
-        </w:rPr>
-      </w:pPr>
-    </w:p>
-    <w:p>
-      <w:pPr>
-        <w:rPr>
-          <w:b/>
-          <w:bCs/>
-        </w:rPr>
-      </w:pPr>
-    </w:p>
+    <w:p/>
+    <w:p/>
     <w:p>
       <w:pPr>
         <w:rPr>
@@ -10995,12 +10661,19 @@
           <w:bCs/>
         </w:rPr>
         <w:lastRenderedPageBreak/>
-        <w:t>Costes de funcionamiento y mantenimiento anual</w:t>
+        <w:t>Coste de funcionamiento y mantenimiento anual</w:t>
+      </w:r>
+    </w:p>
+    <w:p>
+      <w:r>
+        <w:pict w14:anchorId="74F006BD">
+          <v:rect id="_x0000_i1046" style="width:0;height:1.5pt" o:hralign="center" o:bullet="t" o:hrstd="t" o:hr="t" fillcolor="#a0a0a0" stroked="f"/>
+        </w:pict>
       </w:r>
     </w:p>
     <w:tbl>
       <w:tblPr>
-        <w:tblW w:w="5182" w:type="dxa"/>
+        <w:tblW w:w="0" w:type="auto"/>
         <w:tblCellSpacing w:w="15" w:type="dxa"/>
         <w:tblCellMar>
           <w:top w:w="15" w:type="dxa"/>
@@ -11011,12 +10684,11 @@
         <w:tblLook w:val="04A0" w:firstRow="1" w:lastRow="0" w:firstColumn="1" w:lastColumn="0" w:noHBand="0" w:noVBand="1"/>
       </w:tblPr>
       <w:tblGrid>
-        <w:gridCol w:w="3592"/>
-        <w:gridCol w:w="1590"/>
+        <w:gridCol w:w="3637"/>
+        <w:gridCol w:w="1436"/>
       </w:tblGrid>
       <w:tr>
         <w:trPr>
-          <w:trHeight w:val="600"/>
           <w:tblHeader/>
           <w:tblCellSpacing w:w="15" w:type="dxa"/>
         </w:trPr>
@@ -11067,7 +10739,6 @@
       </w:tr>
       <w:tr>
         <w:trPr>
-          <w:trHeight w:val="615"/>
           <w:tblCellSpacing w:w="15" w:type="dxa"/>
         </w:trPr>
         <w:tc>
@@ -11090,14 +10761,13 @@
           </w:tcPr>
           <w:p>
             <w:r>
-              <w:t>12 €</w:t>
+              <w:t>7–10 €</w:t>
             </w:r>
           </w:p>
         </w:tc>
       </w:tr>
       <w:tr>
         <w:trPr>
-          <w:trHeight w:val="600"/>
           <w:tblCellSpacing w:w="15" w:type="dxa"/>
         </w:trPr>
         <w:tc>
@@ -11108,7 +10778,7 @@
           </w:tcPr>
           <w:p>
             <w:r>
-              <w:t>Hosting / VPS</w:t>
+              <w:t>Hosting/VPS básico</w:t>
             </w:r>
           </w:p>
         </w:tc>
@@ -11120,14 +10790,13 @@
           </w:tcPr>
           <w:p>
             <w:r>
-              <w:t>80–120 €</w:t>
+              <w:t>12–60 €</w:t>
             </w:r>
           </w:p>
         </w:tc>
       </w:tr>
       <w:tr>
         <w:trPr>
-          <w:trHeight w:val="600"/>
           <w:tblCellSpacing w:w="15" w:type="dxa"/>
         </w:trPr>
         <w:tc>
@@ -11138,7 +10807,7 @@
           </w:tcPr>
           <w:p>
             <w:r>
-              <w:t>Mantenimiento técnico básico</w:t>
+              <w:t>Certificado SSL</w:t>
             </w:r>
           </w:p>
         </w:tc>
@@ -11150,157 +10819,520 @@
           </w:tcPr>
           <w:p>
             <w:r>
-              <w:t>100–150 €</w:t>
+              <w:t>Incluido / 0 €</w:t>
+            </w:r>
+          </w:p>
+        </w:tc>
+      </w:tr>
+      <w:tr>
+        <w:trPr>
+          <w:tblCellSpacing w:w="15" w:type="dxa"/>
+        </w:trPr>
+        <w:tc>
+          <w:tcPr>
+            <w:tcW w:w="0" w:type="auto"/>
+            <w:vAlign w:val="center"/>
+            <w:hideMark/>
+          </w:tcPr>
+          <w:p>
+            <w:r>
+              <w:t>Copias de seguridad básicas</w:t>
+            </w:r>
+          </w:p>
+        </w:tc>
+        <w:tc>
+          <w:tcPr>
+            <w:tcW w:w="0" w:type="auto"/>
+            <w:vAlign w:val="center"/>
+            <w:hideMark/>
+          </w:tcPr>
+          <w:p>
+            <w:r>
+              <w:t>0–20 €</w:t>
+            </w:r>
+          </w:p>
+        </w:tc>
+      </w:tr>
+      <w:tr>
+        <w:trPr>
+          <w:tblCellSpacing w:w="15" w:type="dxa"/>
+        </w:trPr>
+        <w:tc>
+          <w:tcPr>
+            <w:tcW w:w="0" w:type="auto"/>
+            <w:vAlign w:val="center"/>
+            <w:hideMark/>
+          </w:tcPr>
+          <w:p>
+            <w:r>
+              <w:t>Mantenimiento técnico propio</w:t>
+            </w:r>
+          </w:p>
+        </w:tc>
+        <w:tc>
+          <w:tcPr>
+            <w:tcW w:w="0" w:type="auto"/>
+            <w:vAlign w:val="center"/>
+            <w:hideMark/>
+          </w:tcPr>
+          <w:p>
+            <w:r>
+              <w:t>0 €</w:t>
+            </w:r>
+          </w:p>
+        </w:tc>
+      </w:tr>
+      <w:tr>
+        <w:trPr>
+          <w:tblCellSpacing w:w="15" w:type="dxa"/>
+        </w:trPr>
+        <w:tc>
+          <w:tcPr>
+            <w:tcW w:w="0" w:type="auto"/>
+            <w:vAlign w:val="center"/>
+            <w:hideMark/>
+          </w:tcPr>
+          <w:p>
+            <w:r>
+              <w:t>Difusión básica en redes sociales</w:t>
+            </w:r>
+          </w:p>
+        </w:tc>
+        <w:tc>
+          <w:tcPr>
+            <w:tcW w:w="0" w:type="auto"/>
+            <w:vAlign w:val="center"/>
+            <w:hideMark/>
+          </w:tcPr>
+          <w:p>
+            <w:r>
+              <w:t>20–50 €</w:t>
+            </w:r>
+          </w:p>
+        </w:tc>
+      </w:tr>
+      <w:tr>
+        <w:trPr>
+          <w:tblCellSpacing w:w="15" w:type="dxa"/>
+        </w:trPr>
+        <w:tc>
+          <w:tcPr>
+            <w:tcW w:w="0" w:type="auto"/>
+            <w:vAlign w:val="center"/>
+          </w:tcPr>
+          <w:p>
+            <w:pPr>
+              <w:rPr>
+                <w:b/>
+                <w:bCs/>
+              </w:rPr>
+            </w:pPr>
+            <w:r>
+              <w:rPr>
+                <w:b/>
+                <w:bCs/>
+              </w:rPr>
+              <w:t>Modelo de ingresos previsto</w:t>
+            </w:r>
+          </w:p>
+        </w:tc>
+        <w:tc>
+          <w:tcPr>
+            <w:tcW w:w="0" w:type="auto"/>
+            <w:vAlign w:val="center"/>
+          </w:tcPr>
+          <w:p/>
+        </w:tc>
+      </w:tr>
+    </w:tbl>
+    <w:p>
+      <w:r>
+        <w:pict w14:anchorId="66197EB2">
+          <v:rect id="_x0000_i1032" style="width:0;height:1.5pt" o:hralign="center" o:hrstd="t" o:hr="t" fillcolor="#a0a0a0" stroked="f"/>
+        </w:pict>
+      </w:r>
+    </w:p>
+    <w:tbl>
+      <w:tblPr>
+        <w:tblW w:w="0" w:type="auto"/>
+        <w:tblCellSpacing w:w="15" w:type="dxa"/>
+        <w:tblCellMar>
+          <w:top w:w="15" w:type="dxa"/>
+          <w:left w:w="15" w:type="dxa"/>
+          <w:bottom w:w="15" w:type="dxa"/>
+          <w:right w:w="15" w:type="dxa"/>
+        </w:tblCellMar>
+        <w:tblLook w:val="04A0" w:firstRow="1" w:lastRow="0" w:firstColumn="1" w:lastColumn="0" w:noHBand="0" w:noVBand="1"/>
+      </w:tblPr>
+      <w:tblGrid>
+        <w:gridCol w:w="5025"/>
+        <w:gridCol w:w="2450"/>
+      </w:tblGrid>
+      <w:tr>
+        <w:trPr>
+          <w:tblHeader/>
+          <w:tblCellSpacing w:w="15" w:type="dxa"/>
+        </w:trPr>
+        <w:tc>
+          <w:tcPr>
+            <w:tcW w:w="0" w:type="auto"/>
+            <w:vAlign w:val="center"/>
+            <w:hideMark/>
+          </w:tcPr>
+          <w:p>
+            <w:pPr>
+              <w:rPr>
+                <w:b/>
+                <w:bCs/>
+              </w:rPr>
+            </w:pPr>
+            <w:r>
+              <w:rPr>
+                <w:b/>
+                <w:bCs/>
+              </w:rPr>
+              <w:t>Fuente de ingresos</w:t>
+            </w:r>
+          </w:p>
+        </w:tc>
+        <w:tc>
+          <w:tcPr>
+            <w:tcW w:w="0" w:type="auto"/>
+            <w:vAlign w:val="center"/>
+            <w:hideMark/>
+          </w:tcPr>
+          <w:p>
+            <w:pPr>
+              <w:rPr>
+                <w:b/>
+                <w:bCs/>
+              </w:rPr>
+            </w:pPr>
+            <w:r>
+              <w:rPr>
+                <w:b/>
+                <w:bCs/>
+              </w:rPr>
+              <w:t>Estimación inicial</w:t>
+            </w:r>
+          </w:p>
+        </w:tc>
+      </w:tr>
+      <w:tr>
+        <w:trPr>
+          <w:tblCellSpacing w:w="15" w:type="dxa"/>
+        </w:trPr>
+        <w:tc>
+          <w:tcPr>
+            <w:tcW w:w="0" w:type="auto"/>
+            <w:vAlign w:val="center"/>
+            <w:hideMark/>
+          </w:tcPr>
+          <w:p>
+            <w:r>
+              <w:t>Gimnasios o centros destacados</w:t>
+            </w:r>
+          </w:p>
+        </w:tc>
+        <w:tc>
+          <w:tcPr>
+            <w:tcW w:w="0" w:type="auto"/>
+            <w:vAlign w:val="center"/>
+            <w:hideMark/>
+          </w:tcPr>
+          <w:p>
+            <w:r>
+              <w:t>5–10 € / centro al mes</w:t>
+            </w:r>
+          </w:p>
+        </w:tc>
+      </w:tr>
+      <w:tr>
+        <w:trPr>
+          <w:tblCellSpacing w:w="15" w:type="dxa"/>
+        </w:trPr>
+        <w:tc>
+          <w:tcPr>
+            <w:tcW w:w="0" w:type="auto"/>
+            <w:vAlign w:val="center"/>
+            <w:hideMark/>
+          </w:tcPr>
+          <w:p>
+            <w:r>
+              <w:t>Publicidad no intrusiva</w:t>
+            </w:r>
+          </w:p>
+        </w:tc>
+        <w:tc>
+          <w:tcPr>
+            <w:tcW w:w="0" w:type="auto"/>
+            <w:vAlign w:val="center"/>
+            <w:hideMark/>
+          </w:tcPr>
+          <w:p>
+            <w:r>
+              <w:t>5–20 € / mes</w:t>
+            </w:r>
+          </w:p>
+        </w:tc>
+      </w:tr>
+      <w:tr>
+        <w:trPr>
+          <w:tblCellSpacing w:w="15" w:type="dxa"/>
+        </w:trPr>
+        <w:tc>
+          <w:tcPr>
+            <w:tcW w:w="0" w:type="auto"/>
+            <w:vAlign w:val="center"/>
+            <w:hideMark/>
+          </w:tcPr>
+          <w:p>
+            <w:r>
+              <w:t>Colaboraciones con tiendas deportivas locales</w:t>
+            </w:r>
+          </w:p>
+        </w:tc>
+        <w:tc>
+          <w:tcPr>
+            <w:tcW w:w="0" w:type="auto"/>
+            <w:vAlign w:val="center"/>
+            <w:hideMark/>
+          </w:tcPr>
+          <w:p>
+            <w:r>
+              <w:t>10–30 € / mes</w:t>
+            </w:r>
+          </w:p>
+        </w:tc>
+      </w:tr>
+      <w:tr>
+        <w:trPr>
+          <w:tblCellSpacing w:w="15" w:type="dxa"/>
+        </w:trPr>
+        <w:tc>
+          <w:tcPr>
+            <w:tcW w:w="0" w:type="auto"/>
+            <w:vAlign w:val="center"/>
+            <w:hideMark/>
+          </w:tcPr>
+          <w:p>
+            <w:r>
+              <w:t>Promociones puntuales de centros deportivos</w:t>
+            </w:r>
+          </w:p>
+        </w:tc>
+        <w:tc>
+          <w:tcPr>
+            <w:tcW w:w="0" w:type="auto"/>
+            <w:vAlign w:val="center"/>
+            <w:hideMark/>
+          </w:tcPr>
+          <w:p>
+            <w:r>
+              <w:t>10–20 € / campaña</w:t>
+            </w:r>
+          </w:p>
+        </w:tc>
+      </w:tr>
+      <w:tr>
+        <w:trPr>
+          <w:tblCellSpacing w:w="15" w:type="dxa"/>
+        </w:trPr>
+        <w:tc>
+          <w:tcPr>
+            <w:tcW w:w="0" w:type="auto"/>
+            <w:vAlign w:val="center"/>
+            <w:hideMark/>
+          </w:tcPr>
+          <w:p>
+            <w:r>
+              <w:t>Funciones premium futuras</w:t>
+            </w:r>
+          </w:p>
+        </w:tc>
+        <w:tc>
+          <w:tcPr>
+            <w:tcW w:w="0" w:type="auto"/>
+            <w:vAlign w:val="center"/>
+            <w:hideMark/>
+          </w:tcPr>
+          <w:p>
+            <w:r>
+              <w:t>1–3 € / usuario al mes</w:t>
             </w:r>
           </w:p>
         </w:tc>
       </w:tr>
     </w:tbl>
     <w:p>
-      <w:r>
-        <w:t>Con este presupuesto anual se garantiza que la aplicación pueda mantenerse activa, actualizada y operativa sin interrupciones.</w:t>
-      </w:r>
-    </w:p>
-    <w:p>
-      <w:r>
-        <w:pict w14:anchorId="66197EB2">
-          <v:rect id="_x0000_i1032" style="width:0;height:1.5pt" o:hralign="center" o:hrstd="t" o:hr="t" fillcolor="#a0a0a0" stroked="f"/>
-        </w:pict>
-      </w:r>
-    </w:p>
-    <w:p>
-      <w:pPr>
-        <w:rPr>
-          <w:b/>
-          <w:bCs/>
-        </w:rPr>
-      </w:pPr>
-      <w:r>
-        <w:rPr>
-          <w:b/>
-          <w:bCs/>
-        </w:rPr>
-        <w:t>Modelo de ingresos previsto</w:t>
-      </w:r>
-    </w:p>
-    <w:p>
-      <w:pPr>
-        <w:rPr>
-          <w:b/>
-          <w:bCs/>
-        </w:rPr>
-      </w:pPr>
-      <w:r>
-        <w:rPr>
-          <w:b/>
-          <w:bCs/>
-        </w:rPr>
-        <w:t>1. Colaboraciones con gimnasios y centros deportivos</w:t>
-      </w:r>
-    </w:p>
-    <w:p>
-      <w:r>
-        <w:t>Los gimnasios locales pueden aparecer como “recomendados” dentro de la app o tener visibilidad extra.</w:t>
-      </w:r>
-    </w:p>
-    <w:p>
-      <w:r>
-        <w:rPr>
-          <w:b/>
-          <w:bCs/>
-        </w:rPr>
-        <w:t>Ingreso estimado:</w:t>
-      </w:r>
-      <w:r>
-        <w:t xml:space="preserve"> 10–</w:t>
-      </w:r>
-      <w:r>
-        <w:t>15</w:t>
-      </w:r>
-      <w:r>
-        <w:t xml:space="preserve"> € por gimnasio al mes.</w:t>
-      </w:r>
-    </w:p>
-    <w:p>
-      <w:r>
-        <w:pict w14:anchorId="7B1E6F1E">
-          <v:rect id="_x0000_i1033" style="width:0;height:1.5pt" o:hralign="center" o:hrstd="t" o:hr="t" fillcolor="#a0a0a0" stroked="f"/>
-        </w:pict>
-      </w:r>
-    </w:p>
-    <w:p>
-      <w:pPr>
-        <w:rPr>
-          <w:b/>
-          <w:bCs/>
-        </w:rPr>
-      </w:pPr>
-      <w:r>
-        <w:rPr>
-          <w:b/>
-          <w:bCs/>
-        </w:rPr>
-        <w:t>2. Publicidad no intrusiva</w:t>
-      </w:r>
-    </w:p>
-    <w:p>
-      <w:r>
-        <w:t>Incluye anuncios discretos o banners relacionados con deporte y salud.</w:t>
-      </w:r>
-    </w:p>
-    <w:p>
-      <w:r>
-        <w:rPr>
-          <w:b/>
-          <w:bCs/>
-        </w:rPr>
-        <w:t>Ingreso estimado inicial:</w:t>
-      </w:r>
-      <w:r>
-        <w:t xml:space="preserve"> 15–40 € al mes según tráfico.</w:t>
-      </w:r>
-    </w:p>
-    <w:p>
-      <w:r>
-        <w:pict w14:anchorId="5999C6C9">
-          <v:rect id="_x0000_i1034" style="width:0;height:1.5pt" o:hralign="center" o:hrstd="t" o:hr="t" fillcolor="#a0a0a0" stroked="f"/>
-        </w:pict>
-      </w:r>
-    </w:p>
-    <w:p>
-      <w:pPr>
-        <w:rPr>
-          <w:b/>
-          <w:bCs/>
-        </w:rPr>
-      </w:pPr>
-      <w:r>
-        <w:rPr>
-          <w:b/>
-          <w:bCs/>
-        </w:rPr>
-        <w:t>3. Colaboración con tiendas deportivas locales</w:t>
-      </w:r>
-    </w:p>
-    <w:p>
-      <w:r>
-        <w:t>Digital-FIT puede incluir recomendaciones de material deportivo proporcionadas por tiendas de la zona.</w:t>
-      </w:r>
-    </w:p>
-    <w:p>
-      <w:r>
-        <w:rPr>
-          <w:b/>
-          <w:bCs/>
-        </w:rPr>
-        <w:t>Ingreso estimado:</w:t>
-      </w:r>
-      <w:r>
-        <w:t xml:space="preserve"> variable según acuerdo, pero suficiente para cubrir gastos básicos.</w:t>
-      </w:r>
-    </w:p>
-    <w:p/>
-    <w:p/>
+      <w:pPr>
+        <w:rPr>
+          <w:b/>
+          <w:bCs/>
+        </w:rPr>
+      </w:pPr>
+      <w:r>
+        <w:rPr>
+          <w:b/>
+          <w:bCs/>
+        </w:rPr>
+        <w:t>-RESUMEN GENERAL PRESUPUESTO-</w:t>
+      </w:r>
+    </w:p>
+    <w:tbl>
+      <w:tblPr>
+        <w:tblW w:w="0" w:type="auto"/>
+        <w:tblCellSpacing w:w="15" w:type="dxa"/>
+        <w:tblCellMar>
+          <w:top w:w="15" w:type="dxa"/>
+          <w:left w:w="15" w:type="dxa"/>
+          <w:bottom w:w="15" w:type="dxa"/>
+          <w:right w:w="15" w:type="dxa"/>
+        </w:tblCellMar>
+        <w:tblLook w:val="04A0" w:firstRow="1" w:lastRow="0" w:firstColumn="1" w:lastColumn="0" w:noHBand="0" w:noVBand="1"/>
+      </w:tblPr>
+      <w:tblGrid>
+        <w:gridCol w:w="2864"/>
+        <w:gridCol w:w="2169"/>
+      </w:tblGrid>
+      <w:tr>
+        <w:trPr>
+          <w:tblHeader/>
+          <w:tblCellSpacing w:w="15" w:type="dxa"/>
+        </w:trPr>
+        <w:tc>
+          <w:tcPr>
+            <w:tcW w:w="0" w:type="auto"/>
+            <w:vAlign w:val="center"/>
+            <w:hideMark/>
+          </w:tcPr>
+          <w:p>
+            <w:pPr>
+              <w:rPr>
+                <w:b/>
+                <w:bCs/>
+              </w:rPr>
+            </w:pPr>
+            <w:r>
+              <w:rPr>
+                <w:b/>
+                <w:bCs/>
+              </w:rPr>
+              <w:t>Apartado</w:t>
+            </w:r>
+          </w:p>
+        </w:tc>
+        <w:tc>
+          <w:tcPr>
+            <w:tcW w:w="0" w:type="auto"/>
+            <w:vAlign w:val="center"/>
+            <w:hideMark/>
+          </w:tcPr>
+          <w:p>
+            <w:pPr>
+              <w:rPr>
+                <w:b/>
+                <w:bCs/>
+              </w:rPr>
+            </w:pPr>
+            <w:r>
+              <w:rPr>
+                <w:b/>
+                <w:bCs/>
+              </w:rPr>
+              <w:t>Coste aproximado</w:t>
+            </w:r>
+          </w:p>
+        </w:tc>
+      </w:tr>
+      <w:tr>
+        <w:trPr>
+          <w:tblCellSpacing w:w="15" w:type="dxa"/>
+        </w:trPr>
+        <w:tc>
+          <w:tcPr>
+            <w:tcW w:w="0" w:type="auto"/>
+            <w:vAlign w:val="center"/>
+            <w:hideMark/>
+          </w:tcPr>
+          <w:p>
+            <w:r>
+              <w:t>Puesta en marcha inicial</w:t>
+            </w:r>
+          </w:p>
+        </w:tc>
+        <w:tc>
+          <w:tcPr>
+            <w:tcW w:w="0" w:type="auto"/>
+            <w:vAlign w:val="center"/>
+            <w:hideMark/>
+          </w:tcPr>
+          <w:p>
+            <w:r>
+              <w:t>39–140 €</w:t>
+            </w:r>
+          </w:p>
+        </w:tc>
+      </w:tr>
+      <w:tr>
+        <w:trPr>
+          <w:tblCellSpacing w:w="15" w:type="dxa"/>
+        </w:trPr>
+        <w:tc>
+          <w:tcPr>
+            <w:tcW w:w="0" w:type="auto"/>
+            <w:vAlign w:val="center"/>
+            <w:hideMark/>
+          </w:tcPr>
+          <w:p>
+            <w:r>
+              <w:t>Mantenimiento anual</w:t>
+            </w:r>
+          </w:p>
+        </w:tc>
+        <w:tc>
+          <w:tcPr>
+            <w:tcW w:w="0" w:type="auto"/>
+            <w:vAlign w:val="center"/>
+            <w:hideMark/>
+          </w:tcPr>
+          <w:p>
+            <w:r>
+              <w:t>39–140 €</w:t>
+            </w:r>
+          </w:p>
+        </w:tc>
+      </w:tr>
+      <w:tr>
+        <w:trPr>
+          <w:tblCellSpacing w:w="15" w:type="dxa"/>
+        </w:trPr>
+        <w:tc>
+          <w:tcPr>
+            <w:tcW w:w="0" w:type="auto"/>
+            <w:vAlign w:val="center"/>
+            <w:hideMark/>
+          </w:tcPr>
+          <w:p>
+            <w:r>
+              <w:t>Ingresos iniciales posibles</w:t>
+            </w:r>
+          </w:p>
+        </w:tc>
+        <w:tc>
+          <w:tcPr>
+            <w:tcW w:w="0" w:type="auto"/>
+            <w:vAlign w:val="center"/>
+            <w:hideMark/>
+          </w:tcPr>
+          <w:p>
+            <w:r>
+              <w:t>20–80 € / mes</w:t>
+            </w:r>
+          </w:p>
+        </w:tc>
+      </w:tr>
+    </w:tbl>
     <w:p>
       <w:pPr>
         <w:pStyle w:val="Ttulo2"/>
@@ -11411,15 +11443,7 @@
         <w:t>3.-</w:t>
       </w:r>
       <w:r>
-        <w:t xml:space="preserve">Los repositorios se encargan del acceso a la base de datos mediante Spring Data JPA. Gracias a esto, la aplicación puede guardar, buscar, actualizar y eliminar datos sin tener que escribir SQL manualmente en la mayoría de </w:t>
-      </w:r>
-      <w:proofErr w:type="gramStart"/>
-      <w:r>
-        <w:t>operaciones</w:t>
-      </w:r>
-      <w:proofErr w:type="gramEnd"/>
-      <w:r>
-        <w:t>. Esto facilita mucho el trabajo y permite mantener el código más limpio.</w:t>
+        <w:t>Los repositorios se encargan del acceso a la base de datos mediante Spring Data JPA. Gracias a esto, la aplicación puede guardar, buscar, actualizar y eliminar datos sin tener que escribir SQL manualmente en la mayoría de operaciones. Esto facilita mucho el trabajo y permite mantener el código más limpio.</w:t>
       </w:r>
     </w:p>
     <w:p>
@@ -11432,13 +11456,8 @@
     </w:p>
     <w:p>
       <w:r>
-        <w:t xml:space="preserve">5.-Y por supuesto las entidades de las que se compone el proyecto como Usuario.java, Entrenamiento, LugarPublico, CentroPrivado, </w:t>
-      </w:r>
-      <w:proofErr w:type="spellStart"/>
-      <w:r>
-        <w:t>etc</w:t>
-      </w:r>
-      <w:proofErr w:type="spellEnd"/>
+        <w:t>5.-Y por supuesto las entidades de las que se compone el proyecto como Usuario.java, Entrenamiento, LugarPublico, CentroPrivado, etc</w:t>
+      </w:r>
       <w:r>
         <w:t>…</w:t>
       </w:r>
@@ -11508,23 +11527,7 @@
         <w:t>Digital-FIT utiliza una base de datos relacional</w:t>
       </w:r>
       <w:r>
-        <w:t xml:space="preserve"> creada con Spring mediante </w:t>
-      </w:r>
-      <w:proofErr w:type="spellStart"/>
-      <w:r>
-        <w:t>JPA.La</w:t>
-      </w:r>
-      <w:proofErr w:type="spellEnd"/>
-      <w:r>
-        <w:t xml:space="preserve"> </w:t>
-      </w:r>
-      <w:proofErr w:type="gramStart"/>
-      <w:r>
-        <w:t>app</w:t>
-      </w:r>
-      <w:proofErr w:type="gramEnd"/>
-      <w:r>
-        <w:t xml:space="preserve"> usa la base</w:t>
+        <w:t xml:space="preserve"> creada con Spring mediante JPA.La app usa la base</w:t>
       </w:r>
       <w:r>
         <w:t xml:space="preserve"> para almacenar la información principal de la aplicación. En ella se guardan usuarios, centros privados, lugares públicos, entrenamientos, valoraciones y otros datos necesarios para el funcionamiento del sistema.</w:t>
@@ -11885,18 +11888,10 @@
     </w:p>
     <w:p>
       <w:r>
-        <w:t xml:space="preserve">También se crearon los </w:t>
-      </w:r>
-      <w:proofErr w:type="gramStart"/>
-      <w:r>
-        <w:t>repositorios</w:t>
-      </w:r>
-      <w:r>
-        <w:t>,dto</w:t>
-      </w:r>
-      <w:proofErr w:type="gramEnd"/>
-      <w:r>
-        <w:t>,controllers</w:t>
+        <w:t>También se crearon los repositorios</w:t>
+      </w:r>
+      <w:r>
+        <w:t>,dto,controllers</w:t>
       </w:r>
       <w:r>
         <w:t xml:space="preserve"> y servicios necesarios para trabajar con la base de datos. La prioridad fue conseguir una estructura clara que permitiera crear, consultar, modificar y eliminar información de forma ordenada.</w:t>
@@ -12669,43 +12664,7 @@
     </w:p>
     <w:p>
       <w:r>
-        <w:t xml:space="preserve">(El backend fue testeado antes de que el frontend siquiera fuera </w:t>
-      </w:r>
-      <w:proofErr w:type="spellStart"/>
-      <w:proofErr w:type="gramStart"/>
-      <w:r>
-        <w:t>creado,se</w:t>
-      </w:r>
-      <w:proofErr w:type="spellEnd"/>
-      <w:proofErr w:type="gramEnd"/>
-      <w:r>
-        <w:t xml:space="preserve"> usó </w:t>
-      </w:r>
-      <w:proofErr w:type="spellStart"/>
-      <w:r>
-        <w:t>postman</w:t>
-      </w:r>
-      <w:proofErr w:type="spellEnd"/>
-      <w:r>
-        <w:t xml:space="preserve"> para testear el backend y luego para testear el frontend se uso la propia vista del </w:t>
-      </w:r>
-      <w:proofErr w:type="spellStart"/>
-      <w:proofErr w:type="gramStart"/>
-      <w:r>
-        <w:t>usuario,la</w:t>
-      </w:r>
-      <w:proofErr w:type="spellEnd"/>
-      <w:proofErr w:type="gramEnd"/>
-      <w:r>
-        <w:t xml:space="preserve"> consola del navegador y el </w:t>
-      </w:r>
-      <w:proofErr w:type="spellStart"/>
-      <w:r>
-        <w:t>cmd</w:t>
-      </w:r>
-      <w:proofErr w:type="spellEnd"/>
-      <w:r>
-        <w:t xml:space="preserve"> para ver que todos los procesos tiraban bien y demás)</w:t>
+        <w:t>(El backend fue testeado antes de que el frontend siquiera fuera creado,se usó postman para testear el backend y luego para testear el frontend se uso la propia vista del usuario,la consola del navegador y el cmd para ver que todos los procesos tiraban bien y demás)</w:t>
       </w:r>
     </w:p>
     <w:p>
@@ -12896,23 +12855,7 @@
           <w:b/>
           <w:bCs/>
         </w:rPr>
-        <w:t xml:space="preserve">3.- Diseñar carteles o </w:t>
-      </w:r>
-      <w:proofErr w:type="spellStart"/>
-      <w:r>
-        <w:rPr>
-          <w:b/>
-          <w:bCs/>
-        </w:rPr>
-        <w:t>flyers</w:t>
-      </w:r>
-      <w:proofErr w:type="spellEnd"/>
-      <w:r>
-        <w:rPr>
-          <w:b/>
-          <w:bCs/>
-        </w:rPr>
-        <w:t xml:space="preserve"> con un código QR hacia la aplicación.</w:t>
+        <w:t>3.- Diseñar carteles o flyers con un código QR hacia la aplicación.</w:t>
       </w:r>
     </w:p>
     <w:p>
@@ -13009,15 +12952,7 @@
     </w:p>
     <w:p>
       <w:r>
-        <w:t xml:space="preserve">Al tratarse de un proyecto inicial, la difusión se plantea con un presupuesto reducido. La mayoría de </w:t>
-      </w:r>
-      <w:proofErr w:type="gramStart"/>
-      <w:r>
-        <w:t>acciones</w:t>
-      </w:r>
-      <w:proofErr w:type="gramEnd"/>
-      <w:r>
-        <w:t xml:space="preserve"> podrían realizarse de forma gratuita o con bajo coste, utilizando redes sociales, colaboraciones locales y material digital.</w:t>
+        <w:t>Al tratarse de un proyecto inicial, la difusión se plantea con un presupuesto reducido. La mayoría de acciones podrían realizarse de forma gratuita o con bajo coste, utilizando redes sociales, colaboraciones locales y material digital.</w:t>
       </w:r>
     </w:p>
     <w:p>
@@ -13037,15 +12972,7 @@
     </w:p>
     <w:p>
       <w:r>
-        <w:t xml:space="preserve">1.- Diseño de carteles o </w:t>
-      </w:r>
-      <w:proofErr w:type="spellStart"/>
-      <w:r>
-        <w:t>flyers</w:t>
-      </w:r>
-      <w:proofErr w:type="spellEnd"/>
-      <w:r>
-        <w:t>: 20–40 €.</w:t>
+        <w:t>1.- Diseño de carteles o flyers: 20–40 €.</w:t>
       </w:r>
     </w:p>
     <w:p>
@@ -13678,6 +13605,11 @@
 
 <file path=word/numbering.xml><?xml version="1.0" encoding="utf-8"?>
 <w:numbering xmlns:wpc="http://schemas.microsoft.com/office/word/2010/wordprocessingCanvas" xmlns:cx="http://schemas.microsoft.com/office/drawing/2014/chartex" xmlns:cx1="http://schemas.microsoft.com/office/drawing/2015/9/8/chartex" xmlns:cx2="http://schemas.microsoft.com/office/drawing/2015/10/21/chartex" xmlns:cx3="http://schemas.microsoft.com/office/drawing/2016/5/9/chartex" xmlns:cx4="http://schemas.microsoft.com/office/drawing/2016/5/10/chartex" xmlns:cx5="http://schemas.microsoft.com/office/drawing/2016/5/11/chartex" xmlns:cx6="http://schemas.microsoft.com/office/drawing/2016/5/12/chartex" xmlns:cx7="http://schemas.microsoft.com/office/drawing/2016/5/13/chartex" xmlns:cx8="http://schemas.microsoft.com/office/drawing/2016/5/14/chartex" xmlns:mc="http://schemas.openxmlformats.org/markup-compatibility/2006" xmlns:aink="http://schemas.microsoft.com/office/drawing/2016/ink" xmlns:am3d="http://schemas.microsoft.com/office/drawing/2017/model3d" xmlns:o="urn:schemas-microsoft-com:office:office" xmlns:oel="http://schemas.microsoft.com/office/2019/extlst" xmlns:r="http://schemas.openxmlformats.org/officeDocument/2006/relationships" xmlns:m="http://schemas.openxmlformats.org/officeDocument/2006/math" xmlns:v="urn:schemas-microsoft-com:vml" xmlns:wp14="http://schemas.microsoft.com/office/word/2010/wordprocessingDrawing" xmlns:wp="http://schemas.openxmlformats.org/drawingml/2006/wordprocessingDrawing" xmlns:w10="urn:schemas-microsoft-com:office:word" xmlns:w="http://schemas.openxmlformats.org/wordprocessingml/2006/main" xmlns:w14="http://schemas.microsoft.com/office/word/2010/wordml" xmlns:w15="http://schemas.microsoft.com/office/word/2012/wordml" xmlns:w16cex="http://schemas.microsoft.com/office/word/2018/wordml/cex" xmlns:w16cid="http://schemas.microsoft.com/office/word/2016/wordml/cid" xmlns:w16="http://schemas.microsoft.com/office/word/2018/wordml" xmlns:w16du="http://schemas.microsoft.com/office/word/2023/wordml/word16du" xmlns:w16sdtdh="http://schemas.microsoft.com/office/word/2020/wordml/sdtdatahash" xmlns:w16sdtfl="http://schemas.microsoft.com/office/word/2024/wordml/sdtformatlock" xmlns:w16se="http://schemas.microsoft.com/office/word/2015/wordml/symex" xmlns:wpg="http://schemas.microsoft.com/office/word/2010/wordprocessingGroup" xmlns:wpi="http://schemas.microsoft.com/office/word/2010/wordprocessingInk" xmlns:wne="http://schemas.microsoft.com/office/word/2006/wordml" xmlns:wps="http://schemas.microsoft.com/office/word/2010/wordprocessingShape" mc:Ignorable="w14 w15 w16se w16cid w16 w16cex w16sdtdh w16sdtfl w16du wp14">
+  <w:numPicBullet w:numPicBulletId="0">
+    <w:pict>
+      <v:rect id="_x0000_i1025" style="width:0;height:1.5pt" o:hralign="center" o:bullet="t" o:hrstd="t" o:hr="t" fillcolor="#a0a0a0" stroked="f"/>
+    </w:pict>
+  </w:numPicBullet>
   <w:abstractNum w:abstractNumId="0" w15:restartNumberingAfterBreak="0">
     <w:nsid w:val="00241D5A"/>
     <w:multiLevelType w:val="hybridMultilevel"/>
@@ -21178,7 +21110,6 @@
   <w:style w:type="character" w:default="1" w:styleId="Fuentedeprrafopredeter">
     <w:name w:val="Default Paragraph Font"/>
     <w:uiPriority w:val="1"/>
-    <w:semiHidden/>
     <w:unhideWhenUsed/>
   </w:style>
   <w:style w:type="table" w:default="1" w:styleId="Tablanormal">

</xml_diff>

<commit_message>
docs: añadir capturas de anexos y borrador del manual de uso
- Añadir capturas Anexo1-15 en Capturas Digital-Fit.
- Crear MANUAL DE USO Y FUNCIONAMIENTO -- DIGITAL - FIT.docx.
- Actualizar DOC-Digital-Fit.docx.
</commit_message>
<xml_diff>
--- a/Documentacion/DOC-Digital-Fit.docx
+++ b/Documentacion/DOC-Digital-Fit.docx
@@ -8226,7 +8226,7 @@
     <w:p>
       <w:r>
         <w:pict w14:anchorId="1425B789">
-          <v:rect id="_x0000_i1025" style="width:0;height:1.5pt" o:hralign="center" o:hrstd="t" o:hr="t" fillcolor="#a0a0a0" stroked="f"/>
+          <v:rect id="_x0000_i1026" style="width:0;height:1.5pt" o:hralign="center" o:hrstd="t" o:hr="t" fillcolor="#a0a0a0" stroked="f"/>
         </w:pict>
       </w:r>
     </w:p>
@@ -8464,7 +8464,7 @@
     <w:p>
       <w:r>
         <w:pict w14:anchorId="49E279E4">
-          <v:rect id="_x0000_i1026" style="width:0;height:1.5pt" o:hralign="center" o:hrstd="t" o:hr="t" fillcolor="#a0a0a0" stroked="f"/>
+          <v:rect id="_x0000_i1027" style="width:0;height:1.5pt" o:hralign="center" o:hrstd="t" o:hr="t" fillcolor="#a0a0a0" stroked="f"/>
         </w:pict>
       </w:r>
     </w:p>
@@ -9877,7 +9877,7 @@
     <w:p>
       <w:r>
         <w:pict w14:anchorId="7497E976">
-          <v:rect id="_x0000_i1027" style="width:0;height:1.5pt" o:hralign="center" o:hrstd="t" o:hr="t" fillcolor="#a0a0a0" stroked="f"/>
+          <v:rect id="_x0000_i1028" style="width:0;height:1.5pt" o:hralign="center" o:hrstd="t" o:hr="t" fillcolor="#a0a0a0" stroked="f"/>
         </w:pict>
       </w:r>
     </w:p>
@@ -10045,7 +10045,7 @@
     <w:p>
       <w:r>
         <w:pict w14:anchorId="08247A36">
-          <v:rect id="_x0000_i1028" style="width:0;height:1.5pt" o:hralign="center" o:hrstd="t" o:hr="t" fillcolor="#a0a0a0" stroked="f"/>
+          <v:rect id="_x0000_i1029" style="width:0;height:1.5pt" o:hralign="center" o:hrstd="t" o:hr="t" fillcolor="#a0a0a0" stroked="f"/>
         </w:pict>
       </w:r>
     </w:p>
@@ -10200,7 +10200,7 @@
           <w:highlight w:val="cyan"/>
         </w:rPr>
         <w:pict w14:anchorId="308E1BEC">
-          <v:rect id="_x0000_i1029" style="width:0;height:1.5pt" o:hralign="center" o:hrstd="t" o:hr="t" fillcolor="#a0a0a0" stroked="f"/>
+          <v:rect id="_x0000_i1030" style="width:0;height:1.5pt" o:hralign="center" o:hrstd="t" o:hr="t" fillcolor="#a0a0a0" stroked="f"/>
         </w:pict>
       </w:r>
     </w:p>
@@ -10365,7 +10365,7 @@
           <w:bCs/>
         </w:rPr>
         <w:pict w14:anchorId="3C6448C4">
-          <v:rect id="_x0000_i1030" style="width:0;height:1.5pt" o:hralign="center" o:hrstd="t" o:hr="t" fillcolor="#a0a0a0" stroked="f"/>
+          <v:rect id="_x0000_i1031" style="width:0;height:1.5pt" o:hralign="center" o:hrstd="t" o:hr="t" fillcolor="#a0a0a0" stroked="f"/>
         </w:pict>
       </w:r>
     </w:p>
@@ -10459,7 +10459,13 @@
           </w:tcPr>
           <w:p>
             <w:r>
-              <w:t>7–10 €</w:t>
+              <w:t>7–</w:t>
+            </w:r>
+            <w:r>
+              <w:t>1</w:t>
+            </w:r>
+            <w:r>
+              <w:t>0 €</w:t>
             </w:r>
           </w:p>
         </w:tc>
@@ -10488,7 +10494,13 @@
           </w:tcPr>
           <w:p>
             <w:r>
-              <w:t>12–60 € / año</w:t>
+              <w:t>12–</w:t>
+            </w:r>
+            <w:r>
+              <w:t>3</w:t>
+            </w:r>
+            <w:r>
+              <w:t>6 € / año</w:t>
             </w:r>
           </w:p>
         </w:tc>
@@ -10575,7 +10587,13 @@
           </w:tcPr>
           <w:p>
             <w:r>
-              <w:t>0–20 €</w:t>
+              <w:t>0–</w:t>
+            </w:r>
+            <w:r>
+              <w:t>15</w:t>
+            </w:r>
+            <w:r>
+              <w:t xml:space="preserve"> €</w:t>
             </w:r>
           </w:p>
         </w:tc>
@@ -10604,7 +10622,16 @@
           </w:tcPr>
           <w:p>
             <w:r>
-              <w:t>20–50 €</w:t>
+              <w:t>1</w:t>
+            </w:r>
+            <w:r>
+              <w:t>0–</w:t>
+            </w:r>
+            <w:r>
+              <w:t>3</w:t>
+            </w:r>
+            <w:r>
+              <w:t>0 €</w:t>
             </w:r>
           </w:p>
         </w:tc>
@@ -10642,7 +10669,7 @@
     <w:p>
       <w:r>
         <w:pict w14:anchorId="6E4848B0">
-          <v:rect id="_x0000_i1041" style="width:0;height:1.5pt" o:hralign="center" o:bullet="t" o:hrstd="t" o:hr="t" fillcolor="#a0a0a0" stroked="f"/>
+          <v:rect id="_x0000_i1032" style="width:0;height:1.5pt" o:hralign="center" o:bullet="t" o:hrstd="t" o:hr="t" fillcolor="#a0a0a0" stroked="f"/>
         </w:pict>
       </w:r>
     </w:p>
@@ -10667,7 +10694,7 @@
     <w:p>
       <w:r>
         <w:pict w14:anchorId="74F006BD">
-          <v:rect id="_x0000_i1046" style="width:0;height:1.5pt" o:hralign="center" o:bullet="t" o:hrstd="t" o:hr="t" fillcolor="#a0a0a0" stroked="f"/>
+          <v:rect id="_x0000_i1033" style="width:0;height:1.5pt" o:hralign="center" o:bullet="t" o:hrstd="t" o:hr="t" fillcolor="#a0a0a0" stroked="f"/>
         </w:pict>
       </w:r>
     </w:p>
@@ -10790,7 +10817,10 @@
           </w:tcPr>
           <w:p>
             <w:r>
-              <w:t>12–60 €</w:t>
+              <w:t>24</w:t>
+            </w:r>
+            <w:r>
+              <w:t>–60 €</w:t>
             </w:r>
           </w:p>
         </w:tc>
@@ -10848,7 +10878,13 @@
           </w:tcPr>
           <w:p>
             <w:r>
-              <w:t>0–20 €</w:t>
+              <w:t>0–</w:t>
+            </w:r>
+            <w:r>
+              <w:t>15</w:t>
+            </w:r>
+            <w:r>
+              <w:t xml:space="preserve"> €</w:t>
             </w:r>
           </w:p>
         </w:tc>
@@ -10877,7 +10913,13 @@
           </w:tcPr>
           <w:p>
             <w:r>
-              <w:t>0 €</w:t>
+              <w:t>0</w:t>
+            </w:r>
+            <w:r>
+              <w:t>-30</w:t>
+            </w:r>
+            <w:r>
+              <w:t xml:space="preserve"> €</w:t>
             </w:r>
           </w:p>
         </w:tc>
@@ -10948,7 +10990,7 @@
     <w:p>
       <w:r>
         <w:pict w14:anchorId="66197EB2">
-          <v:rect id="_x0000_i1032" style="width:0;height:1.5pt" o:hralign="center" o:hrstd="t" o:hr="t" fillcolor="#a0a0a0" stroked="f"/>
+          <v:rect id="_x0000_i1034" style="width:0;height:1.5pt" o:hralign="center" o:hrstd="t" o:hr="t" fillcolor="#a0a0a0" stroked="f"/>
         </w:pict>
       </w:r>
     </w:p>
@@ -11100,7 +11142,13 @@
           </w:tcPr>
           <w:p>
             <w:r>
-              <w:t>10–30 € / mes</w:t>
+              <w:t>10–</w:t>
+            </w:r>
+            <w:r>
+              <w:t>25</w:t>
+            </w:r>
+            <w:r>
+              <w:t xml:space="preserve"> € / mes</w:t>
             </w:r>
           </w:p>
         </w:tc>
@@ -11269,7 +11317,16 @@
           </w:tcPr>
           <w:p>
             <w:r>
-              <w:t>39–140 €</w:t>
+              <w:t>2</w:t>
+            </w:r>
+            <w:r>
+              <w:t>9–</w:t>
+            </w:r>
+            <w:r>
+              <w:t>91</w:t>
+            </w:r>
+            <w:r>
+              <w:t xml:space="preserve"> €</w:t>
             </w:r>
           </w:p>
         </w:tc>
@@ -11298,7 +11355,19 @@
           </w:tcPr>
           <w:p>
             <w:r>
-              <w:t>39–140 €</w:t>
+              <w:t>5</w:t>
+            </w:r>
+            <w:r>
+              <w:t>1</w:t>
+            </w:r>
+            <w:r>
+              <w:t>–1</w:t>
+            </w:r>
+            <w:r>
+              <w:t>25</w:t>
+            </w:r>
+            <w:r>
+              <w:t xml:space="preserve"> €</w:t>
             </w:r>
           </w:p>
         </w:tc>
@@ -11327,7 +11396,13 @@
           </w:tcPr>
           <w:p>
             <w:r>
-              <w:t>20–80 € / mes</w:t>
+              <w:t>20–</w:t>
+            </w:r>
+            <w:r>
+              <w:t>75</w:t>
+            </w:r>
+            <w:r>
+              <w:t xml:space="preserve"> € / mes</w:t>
             </w:r>
           </w:p>
         </w:tc>
@@ -11360,13 +11435,7 @@
     </w:p>
     <w:p>
       <w:r>
-        <w:t>La parte práctica de Digital-FIT se ha desarrollado como una aplicación web completa, formada por un backend, un frontend y una base de datos</w:t>
-      </w:r>
-      <w:r>
-        <w:t xml:space="preserve"> creada con JPA</w:t>
-      </w:r>
-      <w:r>
-        <w:t xml:space="preserve">. </w:t>
+        <w:t xml:space="preserve">La parte práctica de Digital-FIT se ha desarrollado como una aplicación web completa, formada por un backend, un frontend y una base de datos creada con JPA. </w:t>
       </w:r>
     </w:p>
     <w:p>
@@ -11389,10 +11458,7 @@
     </w:p>
     <w:p>
       <w:r>
-        <w:t>Digital-FIT se ha construido siguiendo una arquitectura cliente-servidor. El usuario interactúa con la aplicación desde el navegador, utilizando la parte frontend desarrollada con Angular. Desde esta interfaz se envían peticiones al backend, desarrollado con Spring Boot, que procesa la información, aplica la lógica necesaria y se comunica con la base de datos</w:t>
-      </w:r>
-      <w:r>
-        <w:t xml:space="preserve"> mediante JPA.</w:t>
+        <w:t>Digital-FIT se ha construido siguiendo una arquitectura cliente-servidor. El usuario interactúa con la aplicación desde el navegador, utilizando la parte frontend desarrollada con Angular. Desde esta interfaz se envían peticiones al backend, desarrollado con Spring Boot, que procesa la información, aplica la lógica necesaria y se comunica con la base de datos mediante JPA.</w:t>
       </w:r>
     </w:p>
     <w:p>
@@ -11424,18 +11490,12 @@
     </w:p>
     <w:p>
       <w:r>
-        <w:t>1.-</w:t>
-      </w:r>
-      <w:r>
-        <w:t>Los controladores reciben las peticiones que llegan desde el frontend. Por ejemplo, peticiones para listar centros, crear entrenamientos, guardar lugares desde el mapa o gestionar valoraciones. Estos controladores no contienen toda la lógica directamente, sino que llaman a los servicios correspondientes.</w:t>
-      </w:r>
-    </w:p>
-    <w:p>
-      <w:r>
-        <w:t>2.-</w:t>
-      </w:r>
-      <w:r>
-        <w:t>Los servicios contienen la lógica principal de cada apartado. Aquí se realizan comprobaciones como verificar qué usuario está autenticado, comprobar si un recurso pertenece a ese usuario o preparar los datos antes de guardarlos. Esta capa es importante porque evita que toda la lógica quede mezclada en los controladores.</w:t>
+        <w:t>1.-Los controladores reciben las peticiones que llegan desde el frontend. Por ejemplo, peticiones para listar centros, crear entrenamientos, guardar lugares desde el mapa o gestionar valoraciones. Estos controladores no contienen toda la lógica directamente, sino que llaman a los servicios correspondientes.</w:t>
+      </w:r>
+    </w:p>
+    <w:p>
+      <w:r>
+        <w:t>2.-Los servicios contienen la lógica principal de cada apartado. Aquí se realizan comprobaciones como verificar qué usuario está autenticado, comprobar si un recurso pertenece a ese usuario o preparar los datos antes de guardarlos. Esta capa es importante porque evita que toda la lógica quede mezclada en los controladores.</w:t>
       </w:r>
     </w:p>
     <w:p>
@@ -11845,13 +11905,7 @@
     </w:p>
     <w:p>
       <w:r>
-        <w:t xml:space="preserve">El desarrollo </w:t>
-      </w:r>
-      <w:r>
-        <w:t>se</w:t>
-      </w:r>
-      <w:r>
-        <w:t xml:space="preserve"> ha realizado de forma progresiva, dividiendo el trabajo en distintas fases. </w:t>
+        <w:t xml:space="preserve">El desarrollo se ha realizado de forma progresiva, dividiendo el trabajo en distintas fases. </w:t>
       </w:r>
     </w:p>
     <w:p>
@@ -11888,13 +11942,7 @@
     </w:p>
     <w:p>
       <w:r>
-        <w:t>También se crearon los repositorios</w:t>
-      </w:r>
-      <w:r>
-        <w:t>,dto,controllers</w:t>
-      </w:r>
-      <w:r>
-        <w:t xml:space="preserve"> y servicios necesarios para trabajar con la base de datos. La prioridad fue conseguir una estructura clara que permitiera crear, consultar, modificar y eliminar información de forma ordenada.</w:t>
+        <w:t>También se crearon los repositorios,dto,controllers y servicios necesarios para trabajar con la base de datos. La prioridad fue conseguir una estructura clara que permitiera crear, consultar, modificar y eliminar información de forma ordenada.</w:t>
       </w:r>
     </w:p>
     <w:p/>
@@ -11934,10 +11982,7 @@
     </w:p>
     <w:p>
       <w:r>
-        <w:t>El objetivo era que el usuario pudiera utilizar la aplicación de forma completa: consultar información, guardar elementos en su cuenta, crear sus propios entrenamientos, valorar centros o lugares y contactar con soporte. También se preparó la parte de administración para gestionar los datos base de la aplicación.</w:t>
-      </w:r>
-      <w:r>
-        <w:t xml:space="preserve"> Y se creo la parte de estadísticas automáticas y soporte (Todo funcional pero no visual testeado mediante Postman)</w:t>
+        <w:t>El objetivo era que el usuario pudiera utilizar la aplicación de forma completa: consultar información, guardar elementos en su cuenta, crear sus propios entrenamientos, valorar centros o lugares y contactar con soporte. También se preparó la parte de administración para gestionar los datos base de la aplicación. Y se creo la parte de estadísticas automáticas y soporte (Todo funcional pero no visual testeado mediante Postman)</w:t>
       </w:r>
     </w:p>
     <w:p/>
@@ -13194,8 +13239,475 @@
       </w:r>
       <w:bookmarkEnd w:id="42"/>
     </w:p>
+    <w:p>
+      <w:pPr>
+        <w:pStyle w:val="Ttulo3"/>
+      </w:pPr>
+      <w:r>
+        <w:t>Procedimiento de evaluación del proyecto</w:t>
+      </w:r>
+    </w:p>
+    <w:p>
+      <w:r>
+        <w:t>La evaluación de Digital-FIT se ha realizado comprobando si la aplicación cumple los objetivos planteados al inicio del proyecto y si las funcionalidades desarrolladas funcionan correctamente. Al tratarse de una aplicación web completa, la evaluación no se ha centrado únicamente en la idea inicial, sino también en el funcionamiento real del backend, frontend, base de datos y experiencia de usuario.</w:t>
+      </w:r>
+    </w:p>
     <w:p/>
     <w:p>
+      <w:r>
+        <w:rPr>
+          <w:b/>
+          <w:bCs/>
+        </w:rPr>
+        <w:t>1.-</w:t>
+      </w:r>
+      <w:r>
+        <w:t>Para evaluar el proyecto se han utilizado principalmente pruebas manuales. Estas pruebas han permitido comprobar el comportamiento de la aplicación desde el punto de vista del usuario normal y del administrador.</w:t>
+      </w:r>
+    </w:p>
+    <w:p/>
+    <w:p>
+      <w:r>
+        <w:rPr>
+          <w:b/>
+          <w:bCs/>
+        </w:rPr>
+        <w:t>2.-</w:t>
+      </w:r>
+      <w:r>
+        <w:t>En el caso del usuario normal, se ha revisado el registro, el inicio de sesión, la navegación por la aplicación, la consulta de centros y lugares, el uso del mapa, la gestión de entrenamientos, las valoraciones y el apartado de soporte.</w:t>
+      </w:r>
+    </w:p>
+    <w:p/>
+    <w:p>
+      <w:r>
+        <w:rPr>
+          <w:b/>
+          <w:bCs/>
+        </w:rPr>
+        <w:t>3.-</w:t>
+      </w:r>
+      <w:r>
+        <w:t>En el caso del administrador, se ha comprobado el acceso al panel de administración, la gestión de centros y lugares base, la visualización de estadísticas y el control de información general de la aplicación.</w:t>
+      </w:r>
+    </w:p>
+    <w:p/>
+    <w:p>
+      <w:r>
+        <w:rPr>
+          <w:b/>
+          <w:bCs/>
+        </w:rPr>
+        <w:t>4.-</w:t>
+      </w:r>
+      <w:r>
+        <w:t>También se ha evaluado la coherencia entre la parte visual y la parte técnica. Para ello, se ha comprobado que las acciones realizadas en el frontend se reflejen correctamente en el backend y en la base de datos. Por ejemplo, al crear un entrenamiento, guardar un lugar desde el mapa o añadir una valoración, los datos deben almacenarse correctamente y mostrarse después al usuario.</w:t>
+      </w:r>
+    </w:p>
+    <w:p/>
+    <w:p>
+      <w:r>
+        <w:rPr>
+          <w:b/>
+          <w:bCs/>
+        </w:rPr>
+        <w:t>5.-</w:t>
+      </w:r>
+      <w:r>
+        <w:t>Además, se ha revisado la usabilidad de la aplicación. Esto incluye comprobar que los menús sean claros, que los botones estén bien situados, que las pantallas sean comprensibles y que el usuario pueda realizar las acciones principales sin dificultad.</w:t>
+      </w:r>
+    </w:p>
+    <w:p>
+      <w:pPr>
+        <w:rPr>
+          <w:b/>
+          <w:bCs/>
+        </w:rPr>
+      </w:pPr>
+      <w:r>
+        <w:rPr>
+          <w:b/>
+          <w:bCs/>
+        </w:rPr>
+        <w:lastRenderedPageBreak/>
+        <w:t>C</w:t>
+      </w:r>
+      <w:r>
+        <w:rPr>
+          <w:b/>
+          <w:bCs/>
+        </w:rPr>
+        <w:t>riterios principales utilizados para evaluar el proyecto</w:t>
+      </w:r>
+      <w:r>
+        <w:rPr>
+          <w:b/>
+          <w:bCs/>
+        </w:rPr>
+        <w:t>:</w:t>
+      </w:r>
+    </w:p>
+    <w:p>
+      <w:r>
+        <w:t>1.- Correcto funcionamiento del registro e inicio de sesión.</w:t>
+      </w:r>
+    </w:p>
+    <w:p>
+      <w:r>
+        <w:t>2.- Separación adecuada entre usuario normal y administrador.</w:t>
+      </w:r>
+    </w:p>
+    <w:p>
+      <w:r>
+        <w:t>3.- Funcionamiento correcto de las operaciones principales: crear, consultar, editar y eliminar información.</w:t>
+      </w:r>
+    </w:p>
+    <w:p>
+      <w:r>
+        <w:t>4.- Correcta comunicación entre Angular y Spring Boot.</w:t>
+      </w:r>
+    </w:p>
+    <w:p>
+      <w:r>
+        <w:t>5.- Almacenamiento adecuado de datos en la base de datos.</w:t>
+      </w:r>
+    </w:p>
+    <w:p>
+      <w:r>
+        <w:t>6.- Funcionamiento del mapa, búsqueda de direcciones y selección de coordenadas.</w:t>
+      </w:r>
+    </w:p>
+    <w:p>
+      <w:r>
+        <w:t>7.- Correcta gestión de entrenamientos y valoraciones.</w:t>
+      </w:r>
+    </w:p>
+    <w:p>
+      <w:r>
+        <w:t>8.- Claridad visual y facilidad de uso de la aplicación.</w:t>
+      </w:r>
+    </w:p>
+    <w:p>
+      <w:r>
+        <w:t>9.- Estabilidad general de la aplicación durante las pruebas.</w:t>
+      </w:r>
+    </w:p>
+    <w:p>
+      <w:r>
+        <w:t>10.- Coherencia entre la idea inicial del proyecto y el resultado final desarrollado.</w:t>
+      </w:r>
+    </w:p>
+    <w:p/>
+    <w:p>
+      <w:r>
+        <w:t>En general, el procedimiento de evaluación ha permitido comprobar que Digital-FIT cumple con las funciones principales previstas y que la aplicación se encuentra en un estado funcional para su presentación</w:t>
+      </w:r>
+      <w:r>
+        <w:t>.</w:t>
+      </w:r>
+    </w:p>
+    <w:p/>
+    <w:p/>
+    <w:p/>
+    <w:p/>
+    <w:p/>
+    <w:p/>
+    <w:p/>
+    <w:p>
+      <w:pPr>
+        <w:pStyle w:val="Ttulo3"/>
+      </w:pPr>
+      <w:r>
+        <w:lastRenderedPageBreak/>
+        <w:t>Resultados Obtenidos</w:t>
+      </w:r>
+    </w:p>
+    <w:p>
+      <w:r>
+        <w:rPr>
+          <w:b/>
+          <w:bCs/>
+        </w:rPr>
+        <w:t>1.-</w:t>
+      </w:r>
+      <w:r>
+        <w:t>Uno de los resultados más importantes ha sido conseguir una aplicación completa con sistema de usuarios. El registro, inicio de sesión y control de roles permiten diferenciar entre usuario normal y administrador, haciendo que cada perfil tenga acceso a funciones diferentes.</w:t>
+      </w:r>
+    </w:p>
+    <w:p/>
+    <w:p>
+      <w:r>
+        <w:rPr>
+          <w:b/>
+          <w:bCs/>
+        </w:rPr>
+        <w:t>2.-</w:t>
+      </w:r>
+      <w:r>
+        <w:t>También se ha conseguido desarrollar la gestión de centros privados y lugares públicos. El usuario puede consultar información, guardar elementos en sus apartados personales y trabajar con ubicaciones reales mediante el mapa. Esta parte cumple con uno de los objetivos principales de Digital-FIT: facilitar la localización de espacios deportivos.</w:t>
+      </w:r>
+    </w:p>
+    <w:p>
+      <w:r>
+        <w:rPr>
+          <w:b/>
+          <w:bCs/>
+        </w:rPr>
+        <w:t>3.-</w:t>
+      </w:r>
+      <w:r>
+        <w:t xml:space="preserve">Otro resultado importante ha sido la integración del mapa con Leaflet y OpenStreetMap. El mapa permite buscar direcciones, seleccionar coordenadas y añadir centros o lugares desde una ubicación real. </w:t>
+      </w:r>
+    </w:p>
+    <w:p>
+      <w:r>
+        <w:rPr>
+          <w:b/>
+          <w:bCs/>
+        </w:rPr>
+        <w:t>4</w:t>
+      </w:r>
+      <w:r>
+        <w:rPr>
+          <w:b/>
+          <w:bCs/>
+        </w:rPr>
+        <w:t>.-</w:t>
+      </w:r>
+      <w:r>
+        <w:t xml:space="preserve">El apartado de entrenamientos también se ha completado. Cada usuario puede gestionar sus propias rutinas personales, lo que permite que la aplicación no sea solo un buscador de instalaciones, sino también una </w:t>
+      </w:r>
+      <w:r>
+        <w:t xml:space="preserve">app </w:t>
+      </w:r>
+      <w:r>
+        <w:t>de organización deportiva.</w:t>
+      </w:r>
+    </w:p>
+    <w:p>
+      <w:r>
+        <w:rPr>
+          <w:b/>
+          <w:bCs/>
+        </w:rPr>
+        <w:t>5</w:t>
+      </w:r>
+      <w:r>
+        <w:rPr>
+          <w:b/>
+          <w:bCs/>
+        </w:rPr>
+        <w:t>.-</w:t>
+      </w:r>
+      <w:r>
+        <w:t xml:space="preserve">Además, se ha implementado un sistema de valoraciones. Gracias a esta función, los usuarios pueden puntuar y comentar centros o lugares, aportando información útil </w:t>
+      </w:r>
+    </w:p>
+    <w:p>
+      <w:r>
+        <w:rPr>
+          <w:b/>
+          <w:bCs/>
+        </w:rPr>
+        <w:t>6</w:t>
+      </w:r>
+      <w:r>
+        <w:rPr>
+          <w:b/>
+          <w:bCs/>
+        </w:rPr>
+        <w:t>.-</w:t>
+      </w:r>
+      <w:r>
+        <w:t>También se han añadido funcionalidades complementarias como estadísticas automáticas y soporte. Las estadísticas ayudan al administrador a tener una visión general del sistema, mientras que el soporte permite recoger dudas</w:t>
+      </w:r>
+      <w:r>
+        <w:t xml:space="preserve"> o incidencias.</w:t>
+      </w:r>
+    </w:p>
+    <w:p>
+      <w:r>
+        <w:rPr>
+          <w:b/>
+          <w:bCs/>
+        </w:rPr>
+        <w:t>7</w:t>
+      </w:r>
+      <w:r>
+        <w:rPr>
+          <w:b/>
+          <w:bCs/>
+        </w:rPr>
+        <w:t>.-</w:t>
+      </w:r>
+      <w:r>
+        <w:t xml:space="preserve">A </w:t>
+      </w:r>
+      <w:r>
+        <w:t>nivel visual, se ha conseguido una interfaz más completa y cuidada que los primeros mockups iniciales. La aplicación final</w:t>
+      </w:r>
+      <w:r>
+        <w:t xml:space="preserve"> cumple</w:t>
+      </w:r>
+      <w:r>
+        <w:t xml:space="preserve"> la idea original</w:t>
+      </w:r>
+      <w:r>
+        <w:t xml:space="preserve"> y la mejora.</w:t>
+      </w:r>
+    </w:p>
+    <w:p>
+      <w:r>
+        <w:t xml:space="preserve">El </w:t>
+      </w:r>
+      <w:r>
+        <w:t>resultado obtenido es una aplicación web funcional que cumple con la idea principal de Digital-FIT: reunir en una misma plataforma la búsqueda de instalaciones deportivas, la gestión de entrenamientos personales, el uso de mapas y la participación de los usuarios mediante valoraciones</w:t>
+      </w:r>
+      <w:r>
+        <w:t xml:space="preserve"> y entrenamientos colgados</w:t>
+      </w:r>
+      <w:r>
+        <w:t>.</w:t>
+      </w:r>
+    </w:p>
+    <w:p/>
+    <w:p>
+      <w:pPr>
+        <w:pStyle w:val="Ttulo3"/>
+      </w:pPr>
+      <w:r>
+        <w:lastRenderedPageBreak/>
+        <w:t>Medidas ante desviaciones del proyecto</w:t>
+      </w:r>
+    </w:p>
+    <w:p>
+      <w:r>
+        <w:t>Durante el desarrollo</w:t>
+      </w:r>
+      <w:r>
+        <w:t xml:space="preserve"> </w:t>
+      </w:r>
+      <w:r>
+        <w:t>han surgido algunas desviaciones respecto a la planificación inicial. Estas desviaciones son normales en un proyecto de desarrollo web, ya que algunas funcionalidades resultan más complejas cuando se empiezan a implementar realmente.</w:t>
+      </w:r>
+    </w:p>
+    <w:p/>
+    <w:p>
+      <w:r>
+        <w:rPr>
+          <w:b/>
+          <w:bCs/>
+        </w:rPr>
+        <w:t>1.-</w:t>
+      </w:r>
+      <w:r>
+        <w:t>La medida principal ha sido priorizar siempre las funcionalidades esenciales de la aplicación. Antes de añadir mejoras visuales o funciones complementarias, se ha intentado asegurar que las partes principales funcionaran correctamente: autenticación, gestión de usuarios, centros, lugares, entrenamientos, mapa y valoraciones.</w:t>
+      </w:r>
+    </w:p>
+    <w:p/>
+    <w:p>
+      <w:r>
+        <w:rPr>
+          <w:b/>
+          <w:bCs/>
+        </w:rPr>
+        <w:t>2.-</w:t>
+      </w:r>
+      <w:r>
+        <w:t>Una de las desviaciones más importantes ha estado relacionada con el mapa. Al principio parecía una funcionalidad sencilla, pero durante el desarrollo fue necesario ajustar la selección de coordenadas, la búsqueda de direcciones y la limitación de la zona de uso. Para solucionarlo, se realizaron varias pruebas hasta conseguir que el mapa funcionara correctamente</w:t>
+      </w:r>
+      <w:r>
+        <w:t>.</w:t>
+      </w:r>
+    </w:p>
+    <w:p/>
+    <w:p>
+      <w:r>
+        <w:rPr>
+          <w:b/>
+          <w:bCs/>
+        </w:rPr>
+        <w:t>3.-</w:t>
+      </w:r>
+      <w:r>
+        <w:t>También se encontraron problemas relacionados con la comunicación entre frontend y backend. En algunos casos, los datos enviados desde Angular no coincidían exactamente con lo que esperaba Spring Boot. La solución fue revisar los DTO, las validaciones y los servicios para que la información se enviara y recibiera correctamente.</w:t>
+      </w:r>
+    </w:p>
+    <w:p/>
+    <w:p>
+      <w:r>
+        <w:rPr>
+          <w:b/>
+          <w:bCs/>
+        </w:rPr>
+        <w:t>4.-</w:t>
+      </w:r>
+      <w:r>
+        <w:t>Otra desviación fue el aumento de funcionalidades respecto a la idea inicial. El proyecto comenzó con una idea más sencilla, centrada en buscar centros y gestionar entrenamientos, pero finalmente se añadieron valoraciones, soporte, estadísticas, panel de administración y mapa interactivo. Para evitar que esto afectara negativamente al proyecto, se fueron incorporando estas funciones poco a poco y comprobando su funcionamiento antes de avanzar.</w:t>
+      </w:r>
+    </w:p>
+    <w:p>
+      <w:r>
+        <w:rPr>
+          <w:b/>
+          <w:bCs/>
+        </w:rPr>
+        <w:lastRenderedPageBreak/>
+        <w:t>5.-</w:t>
+      </w:r>
+      <w:r>
+        <w:t>En cuanto al diseño, también hubo cambios respecto a los mockups iniciales. La interfaz final se ha adaptado a las necesidades reales de la aplicación, ya que algunas pantallas necesitaban más información o una estructura diferente a la planteada al principio. Estos cambios han permitido que la aplicación final sea más completa y funcional.</w:t>
+      </w:r>
+    </w:p>
+    <w:p/>
+    <w:p>
+      <w:pPr>
+        <w:pStyle w:val="Ttulo4"/>
+      </w:pPr>
+      <w:r>
+        <w:t>Resumen medidas aplicadas:</w:t>
+      </w:r>
+    </w:p>
+    <w:p>
+      <w:r>
+        <w:t>1.- Priorizar las funcionalidades principales antes que las secundarias.</w:t>
+      </w:r>
+    </w:p>
+    <w:p/>
+    <w:p>
+      <w:r>
+        <w:t>2.- Dividir el desarrollo en fases para no mezclar demasiadas tareas a la vez.</w:t>
+      </w:r>
+    </w:p>
+    <w:p/>
+    <w:p>
+      <w:r>
+        <w:t>3.- Realizar pruebas manuales después de cada funcionalidad importante.</w:t>
+      </w:r>
+    </w:p>
+    <w:p/>
+    <w:p>
+      <w:r>
+        <w:t>4.- Revisar la comunicación entre frontend y backend cuando aparecían errores.</w:t>
+      </w:r>
+    </w:p>
+    <w:p/>
+    <w:p>
+      <w:r>
+        <w:t>5.- Ajustar el diseño según las necesidades reales de la aplicación.</w:t>
+      </w:r>
+    </w:p>
+    <w:p/>
+    <w:p>
+      <w:r>
+        <w:t>6.- Corregir errores antes de añadir nuevas funcionalidades.</w:t>
+      </w:r>
+    </w:p>
+    <w:p/>
+    <w:p>
+      <w:r>
+        <w:t>Gracias a estas medidas, las desviaciones no han impedido finalizar el proyecto. Al contrario, algunas de ellas han servido para mejorar el resultado final y hacer que Digital-FIT sea una aplicación más completa que la planteada inicialmente.</w:t>
+      </w:r>
       <w:r>
         <w:br w:type="page"/>
       </w:r>
@@ -21110,6 +21622,7 @@
   <w:style w:type="character" w:default="1" w:styleId="Fuentedeprrafopredeter">
     <w:name w:val="Default Paragraph Font"/>
     <w:uiPriority w:val="1"/>
+    <w:semiHidden/>
     <w:unhideWhenUsed/>
   </w:style>
   <w:style w:type="table" w:default="1" w:styleId="Tablanormal">

</xml_diff>

<commit_message>
docs: revisar memoria y manual de uso y quitar temporales
- Actualizar DOC-Digital-Fit.docx y el manual de uso.
- Eliminar archivos temporales de Word.
</commit_message>
<xml_diff>
--- a/Documentacion/DOC-Digital-Fit.docx
+++ b/Documentacion/DOC-Digital-Fit.docx
@@ -139,7 +139,29 @@
           <w:szCs w:val="32"/>
           <w:lang w:val="en-US"/>
         </w:rPr>
-        <w:t>Abstract/Extracte/Extracto</w:t>
+        <w:t>Abstract/</w:t>
+      </w:r>
+      <w:proofErr w:type="spellStart"/>
+      <w:r>
+        <w:rPr>
+          <w:b/>
+          <w:bCs/>
+          <w:sz w:val="32"/>
+          <w:szCs w:val="32"/>
+          <w:lang w:val="en-US"/>
+        </w:rPr>
+        <w:t>Extracte</w:t>
+      </w:r>
+      <w:proofErr w:type="spellEnd"/>
+      <w:r>
+        <w:rPr>
+          <w:b/>
+          <w:bCs/>
+          <w:sz w:val="32"/>
+          <w:szCs w:val="32"/>
+          <w:lang w:val="en-US"/>
+        </w:rPr>
+        <w:t>/Extracto</w:t>
       </w:r>
     </w:p>
     <w:p>
@@ -201,18 +223,246 @@
       </w:r>
       <w:r>
         <w:br/>
-        <w:t xml:space="preserve">Aquest projecte consisteix en una aplicació web pensada per a guiar les persones en la pràctica esportiva amb més autonomia. </w:t>
-      </w:r>
-    </w:p>
-    <w:p>
-      <w:r>
-        <w:t>L’app inclourà rutines bàsiques d’entrenament segons l’objectiu de l’usuari, un cercador de gimnasos i instal·lacions esportives (com pistes de pàdel, públiques o privades)</w:t>
-      </w:r>
+      </w:r>
+      <w:proofErr w:type="spellStart"/>
+      <w:r>
+        <w:t>Aquest</w:t>
+      </w:r>
+      <w:proofErr w:type="spellEnd"/>
+      <w:r>
+        <w:t xml:space="preserve"> </w:t>
+      </w:r>
+      <w:proofErr w:type="spellStart"/>
+      <w:r>
+        <w:t>projecte</w:t>
+      </w:r>
+      <w:proofErr w:type="spellEnd"/>
+      <w:r>
+        <w:t xml:space="preserve"> </w:t>
+      </w:r>
+      <w:proofErr w:type="spellStart"/>
+      <w:r>
+        <w:t>consisteix</w:t>
+      </w:r>
+      <w:proofErr w:type="spellEnd"/>
+      <w:r>
+        <w:t xml:space="preserve"> en una </w:t>
+      </w:r>
+      <w:proofErr w:type="spellStart"/>
+      <w:r>
+        <w:t>aplicació</w:t>
+      </w:r>
+      <w:proofErr w:type="spellEnd"/>
+      <w:r>
+        <w:t xml:space="preserve"> web pensada per a guiar les persones en la </w:t>
+      </w:r>
+      <w:proofErr w:type="spellStart"/>
+      <w:r>
+        <w:t>pràctica</w:t>
+      </w:r>
+      <w:proofErr w:type="spellEnd"/>
+      <w:r>
+        <w:t xml:space="preserve"> esportiva </w:t>
+      </w:r>
+      <w:proofErr w:type="spellStart"/>
+      <w:r>
+        <w:t>amb</w:t>
+      </w:r>
+      <w:proofErr w:type="spellEnd"/>
+      <w:r>
+        <w:t xml:space="preserve"> </w:t>
+      </w:r>
+      <w:proofErr w:type="spellStart"/>
+      <w:r>
+        <w:t>més</w:t>
+      </w:r>
+      <w:proofErr w:type="spellEnd"/>
+      <w:r>
+        <w:t xml:space="preserve"> </w:t>
+      </w:r>
+      <w:proofErr w:type="spellStart"/>
+      <w:r>
+        <w:t>autonomia</w:t>
+      </w:r>
+      <w:proofErr w:type="spellEnd"/>
       <w:r>
         <w:t xml:space="preserve">. </w:t>
       </w:r>
-      <w:r>
-        <w:t>La idea és facilitar que qualsevol persona que vulga començar a entrenar o millorar la seua pràctica tinga tota la informació ordenada en un sol lloc.</w:t>
+    </w:p>
+    <w:p>
+      <w:proofErr w:type="spellStart"/>
+      <w:r>
+        <w:t>L’app</w:t>
+      </w:r>
+      <w:proofErr w:type="spellEnd"/>
+      <w:r>
+        <w:t xml:space="preserve"> </w:t>
+      </w:r>
+      <w:proofErr w:type="spellStart"/>
+      <w:r>
+        <w:t>inclourà</w:t>
+      </w:r>
+      <w:proofErr w:type="spellEnd"/>
+      <w:r>
+        <w:t xml:space="preserve"> </w:t>
+      </w:r>
+      <w:proofErr w:type="spellStart"/>
+      <w:r>
+        <w:t>rutines</w:t>
+      </w:r>
+      <w:proofErr w:type="spellEnd"/>
+      <w:r>
+        <w:t xml:space="preserve"> </w:t>
+      </w:r>
+      <w:proofErr w:type="spellStart"/>
+      <w:r>
+        <w:t>bàsiques</w:t>
+      </w:r>
+      <w:proofErr w:type="spellEnd"/>
+      <w:r>
+        <w:t xml:space="preserve"> </w:t>
+      </w:r>
+      <w:proofErr w:type="spellStart"/>
+      <w:r>
+        <w:t>d’entrenament</w:t>
+      </w:r>
+      <w:proofErr w:type="spellEnd"/>
+      <w:r>
+        <w:t xml:space="preserve"> </w:t>
+      </w:r>
+      <w:proofErr w:type="spellStart"/>
+      <w:r>
+        <w:t>segons</w:t>
+      </w:r>
+      <w:proofErr w:type="spellEnd"/>
+      <w:r>
+        <w:t xml:space="preserve"> </w:t>
+      </w:r>
+      <w:proofErr w:type="spellStart"/>
+      <w:r>
+        <w:t>l’objectiu</w:t>
+      </w:r>
+      <w:proofErr w:type="spellEnd"/>
+      <w:r>
+        <w:t xml:space="preserve"> de </w:t>
+      </w:r>
+      <w:proofErr w:type="spellStart"/>
+      <w:r>
+        <w:t>l’usuari</w:t>
+      </w:r>
+      <w:proofErr w:type="spellEnd"/>
+      <w:r>
+        <w:t xml:space="preserve">, un cercador de </w:t>
+      </w:r>
+      <w:proofErr w:type="spellStart"/>
+      <w:r>
+        <w:t>gimnasos</w:t>
+      </w:r>
+      <w:proofErr w:type="spellEnd"/>
+      <w:r>
+        <w:t xml:space="preserve"> i </w:t>
+      </w:r>
+      <w:proofErr w:type="spellStart"/>
+      <w:r>
+        <w:t>instal·lacions</w:t>
+      </w:r>
+      <w:proofErr w:type="spellEnd"/>
+      <w:r>
+        <w:t xml:space="preserve"> esportives (</w:t>
+      </w:r>
+      <w:proofErr w:type="spellStart"/>
+      <w:r>
+        <w:t>com</w:t>
+      </w:r>
+      <w:proofErr w:type="spellEnd"/>
+      <w:r>
+        <w:t xml:space="preserve"> pistes de </w:t>
+      </w:r>
+      <w:proofErr w:type="spellStart"/>
+      <w:r>
+        <w:t>pàdel</w:t>
+      </w:r>
+      <w:proofErr w:type="spellEnd"/>
+      <w:r>
+        <w:t>, públiques o privades)</w:t>
+      </w:r>
+      <w:r>
+        <w:t xml:space="preserve">. </w:t>
+      </w:r>
+      <w:r>
+        <w:t xml:space="preserve">La idea </w:t>
+      </w:r>
+      <w:proofErr w:type="spellStart"/>
+      <w:r>
+        <w:t>és</w:t>
+      </w:r>
+      <w:proofErr w:type="spellEnd"/>
+      <w:r>
+        <w:t xml:space="preserve"> facilitar que </w:t>
+      </w:r>
+      <w:proofErr w:type="spellStart"/>
+      <w:r>
+        <w:t>qualsevol</w:t>
+      </w:r>
+      <w:proofErr w:type="spellEnd"/>
+      <w:r>
+        <w:t xml:space="preserve"> persona que </w:t>
+      </w:r>
+      <w:proofErr w:type="spellStart"/>
+      <w:r>
+        <w:t>vulga</w:t>
+      </w:r>
+      <w:proofErr w:type="spellEnd"/>
+      <w:r>
+        <w:t xml:space="preserve"> </w:t>
+      </w:r>
+      <w:proofErr w:type="spellStart"/>
+      <w:r>
+        <w:t>començar</w:t>
+      </w:r>
+      <w:proofErr w:type="spellEnd"/>
+      <w:r>
+        <w:t xml:space="preserve"> a entrenar o </w:t>
+      </w:r>
+      <w:proofErr w:type="spellStart"/>
+      <w:r>
+        <w:t>millorar</w:t>
+      </w:r>
+      <w:proofErr w:type="spellEnd"/>
+      <w:r>
+        <w:t xml:space="preserve"> la </w:t>
+      </w:r>
+      <w:proofErr w:type="spellStart"/>
+      <w:r>
+        <w:t>seua</w:t>
+      </w:r>
+      <w:proofErr w:type="spellEnd"/>
+      <w:r>
+        <w:t xml:space="preserve"> </w:t>
+      </w:r>
+      <w:proofErr w:type="spellStart"/>
+      <w:r>
+        <w:t>pràctica</w:t>
+      </w:r>
+      <w:proofErr w:type="spellEnd"/>
+      <w:r>
+        <w:t xml:space="preserve"> tinga tota la </w:t>
+      </w:r>
+      <w:proofErr w:type="spellStart"/>
+      <w:r>
+        <w:t>informació</w:t>
+      </w:r>
+      <w:proofErr w:type="spellEnd"/>
+      <w:r>
+        <w:t xml:space="preserve"> ordenada en un sol </w:t>
+      </w:r>
+      <w:proofErr w:type="spellStart"/>
+      <w:r>
+        <w:t>lloc</w:t>
+      </w:r>
+      <w:proofErr w:type="spellEnd"/>
+      <w:r>
+        <w:t>.</w:t>
       </w:r>
     </w:p>
     <w:p/>
@@ -265,6 +515,7 @@
           <w:szCs w:val="32"/>
         </w:rPr>
       </w:pPr>
+      <w:proofErr w:type="spellStart"/>
       <w:r>
         <w:rPr>
           <w:b/>
@@ -273,22 +524,61 @@
           <w:szCs w:val="32"/>
         </w:rPr>
         <w:lastRenderedPageBreak/>
-        <w:t>Keywords/Paraules Clau/Palabras clave</w:t>
-      </w:r>
-    </w:p>
-    <w:p>
-      <w:pPr>
-        <w:rPr>
-          <w:b/>
-          <w:bCs/>
-        </w:rPr>
-      </w:pPr>
-      <w:r>
-        <w:rPr>
-          <w:b/>
-          <w:bCs/>
-        </w:rPr>
-        <w:t>Keywords (EN)</w:t>
+        <w:t>Keywords</w:t>
+      </w:r>
+      <w:proofErr w:type="spellEnd"/>
+      <w:r>
+        <w:rPr>
+          <w:b/>
+          <w:bCs/>
+          <w:sz w:val="32"/>
+          <w:szCs w:val="32"/>
+        </w:rPr>
+        <w:t>/</w:t>
+      </w:r>
+      <w:proofErr w:type="spellStart"/>
+      <w:r>
+        <w:rPr>
+          <w:b/>
+          <w:bCs/>
+          <w:sz w:val="32"/>
+          <w:szCs w:val="32"/>
+        </w:rPr>
+        <w:t>Paraules</w:t>
+      </w:r>
+      <w:proofErr w:type="spellEnd"/>
+      <w:r>
+        <w:rPr>
+          <w:b/>
+          <w:bCs/>
+          <w:sz w:val="32"/>
+          <w:szCs w:val="32"/>
+        </w:rPr>
+        <w:t xml:space="preserve"> Clau/Palabras clave</w:t>
+      </w:r>
+    </w:p>
+    <w:p>
+      <w:pPr>
+        <w:rPr>
+          <w:b/>
+          <w:bCs/>
+        </w:rPr>
+      </w:pPr>
+      <w:proofErr w:type="spellStart"/>
+      <w:r>
+        <w:rPr>
+          <w:b/>
+          <w:bCs/>
+        </w:rPr>
+        <w:t>Keywords</w:t>
+      </w:r>
+      <w:proofErr w:type="spellEnd"/>
+      <w:r>
+        <w:rPr>
+          <w:b/>
+          <w:bCs/>
+        </w:rPr>
+        <w:t xml:space="preserve"> (EN)</w:t>
       </w:r>
     </w:p>
     <w:p>
@@ -378,41 +668,110 @@
           <w:bCs/>
         </w:rPr>
       </w:pPr>
-      <w:r>
-        <w:rPr>
-          <w:b/>
-          <w:bCs/>
-        </w:rPr>
-        <w:t>Paraules clau (VA)</w:t>
-      </w:r>
-    </w:p>
-    <w:p>
+      <w:proofErr w:type="spellStart"/>
+      <w:r>
+        <w:rPr>
+          <w:b/>
+          <w:bCs/>
+        </w:rPr>
+        <w:t>Paraules</w:t>
+      </w:r>
+      <w:proofErr w:type="spellEnd"/>
+      <w:r>
+        <w:rPr>
+          <w:b/>
+          <w:bCs/>
+        </w:rPr>
+        <w:t xml:space="preserve"> </w:t>
+      </w:r>
+      <w:proofErr w:type="spellStart"/>
+      <w:r>
+        <w:rPr>
+          <w:b/>
+          <w:bCs/>
+        </w:rPr>
+        <w:t>clau</w:t>
+      </w:r>
+      <w:proofErr w:type="spellEnd"/>
+      <w:r>
+        <w:rPr>
+          <w:b/>
+          <w:bCs/>
+        </w:rPr>
+        <w:t xml:space="preserve"> (VA)</w:t>
+      </w:r>
+    </w:p>
+    <w:p>
+      <w:proofErr w:type="spellStart"/>
       <w:r>
         <w:t>A</w:t>
       </w:r>
       <w:r>
-        <w:t xml:space="preserve">plicació esportiva; </w:t>
-      </w:r>
+        <w:t>plicació</w:t>
+      </w:r>
+      <w:proofErr w:type="spellEnd"/>
+      <w:r>
+        <w:t xml:space="preserve"> esportiva; </w:t>
+      </w:r>
+      <w:proofErr w:type="spellStart"/>
       <w:r>
         <w:t>R</w:t>
       </w:r>
       <w:r>
-        <w:t xml:space="preserve">utines d’entrenament; </w:t>
-      </w:r>
+        <w:t>utines</w:t>
+      </w:r>
+      <w:proofErr w:type="spellEnd"/>
+      <w:r>
+        <w:t xml:space="preserve"> </w:t>
+      </w:r>
+      <w:proofErr w:type="spellStart"/>
+      <w:r>
+        <w:t>d’entrenament</w:t>
+      </w:r>
+      <w:proofErr w:type="spellEnd"/>
+      <w:r>
+        <w:t xml:space="preserve">; </w:t>
+      </w:r>
+      <w:proofErr w:type="spellStart"/>
       <w:r>
         <w:t>G</w:t>
       </w:r>
       <w:r>
-        <w:t xml:space="preserve">imnasos; </w:t>
-      </w:r>
+        <w:t>imnasos</w:t>
+      </w:r>
+      <w:proofErr w:type="spellEnd"/>
+      <w:r>
+        <w:t xml:space="preserve">; </w:t>
+      </w:r>
+      <w:proofErr w:type="spellStart"/>
       <w:r>
         <w:t>I</w:t>
       </w:r>
       <w:r>
-        <w:t>nstal·lacions esportives;</w:t>
-      </w:r>
-      <w:r>
-        <w:t xml:space="preserve"> Autonomia; Recomanacions.</w:t>
+        <w:t>nstal·lacions</w:t>
+      </w:r>
+      <w:proofErr w:type="spellEnd"/>
+      <w:r>
+        <w:t xml:space="preserve"> esportives;</w:t>
+      </w:r>
+      <w:r>
+        <w:t xml:space="preserve"> </w:t>
+      </w:r>
+      <w:proofErr w:type="spellStart"/>
+      <w:r>
+        <w:t>Autonomia</w:t>
+      </w:r>
+      <w:proofErr w:type="spellEnd"/>
+      <w:r>
+        <w:t xml:space="preserve">; </w:t>
+      </w:r>
+      <w:proofErr w:type="spellStart"/>
+      <w:r>
+        <w:t>Recomanacions</w:t>
+      </w:r>
+      <w:proofErr w:type="spellEnd"/>
+      <w:r>
+        <w:t>.</w:t>
       </w:r>
     </w:p>
     <w:p/>
@@ -4302,11 +4661,6 @@
         <w:tabs>
           <w:tab w:val="right" w:leader="dot" w:pos="9060"/>
         </w:tabs>
-        <w:rPr>
-          <w:rFonts w:asciiTheme="minorHAnsi" w:eastAsiaTheme="minorEastAsia" w:hAnsiTheme="minorHAnsi"/>
-          <w:noProof/>
-          <w:lang w:eastAsia="es-ES"/>
-        </w:rPr>
       </w:pPr>
       <w:hyperlink w:anchor="_Toc215103512" w:history="1">
         <w:r>
@@ -4366,6 +4720,7 @@
         </w:r>
       </w:hyperlink>
     </w:p>
+    <w:p/>
     <w:p>
       <w:pPr>
         <w:spacing w:line="278" w:lineRule="auto"/>
@@ -4380,26 +4735,12 @@
         <w:fldChar w:fldCharType="end"/>
       </w:r>
       <w:r>
-        <w:br w:type="page"/>
-      </w:r>
-    </w:p>
-    <w:p>
-      <w:pPr>
         <w:rPr>
           <w:b/>
           <w:bCs/>
           <w:sz w:val="32"/>
           <w:szCs w:val="32"/>
         </w:rPr>
-      </w:pPr>
-      <w:r>
-        <w:rPr>
-          <w:b/>
-          <w:bCs/>
-          <w:sz w:val="32"/>
-          <w:szCs w:val="32"/>
-        </w:rPr>
-        <w:lastRenderedPageBreak/>
         <w:t>Índice de figuras</w:t>
       </w:r>
     </w:p>
@@ -5733,7 +6074,41 @@
         <w:rPr>
           <w:rFonts w:cs="Arial"/>
         </w:rPr>
-        <w:t xml:space="preserve"> buscando entrenar, localizar gimnasios e instalaciones deportivas (públicas y privadas) y recibir recomendaciones de equipamiento según sus objetivos. La empresa se plantea como </w:t>
+        <w:t xml:space="preserve"> buscando entrenar, localizar gimnasios e instalaciones deportivas (públicas y privadas) </w:t>
+      </w:r>
+      <w:r>
+        <w:rPr>
+          <w:rFonts w:cs="Arial"/>
+        </w:rPr>
+        <w:t xml:space="preserve">a la vez que tiene un apartado de comunidad donde se incluyen </w:t>
+      </w:r>
+      <w:proofErr w:type="spellStart"/>
+      <w:proofErr w:type="gramStart"/>
+      <w:r>
+        <w:rPr>
+          <w:rFonts w:cs="Arial"/>
+        </w:rPr>
+        <w:t>valoraciones,etc</w:t>
+      </w:r>
+      <w:proofErr w:type="spellEnd"/>
+      <w:r>
+        <w:rPr>
+          <w:rFonts w:cs="Arial"/>
+        </w:rPr>
+        <w:t>.</w:t>
+      </w:r>
+      <w:proofErr w:type="gramEnd"/>
+      <w:r>
+        <w:rPr>
+          <w:rFonts w:cs="Arial"/>
+        </w:rPr>
+        <w:t>.</w:t>
+      </w:r>
+      <w:r>
+        <w:rPr>
+          <w:rFonts w:cs="Arial"/>
+        </w:rPr>
+        <w:t xml:space="preserve">. La empresa se plantea como </w:t>
       </w:r>
       <w:r>
         <w:rPr>
@@ -5870,7 +6245,15 @@
     </w:p>
     <w:p>
       <w:r>
-        <w:t xml:space="preserve">Me parece un sitio perfecto porque combina el ambiente emprendedor de las startups con la cercanía al deporte y la innovación, lo que hace que sea un lugar realista y adecuado para una empresa como </w:t>
+        <w:t xml:space="preserve">Me parece un sitio perfecto porque combina el ambiente emprendedor de </w:t>
+      </w:r>
+      <w:proofErr w:type="gramStart"/>
+      <w:r>
+        <w:t>las startups</w:t>
+      </w:r>
+      <w:proofErr w:type="gramEnd"/>
+      <w:r>
+        <w:t xml:space="preserve"> con la cercanía al deporte y la innovación, lo que hace que sea un lugar realista y adecuado para una empresa como </w:t>
       </w:r>
       <w:r>
         <w:rPr>
@@ -5915,17 +6298,33 @@
           <w:b/>
           <w:bCs/>
         </w:rPr>
-        <w:t>Digital-FIT S.L.</w:t>
-      </w:r>
+        <w:t xml:space="preserve">Digital-FIT </w:t>
+      </w:r>
+      <w:proofErr w:type="gramStart"/>
       <w:r>
         <w:rPr>
           <w:rFonts w:cs="Arial"/>
-        </w:rPr>
-        <w:t xml:space="preserve">. La empresa se ubica en la </w:t>
+          <w:b/>
+          <w:bCs/>
+        </w:rPr>
+        <w:t>S.L.</w:t>
       </w:r>
       <w:r>
         <w:rPr>
           <w:rFonts w:cs="Arial"/>
+        </w:rPr>
+        <w:t>.</w:t>
+      </w:r>
+      <w:proofErr w:type="gramEnd"/>
+      <w:r>
+        <w:rPr>
+          <w:rFonts w:cs="Arial"/>
+        </w:rPr>
+        <w:t xml:space="preserve"> La empresa se ubica en la </w:t>
+      </w:r>
+      <w:r>
+        <w:rPr>
+          <w:rFonts w:cs="Arial"/>
           <w:b/>
           <w:bCs/>
         </w:rPr>
@@ -5970,8 +6369,18 @@
           <w:b/>
           <w:bCs/>
         </w:rPr>
-        <w:t>Gympass, Freeletics o MyFitnessPal</w:t>
-      </w:r>
+        <w:t xml:space="preserve">Gympass, Freeletics o </w:t>
+      </w:r>
+      <w:proofErr w:type="spellStart"/>
+      <w:r>
+        <w:rPr>
+          <w:rFonts w:cs="Arial"/>
+          <w:b/>
+          <w:bCs/>
+        </w:rPr>
+        <w:t>MyFitnessPal</w:t>
+      </w:r>
+      <w:proofErr w:type="spellEnd"/>
       <w:r>
         <w:rPr>
           <w:rFonts w:cs="Arial"/>
@@ -6083,12 +6492,20 @@
         </w:rPr>
       </w:pPr>
       <w:bookmarkStart w:id="6" w:name="_Toc227174380"/>
+      <w:proofErr w:type="spellStart"/>
       <w:r>
         <w:rPr>
           <w:lang w:val="en-US"/>
         </w:rPr>
         <w:lastRenderedPageBreak/>
-        <w:t>Demanda / target</w:t>
+        <w:t>Demanda</w:t>
+      </w:r>
+      <w:proofErr w:type="spellEnd"/>
+      <w:r>
+        <w:rPr>
+          <w:lang w:val="en-US"/>
+        </w:rPr>
+        <w:t xml:space="preserve"> / target</w:t>
       </w:r>
       <w:bookmarkEnd w:id="6"/>
     </w:p>
@@ -6121,14 +6538,42 @@
           <w:bCs/>
           <w:lang w:val="en-US"/>
         </w:rPr>
-        <w:t xml:space="preserve"> – Perfil Inicial</w:t>
-      </w:r>
+        <w:t xml:space="preserve"> – </w:t>
+      </w:r>
+      <w:proofErr w:type="spellStart"/>
       <w:r>
         <w:rPr>
           <w:b/>
           <w:bCs/>
           <w:lang w:val="en-US"/>
         </w:rPr>
+        <w:t>Perfil</w:t>
+      </w:r>
+      <w:proofErr w:type="spellEnd"/>
+      <w:r>
+        <w:rPr>
+          <w:b/>
+          <w:bCs/>
+          <w:lang w:val="en-US"/>
+        </w:rPr>
+        <w:t xml:space="preserve"> </w:t>
+      </w:r>
+      <w:proofErr w:type="spellStart"/>
+      <w:r>
+        <w:rPr>
+          <w:b/>
+          <w:bCs/>
+          <w:lang w:val="en-US"/>
+        </w:rPr>
+        <w:t>Inicial</w:t>
+      </w:r>
+      <w:proofErr w:type="spellEnd"/>
+      <w:r>
+        <w:rPr>
+          <w:b/>
+          <w:bCs/>
+          <w:lang w:val="en-US"/>
+        </w:rPr>
         <w:t>:</w:t>
       </w:r>
     </w:p>
@@ -6173,8 +6618,17 @@
           <w:b/>
           <w:bCs/>
         </w:rPr>
-        <w:t>playas de la Malvarrosa y la Patacona</w:t>
-      </w:r>
+        <w:t xml:space="preserve">playas de la Malvarrosa y la </w:t>
+      </w:r>
+      <w:proofErr w:type="spellStart"/>
+      <w:r>
+        <w:rPr>
+          <w:b/>
+          <w:bCs/>
+        </w:rPr>
+        <w:t>Patacona</w:t>
+      </w:r>
+      <w:proofErr w:type="spellEnd"/>
       <w:r>
         <w:t xml:space="preserve">, o parques y zonas deportivas de su barrio. Utiliza redes sociales como </w:t>
       </w:r>
@@ -6186,7 +6640,15 @@
         <w:t>YouTube, Instagram o TikTok</w:t>
       </w:r>
       <w:r>
-        <w:t xml:space="preserve"> para buscar rutinas, y Google Maps para localizar gimnasios o pistas, pero la información está muy dispersa y poco adaptada a lo que necesita. </w:t>
+        <w:t xml:space="preserve"> para buscar rutinas, y Google </w:t>
+      </w:r>
+      <w:proofErr w:type="spellStart"/>
+      <w:r>
+        <w:t>Maps</w:t>
+      </w:r>
+      <w:proofErr w:type="spellEnd"/>
+      <w:r>
+        <w:t xml:space="preserve"> para localizar gimnasios o pistas, pero la información está muy dispersa y poco adaptada a lo que necesita. </w:t>
       </w:r>
     </w:p>
     <w:p>
@@ -6348,7 +6810,23 @@
           <w:b/>
           <w:bCs/>
         </w:rPr>
-        <w:t>. Lienzo Early Adopter (Digital-FIT)</w:t>
+        <w:t xml:space="preserve">. Lienzo Early </w:t>
+      </w:r>
+      <w:proofErr w:type="spellStart"/>
+      <w:r>
+        <w:rPr>
+          <w:b/>
+          <w:bCs/>
+        </w:rPr>
+        <w:t>Adopter</w:t>
+      </w:r>
+      <w:proofErr w:type="spellEnd"/>
+      <w:r>
+        <w:rPr>
+          <w:b/>
+          <w:bCs/>
+        </w:rPr>
+        <w:t xml:space="preserve"> (Digital-FIT)</w:t>
       </w:r>
       <w:bookmarkEnd w:id="7"/>
     </w:p>
@@ -6397,8 +6875,13 @@
         <w:t>Como</w:t>
       </w:r>
       <w:r>
-        <w:t xml:space="preserve"> el Jardín del Turia o las playas de la Malvarrosa y la Patacona</w:t>
-      </w:r>
+        <w:t xml:space="preserve"> el Jardín del Turia o las playas de la Malvarrosa y la </w:t>
+      </w:r>
+      <w:proofErr w:type="spellStart"/>
+      <w:r>
+        <w:t>Patacona</w:t>
+      </w:r>
+      <w:proofErr w:type="spellEnd"/>
       <w:r>
         <w:t xml:space="preserve">, </w:t>
       </w:r>
@@ -6570,9 +7053,14 @@
       <w:bookmarkStart w:id="9" w:name="_Toc227174382"/>
       <w:r>
         <w:lastRenderedPageBreak/>
-        <w:t>Encuesta al Early Adopter</w:t>
+        <w:t xml:space="preserve">Encuesta al Early </w:t>
+      </w:r>
+      <w:proofErr w:type="spellStart"/>
+      <w:r>
+        <w:t>Adopter</w:t>
       </w:r>
       <w:bookmarkEnd w:id="9"/>
+      <w:proofErr w:type="spellEnd"/>
     </w:p>
     <w:p>
       <w:pPr>
@@ -10491,7 +10979,15 @@
         <w:t>centros_privados:</w:t>
       </w:r>
       <w:r>
-        <w:t xml:space="preserve"> recoge información de los gimnasios y centros deportivos privados, incluyendo su dirección, tipo de centro y coordenadas (latitud y longitud) para poder localizarlo fácilmente en Google Maps.</w:t>
+        <w:t xml:space="preserve"> recoge información de los gimnasios y centros deportivos privados, incluyendo su dirección, tipo de centro y coordenadas (latitud y longitud) para poder localizarlo fácilmente en Google </w:t>
+      </w:r>
+      <w:proofErr w:type="spellStart"/>
+      <w:r>
+        <w:t>Maps</w:t>
+      </w:r>
+      <w:proofErr w:type="spellEnd"/>
+      <w:r>
+        <w:t>.</w:t>
       </w:r>
     </w:p>
     <w:p>
@@ -10702,7 +11198,15 @@
     <w:p/>
     <w:p>
       <w:r>
-        <w:t xml:space="preserve">El organigrama de Digital-FIT muestra cómo se estructura la empresa para poder desarrollar, diseñar, proteger y dar soporte a la aplicación. La idea es tener una organización sencilla pero bien definida, ya que se trata de una startup pequeña enfocada en tecnología y deporte. </w:t>
+        <w:t xml:space="preserve">El organigrama de Digital-FIT muestra cómo se estructura la empresa para poder desarrollar, diseñar, proteger y dar soporte a la aplicación. La idea es tener una organización sencilla pero bien definida, ya que se trata de una </w:t>
+      </w:r>
+      <w:proofErr w:type="gramStart"/>
+      <w:r>
+        <w:t>startup pequeña</w:t>
+      </w:r>
+      <w:proofErr w:type="gramEnd"/>
+      <w:r>
+        <w:t xml:space="preserve"> enfocada en tecnología y deporte. </w:t>
       </w:r>
     </w:p>
     <w:p>
@@ -10717,7 +11221,23 @@
     </w:p>
     <w:p>
       <w:r>
-        <w:t xml:space="preserve">Estos departamentos representan las funciones básicas que una aplicación como Digital-FIT necesita para poder salir adelante: programación del backend, diseño del frontend, gestión de datos, comunicación y soporte al usuario. </w:t>
+        <w:t xml:space="preserve">Estos departamentos representan las funciones básicas que una aplicación como Digital-FIT necesita para poder salir adelante: programación del </w:t>
+      </w:r>
+      <w:proofErr w:type="spellStart"/>
+      <w:r>
+        <w:t>backend</w:t>
+      </w:r>
+      <w:proofErr w:type="spellEnd"/>
+      <w:r>
+        <w:t xml:space="preserve">, diseño del </w:t>
+      </w:r>
+      <w:proofErr w:type="spellStart"/>
+      <w:r>
+        <w:t>frontend</w:t>
+      </w:r>
+      <w:proofErr w:type="spellEnd"/>
+      <w:r>
+        <w:t xml:space="preserve">, gestión de datos, comunicación y soporte al usuario. </w:t>
       </w:r>
     </w:p>
     <w:p>
@@ -11095,7 +11615,15 @@
     </w:p>
     <w:p>
       <w:r>
-        <w:t>Lo que he visto es que la mayoría utiliza varias herramientas por separado: rutinas en YouTube o Instagram, gimnasios en Google Maps, opiniones sueltas en foros y, en el caso de entrenar al aire libre, suelen ir directamente a zonas conocidas del Turia sin saber si realmente son adecuadas para su deporte. Además, muchos terminan apuntando sus entrenamientos en notas del móvil o en apps que no están pensadas para eso.</w:t>
+        <w:t xml:space="preserve">Lo que he visto es que la mayoría utiliza varias herramientas por separado: rutinas en YouTube o Instagram, gimnasios en Google </w:t>
+      </w:r>
+      <w:proofErr w:type="spellStart"/>
+      <w:r>
+        <w:t>Maps</w:t>
+      </w:r>
+      <w:proofErr w:type="spellEnd"/>
+      <w:r>
+        <w:t>, opiniones sueltas en foros y, en el caso de entrenar al aire libre, suelen ir directamente a zonas conocidas del Turia sin saber si realmente son adecuadas para su deporte. Además, muchos terminan apuntando sus entrenamientos en notas del móvil o en apps que no están pensadas para eso.</w:t>
       </w:r>
     </w:p>
     <w:p>
@@ -11209,7 +11737,15 @@
         </w:numPr>
       </w:pPr>
       <w:r>
-        <w:t>Mostrar la información de cada centro o zona con un botón que permita abrir su ubicación directamente en Google Maps.</w:t>
+        <w:t xml:space="preserve">Mostrar la información de cada centro o zona con un botón que permita abrir su ubicación directamente en Google </w:t>
+      </w:r>
+      <w:proofErr w:type="spellStart"/>
+      <w:r>
+        <w:t>Maps</w:t>
+      </w:r>
+      <w:proofErr w:type="spellEnd"/>
+      <w:r>
+        <w:t>.</w:t>
       </w:r>
     </w:p>
     <w:p>
@@ -11253,7 +11789,15 @@
         </w:numPr>
       </w:pPr>
       <w:r>
-        <w:t>Mantener una estructura limpia en el backend utilizando Spring Boot para organizar controladores y lógica de la aplicación.</w:t>
+        <w:t xml:space="preserve">Mantener una estructura limpia en el </w:t>
+      </w:r>
+      <w:proofErr w:type="spellStart"/>
+      <w:r>
+        <w:t>backend</w:t>
+      </w:r>
+      <w:proofErr w:type="spellEnd"/>
+      <w:r>
+        <w:t xml:space="preserve"> utilizando Spring Boot para organizar controladores y lógica de la aplicación.</w:t>
       </w:r>
     </w:p>
     <w:p>
@@ -11263,8 +11807,13 @@
           <w:numId w:val="49"/>
         </w:numPr>
       </w:pPr>
-      <w:r>
-        <w:t>Asegurar que la aplicación funcione de manera fluida, estable y accesible para cualquier usuario.</w:t>
+      <w:proofErr w:type="gramStart"/>
+      <w:r>
+        <w:t>Asegurar</w:t>
+      </w:r>
+      <w:proofErr w:type="gramEnd"/>
+      <w:r>
+        <w:t xml:space="preserve"> que la aplicación funcione de manera fluida, estable y accesible para cualquier usuario.</w:t>
       </w:r>
     </w:p>
     <w:p/>
@@ -11281,12 +11830,36 @@
     </w:p>
     <w:p>
       <w:r>
-        <w:t>Para preparar el lanzamiento de Digital-FIT se ha elaborado un presupuesto inicial teniendo en cuenta que la aplicación ya cuenta con una parte práctica desarrollada: backend, frontend, base de datos, autenticación, mapa, valoraciones, estadísticas y panel de administración.</w:t>
-      </w:r>
-    </w:p>
-    <w:p>
-      <w:r>
-        <w:t>La empresa se plantea como una startup pequeña, por lo que no se parte de una inversión muy elevada. Aun así, para poner la aplicación en funcionamiento de forma real sería necesario contar con dominio, servidor, base de datos, mantenimiento técnico, diseño visual y algunas acciones básicas de difusión.</w:t>
+        <w:t xml:space="preserve">Para preparar el lanzamiento de Digital-FIT se ha elaborado un presupuesto inicial teniendo en cuenta que la aplicación ya cuenta con una parte práctica desarrollada: </w:t>
+      </w:r>
+      <w:proofErr w:type="spellStart"/>
+      <w:r>
+        <w:t>backend</w:t>
+      </w:r>
+      <w:proofErr w:type="spellEnd"/>
+      <w:r>
+        <w:t xml:space="preserve">, </w:t>
+      </w:r>
+      <w:proofErr w:type="spellStart"/>
+      <w:r>
+        <w:t>frontend</w:t>
+      </w:r>
+      <w:proofErr w:type="spellEnd"/>
+      <w:r>
+        <w:t>, base de datos, autenticación, mapa, valoraciones, estadísticas y panel de administración.</w:t>
+      </w:r>
+    </w:p>
+    <w:p>
+      <w:r>
+        <w:t xml:space="preserve">La empresa se plantea como una </w:t>
+      </w:r>
+      <w:proofErr w:type="gramStart"/>
+      <w:r>
+        <w:t>startup pequeña</w:t>
+      </w:r>
+      <w:proofErr w:type="gramEnd"/>
+      <w:r>
+        <w:t>, por lo que no se parte de una inversión muy elevada. Aun así, para poner la aplicación en funcionamiento de forma real sería necesario contar con dominio, servidor, base de datos, mantenimiento técnico, diseño visual y algunas acciones básicas de difusión.</w:t>
       </w:r>
     </w:p>
     <w:p>
@@ -11431,7 +12004,15 @@
           </w:tcPr>
           <w:p>
             <w:r>
-              <w:t>Hosting/VPS básico para backend y base de datos</w:t>
+              <w:t xml:space="preserve">Hosting/VPS básico para </w:t>
+            </w:r>
+            <w:proofErr w:type="spellStart"/>
+            <w:r>
+              <w:t>backend</w:t>
+            </w:r>
+            <w:proofErr w:type="spellEnd"/>
+            <w:r>
+              <w:t xml:space="preserve"> y base de datos</w:t>
             </w:r>
           </w:p>
         </w:tc>
@@ -11465,8 +12046,13 @@
             <w:hideMark/>
           </w:tcPr>
           <w:p>
-            <w:r>
-              <w:t>Frontend en hosting gratuito o repositorio público</w:t>
+            <w:proofErr w:type="spellStart"/>
+            <w:r>
+              <w:t>Frontend</w:t>
+            </w:r>
+            <w:proofErr w:type="spellEnd"/>
+            <w:r>
+              <w:t xml:space="preserve"> en hosting gratuito o repositorio público</w:t>
             </w:r>
           </w:p>
         </w:tc>
@@ -12386,12 +12972,44 @@
     </w:p>
     <w:p>
       <w:r>
-        <w:t xml:space="preserve">La parte práctica de Digital-FIT se ha desarrollado como una aplicación web completa, formada por un backend, un frontend y una base de datos creada con JPA. </w:t>
-      </w:r>
-    </w:p>
-    <w:p>
-      <w:r>
-        <w:t>El objetivo de esta estructura es separar correctamente las responsabilidades del proyecto: el backend se encarga de la lógica interna y la gestión de datos, mientras que el frontend se encarga de la interfaz visual y de la interacción con el usuario.</w:t>
+        <w:t xml:space="preserve">La parte práctica de Digital-FIT se ha desarrollado como una aplicación web completa, formada por un </w:t>
+      </w:r>
+      <w:proofErr w:type="spellStart"/>
+      <w:r>
+        <w:t>backend</w:t>
+      </w:r>
+      <w:proofErr w:type="spellEnd"/>
+      <w:r>
+        <w:t xml:space="preserve">, un </w:t>
+      </w:r>
+      <w:proofErr w:type="spellStart"/>
+      <w:r>
+        <w:t>frontend</w:t>
+      </w:r>
+      <w:proofErr w:type="spellEnd"/>
+      <w:r>
+        <w:t xml:space="preserve"> y una base de datos creada con JPA. </w:t>
+      </w:r>
+    </w:p>
+    <w:p>
+      <w:r>
+        <w:t xml:space="preserve">El objetivo de esta estructura es separar correctamente las responsabilidades del proyecto: el </w:t>
+      </w:r>
+      <w:proofErr w:type="spellStart"/>
+      <w:r>
+        <w:t>backend</w:t>
+      </w:r>
+      <w:proofErr w:type="spellEnd"/>
+      <w:r>
+        <w:t xml:space="preserve"> se encarga de la lógica interna y la gestión de datos, mientras que el </w:t>
+      </w:r>
+      <w:proofErr w:type="spellStart"/>
+      <w:r>
+        <w:t>frontend</w:t>
+      </w:r>
+      <w:proofErr w:type="spellEnd"/>
+      <w:r>
+        <w:t xml:space="preserve"> se encarga de la interfaz visual y de la interacción con el usuario.</w:t>
       </w:r>
     </w:p>
     <w:p>
@@ -12411,17 +13029,65 @@
     </w:p>
     <w:p>
       <w:r>
-        <w:t>Digital-FIT se ha construido siguiendo una arquitectura cliente-servidor. El usuario interactúa con la aplicación desde el navegador, utilizando la parte frontend desarrollada con Angular. Desde esta interfaz se envían peticiones al backend, desarrollado con Spring Boot, que procesa la información, aplica la lógica necesaria y se comunica con la base de datos mediante JPA.</w:t>
-      </w:r>
-    </w:p>
-    <w:p>
-      <w:r>
-        <w:t>La comunicación entre ambas partes se realiza mediante una API REST. Esto significa que el frontend no accede directamente a la base de datos, sino que solicita la información al backend a través de rutas concretas. Por ejemplo, cuando un usuario quiere ver sus entrenamientos, guardar un centro o añadir una valoración, Angular envía una petición al servidor y Spring Boot devuelve la respuesta correspondiente.</w:t>
-      </w:r>
-    </w:p>
-    <w:p>
-      <w:r>
-        <w:t>Esta separación ayuda a que el proyecto esté mejor organizado. Si en el futuro se quisiera cambiar el diseño visual o añadir una versión móvil, se podría reutilizar gran parte del backend. Del mismo modo, si se añadieran nuevas funcionalidades en el servidor, podrían integrarse en el frontend mediante nuevos servicios y componentes.</w:t>
+        <w:t xml:space="preserve">Digital-FIT se ha construido siguiendo una arquitectura cliente-servidor. El usuario interactúa con la aplicación desde el navegador, utilizando la parte </w:t>
+      </w:r>
+      <w:proofErr w:type="spellStart"/>
+      <w:r>
+        <w:t>frontend</w:t>
+      </w:r>
+      <w:proofErr w:type="spellEnd"/>
+      <w:r>
+        <w:t xml:space="preserve"> desarrollada con Angular. Desde esta interfaz se envían peticiones al </w:t>
+      </w:r>
+      <w:proofErr w:type="spellStart"/>
+      <w:r>
+        <w:t>backend</w:t>
+      </w:r>
+      <w:proofErr w:type="spellEnd"/>
+      <w:r>
+        <w:t>, desarrollado con Spring Boot, que procesa la información, aplica la lógica necesaria y se comunica con la base de datos mediante JPA.</w:t>
+      </w:r>
+    </w:p>
+    <w:p>
+      <w:r>
+        <w:t xml:space="preserve">La comunicación entre ambas partes se realiza mediante una API REST. Esto significa que el </w:t>
+      </w:r>
+      <w:proofErr w:type="spellStart"/>
+      <w:r>
+        <w:t>frontend</w:t>
+      </w:r>
+      <w:proofErr w:type="spellEnd"/>
+      <w:r>
+        <w:t xml:space="preserve"> no accede directamente a la base de datos, sino que solicita la información al </w:t>
+      </w:r>
+      <w:proofErr w:type="spellStart"/>
+      <w:r>
+        <w:t>backend</w:t>
+      </w:r>
+      <w:proofErr w:type="spellEnd"/>
+      <w:r>
+        <w:t xml:space="preserve"> a través de rutas concretas. Por ejemplo, cuando un usuario quiere ver sus entrenamientos, guardar un centro o añadir una valoración, Angular envía una petición al servidor y Spring Boot devuelve la respuesta correspondiente.</w:t>
+      </w:r>
+    </w:p>
+    <w:p>
+      <w:r>
+        <w:t xml:space="preserve">Esta separación ayuda a que el proyecto esté mejor organizado. Si en el futuro se quisiera cambiar el diseño visual o añadir una versión móvil, se podría reutilizar gran parte del </w:t>
+      </w:r>
+      <w:proofErr w:type="spellStart"/>
+      <w:r>
+        <w:t>backend</w:t>
+      </w:r>
+      <w:proofErr w:type="spellEnd"/>
+      <w:r>
+        <w:t xml:space="preserve">. Del mismo modo, si se añadieran nuevas funcionalidades en el servidor, podrían integrarse en el </w:t>
+      </w:r>
+      <w:proofErr w:type="spellStart"/>
+      <w:r>
+        <w:t>frontend</w:t>
+      </w:r>
+      <w:proofErr w:type="spellEnd"/>
+      <w:r>
+        <w:t xml:space="preserve"> mediante nuevos servicios y componentes.</w:t>
       </w:r>
     </w:p>
     <w:p/>
@@ -12432,20 +13098,41 @@
         <w:pStyle w:val="Ttulo3"/>
       </w:pPr>
       <w:bookmarkStart w:id="44" w:name="_Toc227174400"/>
+      <w:proofErr w:type="spellStart"/>
       <w:r>
         <w:lastRenderedPageBreak/>
-        <w:t>Backend con Spring Boot</w:t>
+        <w:t>Backend</w:t>
+      </w:r>
+      <w:proofErr w:type="spellEnd"/>
+      <w:r>
+        <w:t xml:space="preserve"> con Spring Boot</w:t>
       </w:r>
       <w:bookmarkEnd w:id="44"/>
     </w:p>
     <w:p>
       <w:r>
-        <w:t>El backend es la parte encargada de gestionar la lógica principal de Digital-FIT. Se ha desarrollado con Spring Boot porque permite crear aplicaciones web en Java de forma ordenada, utilizando controladores, servicios, repositorios y entidades.</w:t>
-      </w:r>
-    </w:p>
-    <w:p>
-      <w:r>
-        <w:t>1.-Los controladores reciben las peticiones que llegan desde el frontend. Por ejemplo, peticiones para listar centros, crear entrenamientos, guardar lugares desde el mapa o gestionar valoraciones. Estos controladores no contienen toda la lógica directamente, sino que llaman a los servicios correspondientes.</w:t>
+        <w:t xml:space="preserve">El </w:t>
+      </w:r>
+      <w:proofErr w:type="spellStart"/>
+      <w:r>
+        <w:t>backend</w:t>
+      </w:r>
+      <w:proofErr w:type="spellEnd"/>
+      <w:r>
+        <w:t xml:space="preserve"> es la parte encargada de gestionar la lógica principal de Digital-FIT. Se ha desarrollado con Spring Boot porque permite crear aplicaciones web en Java de forma ordenada, utilizando controladores, servicios, repositorios y entidades.</w:t>
+      </w:r>
+    </w:p>
+    <w:p>
+      <w:r>
+        <w:t xml:space="preserve">1.-Los controladores reciben las peticiones que llegan desde el </w:t>
+      </w:r>
+      <w:proofErr w:type="spellStart"/>
+      <w:r>
+        <w:t>frontend</w:t>
+      </w:r>
+      <w:proofErr w:type="spellEnd"/>
+      <w:r>
+        <w:t>. Por ejemplo, peticiones para listar centros, crear entrenamientos, guardar lugares desde el mapa o gestionar valoraciones. Estos controladores no contienen toda la lógica directamente, sino que llaman a los servicios correspondientes.</w:t>
       </w:r>
     </w:p>
     <w:p>
@@ -12458,7 +13145,15 @@
         <w:t>3.-</w:t>
       </w:r>
       <w:r>
-        <w:t>Los repositorios se encargan del acceso a la base de datos mediante Spring Data JPA. Gracias a esto, la aplicación puede guardar, buscar, actualizar y eliminar datos sin tener que escribir SQL manualmente en la mayoría de operaciones. Esto facilita mucho el trabajo y permite mantener el código más limpio.</w:t>
+        <w:t xml:space="preserve">Los repositorios se encargan del acceso a la base de datos mediante Spring Data JPA. Gracias a esto, la aplicación puede guardar, buscar, actualizar y eliminar datos sin tener que escribir SQL manualmente en la mayoría de </w:t>
+      </w:r>
+      <w:proofErr w:type="gramStart"/>
+      <w:r>
+        <w:t>operaciones</w:t>
+      </w:r>
+      <w:proofErr w:type="gramEnd"/>
+      <w:r>
+        <w:t>. Esto facilita mucho el trabajo y permite mantener el código más limpio.</w:t>
       </w:r>
     </w:p>
     <w:p>
@@ -12466,13 +13161,50 @@
         <w:t>4.-</w:t>
       </w:r>
       <w:r>
-        <w:t>También se han utilizado DTO para transportar datos entre el frontend y el backend. Esto permite controlar qué información se recibe y qué información se devuelve, evitando exponer directamente las entidades internas de la base de datos.</w:t>
-      </w:r>
-    </w:p>
-    <w:p>
-      <w:r>
-        <w:t>5.-Y por supuesto las entidades de las que se compone el proyecto como Usuario.java, Entrenamiento, LugarPublico, CentroPrivado, etc</w:t>
-      </w:r>
+        <w:t xml:space="preserve">También se han utilizado DTO para transportar datos entre el </w:t>
+      </w:r>
+      <w:proofErr w:type="spellStart"/>
+      <w:r>
+        <w:t>frontend</w:t>
+      </w:r>
+      <w:proofErr w:type="spellEnd"/>
+      <w:r>
+        <w:t xml:space="preserve"> y el </w:t>
+      </w:r>
+      <w:proofErr w:type="spellStart"/>
+      <w:r>
+        <w:t>backend</w:t>
+      </w:r>
+      <w:proofErr w:type="spellEnd"/>
+      <w:r>
+        <w:t>. Esto permite controlar qué información se recibe y qué información se devuelve, evitando exponer directamente las entidades internas de la base de datos.</w:t>
+      </w:r>
+    </w:p>
+    <w:p>
+      <w:r>
+        <w:t xml:space="preserve">5.-Y por supuesto las entidades de las que se compone el proyecto como Usuario.java, Entrenamiento, </w:t>
+      </w:r>
+      <w:proofErr w:type="spellStart"/>
+      <w:r>
+        <w:t>LugarPublico</w:t>
+      </w:r>
+      <w:proofErr w:type="spellEnd"/>
+      <w:r>
+        <w:t xml:space="preserve">, </w:t>
+      </w:r>
+      <w:proofErr w:type="spellStart"/>
+      <w:r>
+        <w:t>CentroPrivado</w:t>
+      </w:r>
+      <w:proofErr w:type="spellEnd"/>
+      <w:r>
+        <w:t xml:space="preserve">, </w:t>
+      </w:r>
+      <w:proofErr w:type="spellStart"/>
+      <w:r>
+        <w:t>etc</w:t>
+      </w:r>
+      <w:proofErr w:type="spellEnd"/>
       <w:r>
         <w:t>…</w:t>
       </w:r>
@@ -12489,15 +13221,28 @@
         <w:pStyle w:val="Ttulo3"/>
       </w:pPr>
       <w:bookmarkStart w:id="45" w:name="_Toc227174401"/>
+      <w:proofErr w:type="spellStart"/>
       <w:r>
         <w:lastRenderedPageBreak/>
-        <w:t>Frontend con Angular</w:t>
+        <w:t>Frontend</w:t>
+      </w:r>
+      <w:proofErr w:type="spellEnd"/>
+      <w:r>
+        <w:t xml:space="preserve"> con Angular</w:t>
       </w:r>
       <w:bookmarkEnd w:id="45"/>
     </w:p>
     <w:p>
       <w:r>
-        <w:t>El frontend se ha desarrollado con Angular y es la parte que ve y utiliza el usuario. Está formado por componentes, servicios y rutas. Cada componente representa una parte de la interfaz, como el listado de centros, el detalle de un lugar, el formulario de entrenamiento o el selector de mapa.</w:t>
+        <w:t xml:space="preserve">El </w:t>
+      </w:r>
+      <w:proofErr w:type="spellStart"/>
+      <w:r>
+        <w:t>frontend</w:t>
+      </w:r>
+      <w:proofErr w:type="spellEnd"/>
+      <w:r>
+        <w:t xml:space="preserve"> se ha desarrollado con Angular y es la parte que ve y utiliza el usuario. Está formado por componentes, servicios y rutas. Cada componente representa una parte de la interfaz, como el listado de centros, el detalle de un lugar, el formulario de entrenamiento o el selector de mapa.</w:t>
       </w:r>
     </w:p>
     <w:p>
@@ -12505,7 +13250,15 @@
         <w:t>1.-</w:t>
       </w:r>
       <w:r>
-        <w:t>Los servicios de Angular se encargan de comunicarse con el backend. Por ejemplo, hay servicios para obtener centros, crear lugares, gestionar entrenamientos o enviar valoraciones. De esta forma, los componentes no tienen que manejar directamente las peticiones HTTP, sino que llaman a métodos ya preparados en los servicios.</w:t>
+        <w:t xml:space="preserve">Los servicios de Angular se encargan de comunicarse con el </w:t>
+      </w:r>
+      <w:proofErr w:type="spellStart"/>
+      <w:r>
+        <w:t>backend</w:t>
+      </w:r>
+      <w:proofErr w:type="spellEnd"/>
+      <w:r>
+        <w:t>. Por ejemplo, hay servicios para obtener centros, crear lugares, gestionar entrenamientos o enviar valoraciones. De esta forma, los componentes no tienen que manejar directamente las peticiones HTTP, sino que llaman a métodos ya preparados en los servicios.</w:t>
       </w:r>
     </w:p>
     <w:p>
@@ -12524,7 +13277,15 @@
         <w:t>3.-</w:t>
       </w:r>
       <w:r>
-        <w:t>Durante el desarrollo del frontend también se ha cuidado la parte visual. Se ha intentado que la interfaz sea clara, moderna y fácil de usar. La aplicación está pensada para que el usuario pueda encontrar rápidamente las funciones principales sin tener que realizar demasiados pasos.</w:t>
+        <w:t xml:space="preserve">Durante el desarrollo del </w:t>
+      </w:r>
+      <w:proofErr w:type="spellStart"/>
+      <w:r>
+        <w:t>frontend</w:t>
+      </w:r>
+      <w:proofErr w:type="spellEnd"/>
+      <w:r>
+        <w:t xml:space="preserve"> también se ha cuidado la parte visual. Se ha intentado que la interfaz sea clara, moderna y fácil de usar. La aplicación está pensada para que el usuario pueda encontrar rápidamente las funciones principales sin tener que realizar demasiados pasos.</w:t>
       </w:r>
     </w:p>
     <w:p/>
@@ -12546,7 +13307,15 @@
         <w:t>Digital-FIT utiliza una base de datos relacional</w:t>
       </w:r>
       <w:r>
-        <w:t xml:space="preserve"> creada con Spring mediante JPA.La app usa la base</w:t>
+        <w:t xml:space="preserve"> creada con Spring mediante </w:t>
+      </w:r>
+      <w:proofErr w:type="spellStart"/>
+      <w:r>
+        <w:t>JPA.La</w:t>
+      </w:r>
+      <w:proofErr w:type="spellEnd"/>
+      <w:r>
+        <w:t xml:space="preserve"> app usa la base</w:t>
       </w:r>
       <w:r>
         <w:t xml:space="preserve"> para almacenar la información principal de la aplicación. En ella se guardan usuarios, centros privados, lugares públicos, entrenamientos, valoraciones y otros datos necesarios para el funcionamiento del sistema.</w:t>
@@ -12627,16 +13396,45 @@
       </w:pPr>
       <w:bookmarkStart w:id="48" w:name="_Toc227174404"/>
       <w:r>
-        <w:t>Mapa interactivo con Leaflet y OpenStreetMap</w:t>
+        <w:t xml:space="preserve">Mapa interactivo con </w:t>
+      </w:r>
+      <w:proofErr w:type="spellStart"/>
+      <w:r>
+        <w:t>Leaflet</w:t>
+      </w:r>
+      <w:proofErr w:type="spellEnd"/>
+      <w:r>
+        <w:t xml:space="preserve"> y </w:t>
+      </w:r>
+      <w:proofErr w:type="spellStart"/>
+      <w:r>
+        <w:t>OpenStreetMap</w:t>
       </w:r>
       <w:bookmarkEnd w:id="48"/>
+      <w:proofErr w:type="spellEnd"/>
     </w:p>
     <w:p>
       <w:r>
         <w:t>1.-</w:t>
       </w:r>
       <w:r>
-        <w:t>Una de las funcionalidades más importantes de Digital-FIT es el mapa interactivo. Para implementarlo se ha utilizado Leaflet junto con OpenStreetMap. Esta parte permite trabajar con ubicaciones reales dentro de la aplicación.</w:t>
+        <w:t xml:space="preserve">Una de las funcionalidades más importantes de Digital-FIT es el mapa interactivo. Para implementarlo se ha utilizado </w:t>
+      </w:r>
+      <w:proofErr w:type="spellStart"/>
+      <w:r>
+        <w:t>Leaflet</w:t>
+      </w:r>
+      <w:proofErr w:type="spellEnd"/>
+      <w:r>
+        <w:t xml:space="preserve"> junto con </w:t>
+      </w:r>
+      <w:proofErr w:type="spellStart"/>
+      <w:r>
+        <w:t>OpenStreetMap</w:t>
+      </w:r>
+      <w:proofErr w:type="spellEnd"/>
+      <w:r>
+        <w:t>. Esta parte permite trabajar con ubicaciones reales dentro de la aplicación.</w:t>
       </w:r>
     </w:p>
     <w:p>
@@ -12644,7 +13442,15 @@
         <w:t>2.-</w:t>
       </w:r>
       <w:r>
-        <w:t>El mapa permite seleccionar una ubicación manualmente haciendo clic sobre el mapa. Al hacerlo, se guardan las coordenadas de latitud y longitud, que posteriormente se envían al backend para almacenar el centro o lugar correspondiente.</w:t>
+        <w:t xml:space="preserve">El mapa permite seleccionar una ubicación manualmente haciendo clic sobre el mapa. Al hacerlo, se guardan las coordenadas de latitud y longitud, que posteriormente se envían al </w:t>
+      </w:r>
+      <w:proofErr w:type="spellStart"/>
+      <w:r>
+        <w:t>backend</w:t>
+      </w:r>
+      <w:proofErr w:type="spellEnd"/>
+      <w:r>
+        <w:t xml:space="preserve"> para almacenar el centro o lugar correspondiente.</w:t>
       </w:r>
     </w:p>
     <w:p>
@@ -12791,7 +13597,15 @@
         <w:t xml:space="preserve">3.- Este apartado aporta </w:t>
       </w:r>
       <w:r>
-        <w:t>un sistema que permite al usuario tener un grafico en el que puede consultar algunos datos que le pueden parecer interesantes después de llevar un tiempo realizando entrenamientos, o para consultar cosas como los tiempos que entrena, etc.…</w:t>
+        <w:t xml:space="preserve">un sistema que permite al usuario tener un </w:t>
+      </w:r>
+      <w:proofErr w:type="spellStart"/>
+      <w:r>
+        <w:t>grafico</w:t>
+      </w:r>
+      <w:proofErr w:type="spellEnd"/>
+      <w:r>
+        <w:t xml:space="preserve"> en el que puede consultar algunos datos que le pueden parecer interesantes después de llevar un tiempo realizando entrenamientos, o para consultar cosas como los tiempos que entrena, etc.…</w:t>
       </w:r>
     </w:p>
     <w:p>
@@ -12844,7 +13658,15 @@
     </w:p>
     <w:p>
       <w:r>
-        <w:t>3.- El sistema de soporte ayuda a mejorar la aplicación de forma progresiva, ya que permite recoger feedback real de los usuarios. Además, aporta una imagen más profesional al proyecto, porque muestra que la aplicación no solo ofrece funcionalidades, sino que también contempla la atención al usuario y la mejora continua.</w:t>
+        <w:t xml:space="preserve">3.- El sistema de soporte ayuda a mejorar la aplicación de forma progresiva, ya que permite recoger </w:t>
+      </w:r>
+      <w:proofErr w:type="spellStart"/>
+      <w:r>
+        <w:t>feedback</w:t>
+      </w:r>
+      <w:proofErr w:type="spellEnd"/>
+      <w:r>
+        <w:t xml:space="preserve"> real de los usuarios. Además, aporta una imagen más profesional al proyecto, porque muestra que la aplicación no solo ofrece funcionalidades, sino que también contempla la atención al usuario y la mejora continua.</w:t>
       </w:r>
     </w:p>
     <w:p>
@@ -12938,15 +13760,28 @@
         <w:jc w:val="left"/>
       </w:pPr>
       <w:r>
-        <w:t>2.- Segunda fase: diseño de la base de datos y estructura del backend</w:t>
-      </w:r>
+        <w:t xml:space="preserve">2.- Segunda fase: diseño de la base de datos y estructura del </w:t>
+      </w:r>
+      <w:proofErr w:type="spellStart"/>
+      <w:r>
+        <w:t>backend</w:t>
+      </w:r>
+      <w:proofErr w:type="spellEnd"/>
     </w:p>
     <w:p>
       <w:pPr>
         <w:jc w:val="left"/>
       </w:pPr>
       <w:r>
-        <w:t>Una vez definida la idea, se comenzó con la parte técnica del backend. En esta fase se plantearon las entidades principales de la aplicación, como usuarios, centros privados, lugares públicos, entrenamientos, valoraciones y soporte.</w:t>
+        <w:t xml:space="preserve">Una vez definida la idea, se comenzó con la parte técnica del </w:t>
+      </w:r>
+      <w:proofErr w:type="spellStart"/>
+      <w:r>
+        <w:t>backend</w:t>
+      </w:r>
+      <w:proofErr w:type="spellEnd"/>
+      <w:r>
+        <w:t>. En esta fase se plantearon las entidades principales de la aplicación, como usuarios, centros privados, lugares públicos, entrenamientos, valoraciones y soporte.</w:t>
       </w:r>
     </w:p>
     <w:p>
@@ -12954,7 +13789,20 @@
         <w:jc w:val="left"/>
       </w:pPr>
       <w:r>
-        <w:t>También se crearon los repositorios,dto,controllers y servicios necesarios para trabajar con la base de datos. La prioridad fue conseguir una estructura clara que permitiera crear, consultar, modificar y eliminar información de forma ordenada.</w:t>
+        <w:t xml:space="preserve">También se crearon los </w:t>
+      </w:r>
+      <w:proofErr w:type="spellStart"/>
+      <w:proofErr w:type="gramStart"/>
+      <w:r>
+        <w:t>repositorios,dto</w:t>
+      </w:r>
+      <w:proofErr w:type="gramEnd"/>
+      <w:r>
+        <w:t>,controllers</w:t>
+      </w:r>
+      <w:proofErr w:type="spellEnd"/>
+      <w:r>
+        <w:t xml:space="preserve"> y servicios necesarios para trabajar con la base de datos. La prioridad fue conseguir una estructura clara que permitiera crear, consultar, modificar y eliminar información de forma ordenada.</w:t>
       </w:r>
     </w:p>
     <w:p>
@@ -12976,7 +13824,15 @@
         <w:jc w:val="left"/>
       </w:pPr>
       <w:r>
-        <w:t>Después de crear la base del backend, se implementó el sistema de autenticación. Esta fase fue importante porque muchas funcionalidades dependen de saber qué usuario está utilizando la aplicación.</w:t>
+        <w:t xml:space="preserve">Después de crear la base del </w:t>
+      </w:r>
+      <w:proofErr w:type="spellStart"/>
+      <w:r>
+        <w:t>backend</w:t>
+      </w:r>
+      <w:proofErr w:type="spellEnd"/>
+      <w:r>
+        <w:t>, se implementó el sistema de autenticación. Esta fase fue importante porque muchas funcionalidades dependen de saber qué usuario está utilizando la aplicación.</w:t>
       </w:r>
     </w:p>
     <w:p>
@@ -13046,7 +13902,15 @@
         <w:jc w:val="left"/>
       </w:pPr>
       <w:r>
-        <w:t>5.- Quinta fase: desarrollo del frontend con Angular</w:t>
+        <w:t xml:space="preserve">5.- Quinta fase: desarrollo del </w:t>
+      </w:r>
+      <w:proofErr w:type="spellStart"/>
+      <w:r>
+        <w:t>frontend</w:t>
+      </w:r>
+      <w:proofErr w:type="spellEnd"/>
+      <w:r>
+        <w:t xml:space="preserve"> con Angular</w:t>
       </w:r>
     </w:p>
     <w:p>
@@ -13054,7 +13918,23 @@
         <w:jc w:val="left"/>
       </w:pPr>
       <w:r>
-        <w:t>Una vez que el backend tenía las funcionalidades principales, se desarrolló el frontend con Angular. En esta fase se crearon las pantallas, componentes, servicios y rutas necesarias para que el usuario pudiera interactuar con la aplicación.</w:t>
+        <w:t xml:space="preserve">Una vez que el </w:t>
+      </w:r>
+      <w:proofErr w:type="spellStart"/>
+      <w:r>
+        <w:t>backend</w:t>
+      </w:r>
+      <w:proofErr w:type="spellEnd"/>
+      <w:r>
+        <w:t xml:space="preserve"> tenía las funcionalidades principales, se desarrolló el </w:t>
+      </w:r>
+      <w:proofErr w:type="spellStart"/>
+      <w:r>
+        <w:t>frontend</w:t>
+      </w:r>
+      <w:proofErr w:type="spellEnd"/>
+      <w:r>
+        <w:t xml:space="preserve"> con Angular. En esta fase se crearon las pantallas, componentes, servicios y rutas necesarias para que el usuario pudiera interactuar con la aplicación.</w:t>
       </w:r>
     </w:p>
     <w:p>
@@ -13062,7 +13942,23 @@
         <w:jc w:val="left"/>
       </w:pPr>
       <w:r>
-        <w:t>Se trabajó en la navegación, los listados, formularios, detalles, panel de usuario y panel de administración. Además, se conectaron los servicios de Angular con los endpoints del backend para que la aplicación funcionara de forma completa.</w:t>
+        <w:t xml:space="preserve">Se trabajó en la navegación, los listados, formularios, detalles, panel de usuario y panel de administración. Además, se conectaron los servicios de Angular con los </w:t>
+      </w:r>
+      <w:proofErr w:type="spellStart"/>
+      <w:r>
+        <w:t>endpoints</w:t>
+      </w:r>
+      <w:proofErr w:type="spellEnd"/>
+      <w:r>
+        <w:t xml:space="preserve"> del </w:t>
+      </w:r>
+      <w:proofErr w:type="spellStart"/>
+      <w:r>
+        <w:t>backend</w:t>
+      </w:r>
+      <w:proofErr w:type="spellEnd"/>
+      <w:r>
+        <w:t xml:space="preserve"> para que la aplicación funcionara de forma completa.</w:t>
       </w:r>
     </w:p>
     <w:p>
@@ -13084,7 +13980,23 @@
         <w:jc w:val="left"/>
       </w:pPr>
       <w:r>
-        <w:t>Una de las últimas funcionalidades importantes fue la integración del mapa mediante Leaflet y OpenStreetMap. Esta parte permitió añadir centros y lugares desde una ubicación real, buscar direcciones y guardar coordenadas.</w:t>
+        <w:t xml:space="preserve">Una de las últimas funcionalidades importantes fue la integración del mapa mediante </w:t>
+      </w:r>
+      <w:proofErr w:type="spellStart"/>
+      <w:r>
+        <w:t>Leaflet</w:t>
+      </w:r>
+      <w:proofErr w:type="spellEnd"/>
+      <w:r>
+        <w:t xml:space="preserve"> y </w:t>
+      </w:r>
+      <w:proofErr w:type="spellStart"/>
+      <w:r>
+        <w:t>OpenStreetMap</w:t>
+      </w:r>
+      <w:proofErr w:type="spellEnd"/>
+      <w:r>
+        <w:t>. Esta parte permitió añadir centros y lugares desde una ubicación real, buscar direcciones y guardar coordenadas.</w:t>
       </w:r>
     </w:p>
     <w:p>
@@ -13092,7 +14004,15 @@
         <w:jc w:val="left"/>
       </w:pPr>
       <w:r>
-        <w:t>Durante esta fase se realizaron varias pruebas para ajustar el funcionamiento del mapa, el buscador de direcciones y la limitación de la zona de uso. Finalmente, se consiguió que el mapa se integrara correctamente con los formularios y con el backend.</w:t>
+        <w:t xml:space="preserve">Durante esta fase se realizaron varias pruebas para ajustar el funcionamiento del mapa, el buscador de direcciones y la limitación de la zona de uso. Finalmente, se consiguió que el mapa se integrara correctamente con los formularios y con el </w:t>
+      </w:r>
+      <w:proofErr w:type="spellStart"/>
+      <w:r>
+        <w:t>backend</w:t>
+      </w:r>
+      <w:proofErr w:type="spellEnd"/>
+      <w:r>
+        <w:t>.</w:t>
       </w:r>
     </w:p>
     <w:p/>
@@ -13130,7 +14050,23 @@
     </w:p>
     <w:p>
       <w:r>
-        <w:t>Gracias a esta secuenciación, el desarrollo de Digital-FIT se realizó de forma ordenada. Primero se planteó la idea y la estructura, después se desarrolló el backend, posteriormente el frontend y finalmente se integraron funcionalidades más avanzadas como el mapa, las valoraciones, las estadísticas y el soporte.</w:t>
+        <w:t xml:space="preserve">Gracias a esta secuenciación, el desarrollo de Digital-FIT se realizó de forma ordenada. Primero se planteó la idea y la estructura, después se desarrolló el </w:t>
+      </w:r>
+      <w:proofErr w:type="spellStart"/>
+      <w:r>
+        <w:t>backend</w:t>
+      </w:r>
+      <w:proofErr w:type="spellEnd"/>
+      <w:r>
+        <w:t xml:space="preserve">, posteriormente el </w:t>
+      </w:r>
+      <w:proofErr w:type="spellStart"/>
+      <w:r>
+        <w:t>frontend</w:t>
+      </w:r>
+      <w:proofErr w:type="spellEnd"/>
+      <w:r>
+        <w:t xml:space="preserve"> y finalmente se integraron funcionalidades más avanzadas como el mapa, las valoraciones, las estadísticas y el soporte.</w:t>
       </w:r>
       <w:r>
         <w:t xml:space="preserve"> Todo para terminar con el pulido visual y testeo completo de la App</w:t>
@@ -13387,7 +14323,23 @@
         <w:jc w:val="left"/>
       </w:pPr>
       <w:r>
-        <w:t>1.- Mostrar un mapa interactivo basado en Leaflet y OpenStreetMap.</w:t>
+        <w:t xml:space="preserve">1.- Mostrar un mapa interactivo basado en </w:t>
+      </w:r>
+      <w:proofErr w:type="spellStart"/>
+      <w:r>
+        <w:t>Leaflet</w:t>
+      </w:r>
+      <w:proofErr w:type="spellEnd"/>
+      <w:r>
+        <w:t xml:space="preserve"> y </w:t>
+      </w:r>
+      <w:proofErr w:type="spellStart"/>
+      <w:r>
+        <w:t>OpenStreetMap</w:t>
+      </w:r>
+      <w:proofErr w:type="spellEnd"/>
+      <w:r>
+        <w:t>.</w:t>
       </w:r>
     </w:p>
     <w:p>
@@ -13469,7 +14421,15 @@
         <w:t>El usuario puede crear entrenamientos, consultar los entrenamientos guardados y eliminarlos cuando ya no los necesite.</w:t>
       </w:r>
       <w:r>
-        <w:t xml:space="preserve"> Además como ya se mencionó esta la posibilidad de compartir entrenamientos con el resto de la comunidad de usuarios.</w:t>
+        <w:t xml:space="preserve"> </w:t>
+      </w:r>
+      <w:proofErr w:type="gramStart"/>
+      <w:r>
+        <w:t>Además</w:t>
+      </w:r>
+      <w:proofErr w:type="gramEnd"/>
+      <w:r>
+        <w:t xml:space="preserve"> como ya se mencionó esta la posibilidad de compartir entrenamientos con el resto de la comunidad de usuarios.</w:t>
       </w:r>
     </w:p>
     <w:p>
@@ -13532,7 +14492,15 @@
         <w:jc w:val="left"/>
       </w:pPr>
       <w:r>
-        <w:t>Digital-FIT incluye un apartado de soporte para que los usuarios puedan comunicar dudas, problemas o sugerencias. Esta función es importante porque permite recoger feedback y mejorar la aplicación a partir del uso real.</w:t>
+        <w:t xml:space="preserve">Digital-FIT incluye un apartado de soporte para que los usuarios puedan comunicar dudas, problemas o sugerencias. Esta función es importante porque permite recoger </w:t>
+      </w:r>
+      <w:proofErr w:type="spellStart"/>
+      <w:r>
+        <w:t>feedback</w:t>
+      </w:r>
+      <w:proofErr w:type="spellEnd"/>
+      <w:r>
+        <w:t xml:space="preserve"> y mejorar la aplicación a partir del uso real.</w:t>
       </w:r>
     </w:p>
     <w:p>
@@ -13661,7 +14629,15 @@
         <w:jc w:val="left"/>
       </w:pPr>
       <w:r>
-        <w:t>El inicio de sesión permite identificar al usuario que está utilizando la aplicación. A partir de esa identificación, el backend puede comprobar qué datos le pertenecen y qué acciones puede realizar.</w:t>
+        <w:t xml:space="preserve">El inicio de sesión permite identificar al usuario que está utilizando la aplicación. A partir de esa identificación, el </w:t>
+      </w:r>
+      <w:proofErr w:type="spellStart"/>
+      <w:r>
+        <w:t>backend</w:t>
+      </w:r>
+      <w:proofErr w:type="spellEnd"/>
+      <w:r>
+        <w:t xml:space="preserve"> puede comprobar qué datos le pertenecen y qué acciones puede realizar.</w:t>
       </w:r>
     </w:p>
     <w:p>
@@ -13821,7 +14797,23 @@
         <w:jc w:val="left"/>
       </w:pPr>
       <w:r>
-        <w:t>En el backend se han aplicado validaciones para controlar que los datos enviados desde el frontend sean correctos antes de guardarlos en la base de datos. Por ejemplo, se comprueba que los campos obligatorios no estén vacíos y que las coordenadas o valores necesarios se reciban correctamente.</w:t>
+        <w:t xml:space="preserve">En el </w:t>
+      </w:r>
+      <w:proofErr w:type="spellStart"/>
+      <w:r>
+        <w:t>backend</w:t>
+      </w:r>
+      <w:proofErr w:type="spellEnd"/>
+      <w:r>
+        <w:t xml:space="preserve"> se han aplicado validaciones para controlar que los datos enviados desde el </w:t>
+      </w:r>
+      <w:proofErr w:type="spellStart"/>
+      <w:r>
+        <w:t>frontend</w:t>
+      </w:r>
+      <w:proofErr w:type="spellEnd"/>
+      <w:r>
+        <w:t xml:space="preserve"> sean correctos antes de guardarlos en la base de datos. Por ejemplo, se comprueba que los campos obligatorios no estén vacíos y que las coordenadas o valores necesarios se reciban correctamente.</w:t>
       </w:r>
     </w:p>
     <w:p>
@@ -14076,7 +15068,23 @@
     </w:p>
     <w:p>
       <w:r>
-        <w:t>Durante el desarrollo se han detectado y corregido errores relacionados con validaciones, permisos, comunicación entre frontend y backend y funcionamiento del mapa. Estas correcciones han permitido mejorar la estabilidad de la aplicación y dejarla en un estado más completo para la entrega final.</w:t>
+        <w:t xml:space="preserve">Durante el desarrollo se han detectado y corregido errores relacionados con validaciones, permisos, comunicación entre </w:t>
+      </w:r>
+      <w:proofErr w:type="spellStart"/>
+      <w:r>
+        <w:t>frontend</w:t>
+      </w:r>
+      <w:proofErr w:type="spellEnd"/>
+      <w:r>
+        <w:t xml:space="preserve"> y </w:t>
+      </w:r>
+      <w:proofErr w:type="spellStart"/>
+      <w:r>
+        <w:t>backend</w:t>
+      </w:r>
+      <w:proofErr w:type="spellEnd"/>
+      <w:r>
+        <w:t xml:space="preserve"> y funcionamiento del mapa. Estas correcciones han permitido mejorar la estabilidad de la aplicación y dejarla en un estado más completo para la entrega final.</w:t>
       </w:r>
     </w:p>
     <w:p/>
@@ -14095,7 +15103,83 @@
     </w:p>
     <w:p>
       <w:r>
-        <w:t>(El backend fue testeado antes de que el frontend siquiera fuera creado,se usó postman para testear el backend y luego para testear el frontend se uso la propia vista del usuario,la consola del navegador y el cmd para ver que todos los procesos tiraban bien y demás)</w:t>
+        <w:t xml:space="preserve">(El </w:t>
+      </w:r>
+      <w:proofErr w:type="spellStart"/>
+      <w:r>
+        <w:t>backend</w:t>
+      </w:r>
+      <w:proofErr w:type="spellEnd"/>
+      <w:r>
+        <w:t xml:space="preserve"> fue testeado antes de que el </w:t>
+      </w:r>
+      <w:proofErr w:type="spellStart"/>
+      <w:r>
+        <w:t>frontend</w:t>
+      </w:r>
+      <w:proofErr w:type="spellEnd"/>
+      <w:r>
+        <w:t xml:space="preserve"> siquiera fuera </w:t>
+      </w:r>
+      <w:proofErr w:type="spellStart"/>
+      <w:proofErr w:type="gramStart"/>
+      <w:r>
+        <w:t>creado,se</w:t>
+      </w:r>
+      <w:proofErr w:type="spellEnd"/>
+      <w:proofErr w:type="gramEnd"/>
+      <w:r>
+        <w:t xml:space="preserve"> usó </w:t>
+      </w:r>
+      <w:proofErr w:type="spellStart"/>
+      <w:r>
+        <w:t>postman</w:t>
+      </w:r>
+      <w:proofErr w:type="spellEnd"/>
+      <w:r>
+        <w:t xml:space="preserve"> para testear el </w:t>
+      </w:r>
+      <w:proofErr w:type="spellStart"/>
+      <w:r>
+        <w:t>backend</w:t>
+      </w:r>
+      <w:proofErr w:type="spellEnd"/>
+      <w:r>
+        <w:t xml:space="preserve"> y luego para testear el </w:t>
+      </w:r>
+      <w:proofErr w:type="spellStart"/>
+      <w:r>
+        <w:t>frontend</w:t>
+      </w:r>
+      <w:proofErr w:type="spellEnd"/>
+      <w:r>
+        <w:t xml:space="preserve"> se </w:t>
+      </w:r>
+      <w:proofErr w:type="spellStart"/>
+      <w:r>
+        <w:t>uso</w:t>
+      </w:r>
+      <w:proofErr w:type="spellEnd"/>
+      <w:r>
+        <w:t xml:space="preserve"> la propia vista del </w:t>
+      </w:r>
+      <w:proofErr w:type="spellStart"/>
+      <w:proofErr w:type="gramStart"/>
+      <w:r>
+        <w:t>usuario,la</w:t>
+      </w:r>
+      <w:proofErr w:type="spellEnd"/>
+      <w:proofErr w:type="gramEnd"/>
+      <w:r>
+        <w:t xml:space="preserve"> consola del navegador y el </w:t>
+      </w:r>
+      <w:proofErr w:type="spellStart"/>
+      <w:r>
+        <w:t>cmd</w:t>
+      </w:r>
+      <w:proofErr w:type="spellEnd"/>
+      <w:r>
+        <w:t xml:space="preserve"> para ver que todos los procesos tiraban bien y demás)</w:t>
       </w:r>
     </w:p>
     <w:p>
@@ -14288,7 +15372,23 @@
           <w:b/>
           <w:bCs/>
         </w:rPr>
-        <w:t>3.- Diseñar carteles o flyers con un código QR hacia la aplicación.</w:t>
+        <w:t xml:space="preserve">3.- Diseñar carteles o </w:t>
+      </w:r>
+      <w:proofErr w:type="spellStart"/>
+      <w:r>
+        <w:rPr>
+          <w:b/>
+          <w:bCs/>
+        </w:rPr>
+        <w:t>flyers</w:t>
+      </w:r>
+      <w:proofErr w:type="spellEnd"/>
+      <w:r>
+        <w:rPr>
+          <w:b/>
+          <w:bCs/>
+        </w:rPr>
+        <w:t xml:space="preserve"> con un código QR hacia la aplicación.</w:t>
       </w:r>
     </w:p>
     <w:p>
@@ -14411,7 +15511,15 @@
     </w:p>
     <w:p>
       <w:r>
-        <w:t>1.- Diseño de carteles o flyers: 20–40 €.</w:t>
+        <w:t xml:space="preserve">1.- Diseño de carteles o </w:t>
+      </w:r>
+      <w:proofErr w:type="spellStart"/>
+      <w:r>
+        <w:t>flyers</w:t>
+      </w:r>
+      <w:proofErr w:type="spellEnd"/>
+      <w:r>
+        <w:t>: 20–40 €.</w:t>
       </w:r>
     </w:p>
     <w:p>
@@ -14577,7 +15685,15 @@
     </w:p>
     <w:p>
       <w:r>
-        <w:t>Las sugerencias de mejora se guardarían para valorar si pueden añadirse en futuras versiones del proyecto. De esta forma, el feedback de los usuarios serviría para evolucionar Digital-FIT de forma más realista.</w:t>
+        <w:t xml:space="preserve">Las sugerencias de mejora se guardarían para valorar si pueden añadirse en futuras versiones del proyecto. De esta forma, el </w:t>
+      </w:r>
+      <w:proofErr w:type="spellStart"/>
+      <w:r>
+        <w:t>feedback</w:t>
+      </w:r>
+      <w:proofErr w:type="spellEnd"/>
+      <w:r>
+        <w:t xml:space="preserve"> de los usuarios serviría para evolucionar Digital-FIT de forma más realista.</w:t>
       </w:r>
     </w:p>
     <w:p/>
@@ -14653,7 +15769,23 @@
         <w:t xml:space="preserve">La </w:t>
       </w:r>
       <w:r>
-        <w:t>evaluación no se ha centrado únicamente en la idea inicial, sino también en el funcionamiento real del backend, frontend, base de datos y experiencia de usuario.</w:t>
+        <w:t xml:space="preserve">evaluación no se ha centrado únicamente en la idea inicial, sino también en el funcionamiento real del </w:t>
+      </w:r>
+      <w:proofErr w:type="spellStart"/>
+      <w:r>
+        <w:t>backend</w:t>
+      </w:r>
+      <w:proofErr w:type="spellEnd"/>
+      <w:r>
+        <w:t xml:space="preserve">, </w:t>
+      </w:r>
+      <w:proofErr w:type="spellStart"/>
+      <w:r>
+        <w:t>frontend</w:t>
+      </w:r>
+      <w:proofErr w:type="spellEnd"/>
+      <w:r>
+        <w:t>, base de datos y experiencia de usuario.</w:t>
       </w:r>
     </w:p>
     <w:p>
@@ -14681,10 +15813,18 @@
         <w:t>En el caso del usuario normal, se ha revisado el registro, el inicio de sesión, la navegación por la aplicación, la consulta de centros y lugares, el uso del mapa, la gestión de entrenamientos</w:t>
       </w:r>
       <w:r>
-        <w:t xml:space="preserve"> (Historial</w:t>
-      </w:r>
-      <w:r>
-        <w:t xml:space="preserve"> , apartado comunidad</w:t>
+        <w:t xml:space="preserve"> (</w:t>
+      </w:r>
+      <w:proofErr w:type="gramStart"/>
+      <w:r>
+        <w:t>Historial</w:t>
+      </w:r>
+      <w:r>
+        <w:t xml:space="preserve"> ,</w:t>
+      </w:r>
+      <w:proofErr w:type="gramEnd"/>
+      <w:r>
+        <w:t xml:space="preserve"> apartado comunidad</w:t>
       </w:r>
       <w:r>
         <w:t xml:space="preserve"> y sistema de estadísticas)</w:t>
@@ -14716,7 +15856,23 @@
         <w:t>4.-</w:t>
       </w:r>
       <w:r>
-        <w:t>También se ha evaluado la coherencia entre la parte visual y la parte técnica. Para ello, se ha comprobado que las acciones realizadas en el frontend se reflejen correctamente en el backend y en la base de datos. Por ejemplo, al crear un entrenamiento, guardar un lugar desde el mapa o añadir una valoración, los datos deben almacenarse correctamente y mostrarse después al usuario.</w:t>
+        <w:t xml:space="preserve">También se ha evaluado la coherencia entre la parte visual y la parte técnica. Para ello, se ha comprobado que las acciones realizadas en el </w:t>
+      </w:r>
+      <w:proofErr w:type="spellStart"/>
+      <w:r>
+        <w:t>frontend</w:t>
+      </w:r>
+      <w:proofErr w:type="spellEnd"/>
+      <w:r>
+        <w:t xml:space="preserve"> se reflejen correctamente en el </w:t>
+      </w:r>
+      <w:proofErr w:type="spellStart"/>
+      <w:r>
+        <w:t>backend</w:t>
+      </w:r>
+      <w:proofErr w:type="spellEnd"/>
+      <w:r>
+        <w:t xml:space="preserve"> y en la base de datos. Por ejemplo, al crear un entrenamiento, guardar un lugar desde el mapa o añadir una valoración, los datos deben almacenarse correctamente y mostrarse después al usuario.</w:t>
       </w:r>
     </w:p>
     <w:p/>
@@ -14797,8 +15953,13 @@
         <w:t>7.- Correcta gestión de entrenamientos</w:t>
       </w:r>
       <w:r>
-        <w:t xml:space="preserve"> con su historial/estadisticas</w:t>
-      </w:r>
+        <w:t xml:space="preserve"> con su historial/</w:t>
+      </w:r>
+      <w:proofErr w:type="spellStart"/>
+      <w:r>
+        <w:t>estadisticas</w:t>
+      </w:r>
+      <w:proofErr w:type="spellEnd"/>
       <w:r>
         <w:t xml:space="preserve"> y valoraciones.</w:t>
       </w:r>
@@ -14879,7 +16040,23 @@
         <w:t>3.-</w:t>
       </w:r>
       <w:r>
-        <w:t xml:space="preserve">Otro resultado importante ha sido la integración del mapa con Leaflet y OpenStreetMap. El mapa permite buscar direcciones, seleccionar coordenadas y añadir centros o lugares desde una ubicación real. </w:t>
+        <w:t xml:space="preserve">Otro resultado importante ha sido la integración del mapa con </w:t>
+      </w:r>
+      <w:proofErr w:type="spellStart"/>
+      <w:r>
+        <w:t>Leaflet</w:t>
+      </w:r>
+      <w:proofErr w:type="spellEnd"/>
+      <w:r>
+        <w:t xml:space="preserve"> y </w:t>
+      </w:r>
+      <w:proofErr w:type="spellStart"/>
+      <w:r>
+        <w:t>OpenStreetMap</w:t>
+      </w:r>
+      <w:proofErr w:type="spellEnd"/>
+      <w:r>
+        <w:t xml:space="preserve">. El mapa permite buscar direcciones, seleccionar coordenadas y añadir centros o lugares desde una ubicación real. </w:t>
       </w:r>
     </w:p>
     <w:p>
@@ -15052,7 +16229,23 @@
         <w:t>3.-</w:t>
       </w:r>
       <w:r>
-        <w:t>También se encontraron problemas relacionados con la comunicación entre frontend y backend. En algunos casos, los datos enviados desde Angular no coincidían exactamente con lo que esperaba Spring Boot. La solución fue revisar los DTO, las validaciones y los servicios para que la información se enviara y recibiera correctamente.</w:t>
+        <w:t xml:space="preserve">También se encontraron problemas relacionados con la comunicación entre </w:t>
+      </w:r>
+      <w:proofErr w:type="spellStart"/>
+      <w:r>
+        <w:t>frontend</w:t>
+      </w:r>
+      <w:proofErr w:type="spellEnd"/>
+      <w:r>
+        <w:t xml:space="preserve"> y </w:t>
+      </w:r>
+      <w:proofErr w:type="spellStart"/>
+      <w:r>
+        <w:t>backend</w:t>
+      </w:r>
+      <w:proofErr w:type="spellEnd"/>
+      <w:r>
+        <w:t>. En algunos casos, los datos enviados desde Angular no coincidían exactamente con lo que esperaba Spring Boot. La solución fue revisar los DTO, las validaciones y los servicios para que la información se enviara y recibiera correctamente.</w:t>
       </w:r>
     </w:p>
     <w:p/>
@@ -15068,10 +16261,28 @@
         <w:t xml:space="preserve">Otra desviación fue el aumento de funcionalidades respecto a la idea inicial. El proyecto comenzó con una idea más sencilla, centrada en buscar centros y gestionar entrenamientos, pero finalmente se añadieron valoraciones, soporte, estadísticas, </w:t>
       </w:r>
       <w:r>
-        <w:t>historial de entrenamientos,</w:t>
-      </w:r>
-      <w:r>
-        <w:t>panel de administración y mapa interactivo. Para evitar que esto afectara negativamente al proyecto, se fueron incorporando estas funciones poco a poco y comprobando su funcionamiento antes de avanzar.</w:t>
+        <w:t xml:space="preserve">historial de </w:t>
+      </w:r>
+      <w:proofErr w:type="spellStart"/>
+      <w:proofErr w:type="gramStart"/>
+      <w:r>
+        <w:t>entrenamientos,</w:t>
+      </w:r>
+      <w:r>
+        <w:t>panel</w:t>
+      </w:r>
+      <w:proofErr w:type="spellEnd"/>
+      <w:proofErr w:type="gramEnd"/>
+      <w:r>
+        <w:t xml:space="preserve"> de administración y mapa interactivo. Para evitar que esto </w:t>
+      </w:r>
+      <w:proofErr w:type="spellStart"/>
+      <w:r>
+        <w:t>afectara</w:t>
+      </w:r>
+      <w:proofErr w:type="spellEnd"/>
+      <w:r>
+        <w:t xml:space="preserve"> negativamente al proyecto, se fueron incorporando estas funciones poco a poco y comprobando su funcionamiento antes de avanzar.</w:t>
       </w:r>
     </w:p>
     <w:p>
@@ -15116,7 +16327,23 @@
     <w:p/>
     <w:p>
       <w:r>
-        <w:t>4.- Revisar la comunicación entre frontend y backend cuando aparecían errores.</w:t>
+        <w:t xml:space="preserve">4.- Revisar la comunicación entre </w:t>
+      </w:r>
+      <w:proofErr w:type="spellStart"/>
+      <w:r>
+        <w:t>frontend</w:t>
+      </w:r>
+      <w:proofErr w:type="spellEnd"/>
+      <w:r>
+        <w:t xml:space="preserve"> y </w:t>
+      </w:r>
+      <w:proofErr w:type="spellStart"/>
+      <w:r>
+        <w:t>backend</w:t>
+      </w:r>
+      <w:proofErr w:type="spellEnd"/>
+      <w:r>
+        <w:t xml:space="preserve"> cuando aparecían errores.</w:t>
       </w:r>
     </w:p>
     <w:p/>
@@ -15161,7 +16388,23 @@
       </w:r>
       <w:r>
         <w:br/>
-        <w:t>Los gastos principales estarían relacionados con el dominio web, el alojamiento del backend y la base de datos, y una difusión inicial básica. El frontend podría alojarse en servicios gratuitos, por lo que no supondría un coste importante en la primera fase.</w:t>
+        <w:t xml:space="preserve">Los gastos principales estarían relacionados con el dominio web, el alojamiento del </w:t>
+      </w:r>
+      <w:proofErr w:type="spellStart"/>
+      <w:r>
+        <w:t>backend</w:t>
+      </w:r>
+      <w:proofErr w:type="spellEnd"/>
+      <w:r>
+        <w:t xml:space="preserve"> y la base de datos, y una difusión inicial básica. El </w:t>
+      </w:r>
+      <w:proofErr w:type="spellStart"/>
+      <w:r>
+        <w:t>frontend</w:t>
+      </w:r>
+      <w:proofErr w:type="spellEnd"/>
+      <w:r>
+        <w:t xml:space="preserve"> podría alojarse en servicios gratuitos, por lo que no supondría un coste importante en la primera fase.</w:t>
       </w:r>
       <w:r>
         <w:br/>
@@ -15177,7 +16420,15 @@
       </w:pPr>
       <w:r>
         <w:br/>
-        <w:t>A corto plazo, el objetivo principal no sería obtener grandes beneficios, sino validar la aplicación con usuarios reales y comprobar si resulta útil para personas que entrenan en Valencia y la Comunidad Valenciana. En esta primera fase sería importante mantener los costes bajos y mejorar la aplicación a partir del feedback recibido.</w:t>
+        <w:t xml:space="preserve">A corto plazo, el objetivo principal no sería obtener grandes beneficios, sino validar la aplicación con usuarios reales y comprobar si resulta útil para personas que entrenan en Valencia y la Comunidad Valenciana. En esta primera fase sería importante mantener los costes bajos y mejorar la aplicación a partir del </w:t>
+      </w:r>
+      <w:proofErr w:type="spellStart"/>
+      <w:r>
+        <w:t>feedback</w:t>
+      </w:r>
+      <w:proofErr w:type="spellEnd"/>
+      <w:r>
+        <w:t xml:space="preserve"> recibido.</w:t>
       </w:r>
       <w:r>
         <w:br/>
@@ -15288,7 +16539,23 @@
       </w:r>
       <w:r>
         <w:br/>
-        <w:t>Durante el desarrollo se ha trabajado tanto la parte teórica como la parte práctica del proyecto. En la parte teórica se ha definido la empresa ficticia, el análisis del entorno, el público objetivo, la viabilidad económica, la identidad corporativa y la planificación general del proyecto. En la parte práctica se ha conseguido transformar esa idea inicial en una aplicación funcional con backend, frontend y base de datos.</w:t>
+        <w:t xml:space="preserve">Durante el desarrollo se ha trabajado tanto la parte teórica como la parte práctica del proyecto. En la parte teórica se ha definido la empresa ficticia, el análisis del entorno, el público objetivo, la viabilidad económica, la identidad corporativa y la planificación general del proyecto. En la parte práctica se ha conseguido transformar esa idea inicial en una aplicación funcional con </w:t>
+      </w:r>
+      <w:proofErr w:type="spellStart"/>
+      <w:r>
+        <w:t>backend</w:t>
+      </w:r>
+      <w:proofErr w:type="spellEnd"/>
+      <w:r>
+        <w:t xml:space="preserve">, </w:t>
+      </w:r>
+      <w:proofErr w:type="spellStart"/>
+      <w:r>
+        <w:t>frontend</w:t>
+      </w:r>
+      <w:proofErr w:type="spellEnd"/>
+      <w:r>
+        <w:t xml:space="preserve"> y base de datos.</w:t>
       </w:r>
       <w:r>
         <w:br/>
@@ -15308,7 +16575,23 @@
         <w:t xml:space="preserve"> </w:t>
       </w:r>
       <w:r>
-        <w:t>ha permitido aplicar conocimientos adquiridos durante el ciclo formativo en distintas áreas, como programación web, bases de datos, diseño de interfaces, organización de proyectos y lógica de aplicaciones cliente-servidor. También ha servido para enfrentarse a problemas reales de desarrollo, como la integración entre frontend y backend, la gestión de permisos, el trabajo con mapas o la corrección de errores durante las pruebas.</w:t>
+        <w:t xml:space="preserve">ha permitido aplicar conocimientos adquiridos durante el ciclo formativo en distintas áreas, como programación web, bases de datos, diseño de interfaces, organización de proyectos y lógica de aplicaciones cliente-servidor. También ha servido para enfrentarse a problemas reales de desarrollo, como la integración entre </w:t>
+      </w:r>
+      <w:proofErr w:type="spellStart"/>
+      <w:r>
+        <w:t>frontend</w:t>
+      </w:r>
+      <w:proofErr w:type="spellEnd"/>
+      <w:r>
+        <w:t xml:space="preserve"> y </w:t>
+      </w:r>
+      <w:proofErr w:type="spellStart"/>
+      <w:r>
+        <w:t>backend</w:t>
+      </w:r>
+      <w:proofErr w:type="spellEnd"/>
+      <w:r>
+        <w:t>, la gestión de permisos, el trabajo con mapas o la corrección de errores durante las pruebas.</w:t>
       </w:r>
       <w:r>
         <w:br/>
@@ -16141,7 +17424,23 @@
       <w:bookmarkEnd w:id="75"/>
       <w:r>
         <w:br/>
-        <w:t>En este anexo se incluyen capturas relacionadas con la estructura técnica de Digital-FIT. El objetivo es mostrar de forma general cómo se organiza el backend, el frontend y la base de datos, aportando una visión más técnica del proyecto sin recargar el documento principal con capturas de código.</w:t>
+        <w:t xml:space="preserve">En este anexo se incluyen capturas relacionadas con la estructura técnica de Digital-FIT. El objetivo es mostrar de forma general cómo se organiza el </w:t>
+      </w:r>
+      <w:proofErr w:type="spellStart"/>
+      <w:r>
+        <w:t>backend</w:t>
+      </w:r>
+      <w:proofErr w:type="spellEnd"/>
+      <w:r>
+        <w:t xml:space="preserve">, el </w:t>
+      </w:r>
+      <w:proofErr w:type="spellStart"/>
+      <w:r>
+        <w:t>frontend</w:t>
+      </w:r>
+      <w:proofErr w:type="spellEnd"/>
+      <w:r>
+        <w:t xml:space="preserve"> y la base de datos, aportando una visión más técnica del proyecto sin recargar el documento principal con capturas de código.</w:t>
       </w:r>
       <w:r>
         <w:br/>
@@ -16153,7 +17452,21 @@
         <w:rPr>
           <w:rStyle w:val="Ttulo4Car"/>
         </w:rPr>
-        <w:t>Figura B1.- Estructura general del backend en Spring Boot.</w:t>
+        <w:t xml:space="preserve">Figura B1.- Estructura general del </w:t>
+      </w:r>
+      <w:proofErr w:type="spellStart"/>
+      <w:r>
+        <w:rPr>
+          <w:rStyle w:val="Ttulo4Car"/>
+        </w:rPr>
+        <w:t>backend</w:t>
+      </w:r>
+      <w:proofErr w:type="spellEnd"/>
+      <w:r>
+        <w:rPr>
+          <w:rStyle w:val="Ttulo4Car"/>
+        </w:rPr>
+        <w:t xml:space="preserve"> en Spring Boot.</w:t>
       </w:r>
     </w:p>
     <w:p>
@@ -16162,16 +17475,20 @@
       </w:pPr>
       <w:r>
         <w:br/>
-        <w:t>Figura B2.- Estructura general del frontend en Angular.</w:t>
-      </w:r>
-    </w:p>
-    <w:p>
-      <w:pPr>
-        <w:pStyle w:val="Ttulo4"/>
-      </w:pPr>
+        <w:t xml:space="preserve">Figura B2.- Estructura general del </w:t>
+      </w:r>
+      <w:proofErr w:type="spellStart"/>
+      <w:r>
+        <w:t>frontend</w:t>
+      </w:r>
+      <w:proofErr w:type="spellEnd"/>
+      <w:r>
+        <w:t xml:space="preserve"> en Angular.</w:t>
+      </w:r>
+    </w:p>
+    <w:p>
       <w:r>
         <w:br/>
-        <w:t>Figura B3.- Ejemplo de comunicación entre frontend y backend.</w:t>
       </w:r>
     </w:p>
     <w:p>

</xml_diff>

<commit_message>
Manual y documento terminados
</commit_message>
<xml_diff>
--- a/Documentacion/DOC-Digital-Fit.docx
+++ b/Documentacion/DOC-Digital-Fit.docx
@@ -6363,13 +6363,41 @@
         </w:rPr>
         <w:t xml:space="preserve">En el entorno local, la competencia directa no es muy grande. Existen apps internacionales como </w:t>
       </w:r>
+      <w:proofErr w:type="spellStart"/>
       <w:r>
         <w:rPr>
           <w:rFonts w:cs="Arial"/>
           <w:b/>
           <w:bCs/>
         </w:rPr>
-        <w:t xml:space="preserve">Gympass, Freeletics o </w:t>
+        <w:t>Gympass</w:t>
+      </w:r>
+      <w:proofErr w:type="spellEnd"/>
+      <w:r>
+        <w:rPr>
+          <w:rFonts w:cs="Arial"/>
+          <w:b/>
+          <w:bCs/>
+        </w:rPr>
+        <w:t xml:space="preserve">, </w:t>
+      </w:r>
+      <w:proofErr w:type="spellStart"/>
+      <w:r>
+        <w:rPr>
+          <w:rFonts w:cs="Arial"/>
+          <w:b/>
+          <w:bCs/>
+        </w:rPr>
+        <w:t>Freeletics</w:t>
+      </w:r>
+      <w:proofErr w:type="spellEnd"/>
+      <w:r>
+        <w:rPr>
+          <w:rFonts w:cs="Arial"/>
+          <w:b/>
+          <w:bCs/>
+        </w:rPr>
+        <w:t xml:space="preserve"> o </w:t>
       </w:r>
       <w:proofErr w:type="spellStart"/>
       <w:r>
@@ -17416,9 +17444,69 @@
       <w:bookmarkStart w:id="75" w:name="_Toc227174431"/>
       <w:r>
         <w:rPr>
+          <w:rStyle w:val="Ttulo4Car"/>
+        </w:rPr>
+        <w:lastRenderedPageBreak/>
+        <w:drawing>
+          <wp:anchor distT="0" distB="0" distL="114300" distR="114300" simplePos="0" relativeHeight="251662336" behindDoc="0" locked="0" layoutInCell="1" allowOverlap="1" wp14:anchorId="0C1B1B0B" wp14:editId="6F54B014">
+            <wp:simplePos x="0" y="0"/>
+            <wp:positionH relativeFrom="margin">
+              <wp:align>left</wp:align>
+            </wp:positionH>
+            <wp:positionV relativeFrom="paragraph">
+              <wp:posOffset>1015602</wp:posOffset>
+            </wp:positionV>
+            <wp:extent cx="3411941" cy="7798252"/>
+            <wp:effectExtent l="0" t="0" r="0" b="0"/>
+            <wp:wrapTopAndBottom/>
+            <wp:docPr id="690908632" name="Imagen 1"/>
+            <wp:cNvGraphicFramePr>
+              <a:graphicFrameLocks xmlns:a="http://schemas.openxmlformats.org/drawingml/2006/main" noChangeAspect="1"/>
+            </wp:cNvGraphicFramePr>
+            <a:graphic xmlns:a="http://schemas.openxmlformats.org/drawingml/2006/main">
+              <a:graphicData uri="http://schemas.openxmlformats.org/drawingml/2006/picture">
+                <pic:pic xmlns:pic="http://schemas.openxmlformats.org/drawingml/2006/picture">
+                  <pic:nvPicPr>
+                    <pic:cNvPr id="690908632" name=""/>
+                    <pic:cNvPicPr/>
+                  </pic:nvPicPr>
+                  <pic:blipFill>
+                    <a:blip r:embed="rId40">
+                      <a:extLst>
+                        <a:ext uri="{28A0092B-C50C-407E-A947-70E740481C1C}">
+                          <a14:useLocalDpi xmlns:a14="http://schemas.microsoft.com/office/drawing/2010/main" val="0"/>
+                        </a:ext>
+                      </a:extLst>
+                    </a:blip>
+                    <a:stretch>
+                      <a:fillRect/>
+                    </a:stretch>
+                  </pic:blipFill>
+                  <pic:spPr>
+                    <a:xfrm>
+                      <a:off x="0" y="0"/>
+                      <a:ext cx="3411941" cy="7798252"/>
+                    </a:xfrm>
+                    <a:prstGeom prst="rect">
+                      <a:avLst/>
+                    </a:prstGeom>
+                  </pic:spPr>
+                </pic:pic>
+              </a:graphicData>
+            </a:graphic>
+            <wp14:sizeRelH relativeFrom="margin">
+              <wp14:pctWidth>0</wp14:pctWidth>
+            </wp14:sizeRelH>
+            <wp14:sizeRelV relativeFrom="margin">
+              <wp14:pctHeight>0</wp14:pctHeight>
+            </wp14:sizeRelV>
+          </wp:anchor>
+        </w:drawing>
+      </w:r>
+      <w:r>
+        <w:rPr>
           <w:rStyle w:val="Ttulo3Car"/>
         </w:rPr>
-        <w:lastRenderedPageBreak/>
         <w:t>Anexo II. Estructura técnica del proyecto</w:t>
       </w:r>
       <w:bookmarkEnd w:id="75"/>
@@ -17440,15 +17528,12 @@
       </w:r>
       <w:proofErr w:type="spellEnd"/>
       <w:r>
-        <w:t xml:space="preserve"> y la base de datos, aportando una visión más técnica del proyecto sin recargar el documento principal con capturas de código.</w:t>
+        <w:t>.</w:t>
       </w:r>
       <w:r>
         <w:br/>
       </w:r>
       <w:r>
-        <w:br/>
-      </w:r>
-      <w:r>
         <w:rPr>
           <w:rStyle w:val="Ttulo4Car"/>
         </w:rPr>
@@ -17468,13 +17553,76 @@
         </w:rPr>
         <w:t xml:space="preserve"> en Spring Boot.</w:t>
       </w:r>
+      <w:r>
+        <w:rPr>
+          <w:noProof/>
+        </w:rPr>
+        <w:t xml:space="preserve"> </w:t>
+      </w:r>
     </w:p>
     <w:p>
       <w:pPr>
         <w:pStyle w:val="Ttulo4"/>
       </w:pPr>
       <w:r>
-        <w:br/>
+        <w:lastRenderedPageBreak/>
+        <w:drawing>
+          <wp:anchor distT="0" distB="0" distL="114300" distR="114300" simplePos="0" relativeHeight="251661312" behindDoc="0" locked="0" layoutInCell="1" allowOverlap="1" wp14:anchorId="1D665A31" wp14:editId="54ED3216">
+            <wp:simplePos x="0" y="0"/>
+            <wp:positionH relativeFrom="margin">
+              <wp:align>left</wp:align>
+            </wp:positionH>
+            <wp:positionV relativeFrom="paragraph">
+              <wp:posOffset>239196</wp:posOffset>
+            </wp:positionV>
+            <wp:extent cx="5431790" cy="8506460"/>
+            <wp:effectExtent l="0" t="0" r="0" b="8890"/>
+            <wp:wrapTopAndBottom/>
+            <wp:docPr id="433337068" name="Imagen 1"/>
+            <wp:cNvGraphicFramePr>
+              <a:graphicFrameLocks xmlns:a="http://schemas.openxmlformats.org/drawingml/2006/main" noChangeAspect="1"/>
+            </wp:cNvGraphicFramePr>
+            <a:graphic xmlns:a="http://schemas.openxmlformats.org/drawingml/2006/main">
+              <a:graphicData uri="http://schemas.openxmlformats.org/drawingml/2006/picture">
+                <pic:pic xmlns:pic="http://schemas.openxmlformats.org/drawingml/2006/picture">
+                  <pic:nvPicPr>
+                    <pic:cNvPr id="433337068" name=""/>
+                    <pic:cNvPicPr/>
+                  </pic:nvPicPr>
+                  <pic:blipFill>
+                    <a:blip r:embed="rId41">
+                      <a:extLst>
+                        <a:ext uri="{28A0092B-C50C-407E-A947-70E740481C1C}">
+                          <a14:useLocalDpi xmlns:a14="http://schemas.microsoft.com/office/drawing/2010/main" val="0"/>
+                        </a:ext>
+                      </a:extLst>
+                    </a:blip>
+                    <a:stretch>
+                      <a:fillRect/>
+                    </a:stretch>
+                  </pic:blipFill>
+                  <pic:spPr>
+                    <a:xfrm>
+                      <a:off x="0" y="0"/>
+                      <a:ext cx="5438737" cy="8517927"/>
+                    </a:xfrm>
+                    <a:prstGeom prst="rect">
+                      <a:avLst/>
+                    </a:prstGeom>
+                  </pic:spPr>
+                </pic:pic>
+              </a:graphicData>
+            </a:graphic>
+            <wp14:sizeRelH relativeFrom="margin">
+              <wp14:pctWidth>0</wp14:pctWidth>
+            </wp14:sizeRelH>
+            <wp14:sizeRelV relativeFrom="margin">
+              <wp14:pctHeight>0</wp14:pctHeight>
+            </wp14:sizeRelV>
+          </wp:anchor>
+        </w:drawing>
+      </w:r>
+      <w:r>
         <w:t xml:space="preserve">Figura B2.- Estructura general del </w:t>
       </w:r>
       <w:proofErr w:type="spellStart"/>
@@ -17486,26 +17634,6 @@
         <w:t xml:space="preserve"> en Angular.</w:t>
       </w:r>
     </w:p>
-    <w:p>
-      <w:r>
-        <w:br/>
-      </w:r>
-    </w:p>
-    <w:p>
-      <w:pPr>
-        <w:pStyle w:val="Ttulo4"/>
-      </w:pPr>
-    </w:p>
-    <w:p>
-      <w:pPr>
-        <w:spacing w:line="278" w:lineRule="auto"/>
-        <w:jc w:val="left"/>
-      </w:pPr>
-      <w:r>
-        <w:t xml:space="preserve"> </w:t>
-      </w:r>
-    </w:p>
-    <w:p/>
     <w:sectPr>
       <w:pgSz w:w="11906" w:h="16838" w:code="9"/>
       <w:pgMar w:top="1418" w:right="1418" w:bottom="1418" w:left="1418" w:header="708" w:footer="708" w:gutter="0"/>

</xml_diff>

<commit_message>
docs: completar la memoria y el manual de uso
- Exportar DOC-Digital-Fit.pdf y actualizar el .docx.
- Actualizar el manual de uso (incluye temporales de Word).
</commit_message>
<xml_diff>
--- a/Documentacion/DOC-Digital-Fit.docx
+++ b/Documentacion/DOC-Digital-Fit.docx
@@ -6363,13 +6363,41 @@
         </w:rPr>
         <w:t xml:space="preserve">En el entorno local, la competencia directa no es muy grande. Existen apps internacionales como </w:t>
       </w:r>
+      <w:proofErr w:type="spellStart"/>
       <w:r>
         <w:rPr>
           <w:rFonts w:cs="Arial"/>
           <w:b/>
           <w:bCs/>
         </w:rPr>
-        <w:t xml:space="preserve">Gympass, Freeletics o </w:t>
+        <w:t>Gympass</w:t>
+      </w:r>
+      <w:proofErr w:type="spellEnd"/>
+      <w:r>
+        <w:rPr>
+          <w:rFonts w:cs="Arial"/>
+          <w:b/>
+          <w:bCs/>
+        </w:rPr>
+        <w:t xml:space="preserve">, </w:t>
+      </w:r>
+      <w:proofErr w:type="spellStart"/>
+      <w:r>
+        <w:rPr>
+          <w:rFonts w:cs="Arial"/>
+          <w:b/>
+          <w:bCs/>
+        </w:rPr>
+        <w:t>Freeletics</w:t>
+      </w:r>
+      <w:proofErr w:type="spellEnd"/>
+      <w:r>
+        <w:rPr>
+          <w:rFonts w:cs="Arial"/>
+          <w:b/>
+          <w:bCs/>
+        </w:rPr>
+        <w:t xml:space="preserve"> o </w:t>
       </w:r>
       <w:proofErr w:type="spellStart"/>
       <w:r>
@@ -17416,9 +17444,69 @@
       <w:bookmarkStart w:id="75" w:name="_Toc227174431"/>
       <w:r>
         <w:rPr>
+          <w:rStyle w:val="Ttulo4Car"/>
+        </w:rPr>
+        <w:lastRenderedPageBreak/>
+        <w:drawing>
+          <wp:anchor distT="0" distB="0" distL="114300" distR="114300" simplePos="0" relativeHeight="251662336" behindDoc="0" locked="0" layoutInCell="1" allowOverlap="1" wp14:anchorId="0C1B1B0B" wp14:editId="6F54B014">
+            <wp:simplePos x="0" y="0"/>
+            <wp:positionH relativeFrom="margin">
+              <wp:align>left</wp:align>
+            </wp:positionH>
+            <wp:positionV relativeFrom="paragraph">
+              <wp:posOffset>1015602</wp:posOffset>
+            </wp:positionV>
+            <wp:extent cx="3411941" cy="7798252"/>
+            <wp:effectExtent l="0" t="0" r="0" b="0"/>
+            <wp:wrapTopAndBottom/>
+            <wp:docPr id="690908632" name="Imagen 1"/>
+            <wp:cNvGraphicFramePr>
+              <a:graphicFrameLocks xmlns:a="http://schemas.openxmlformats.org/drawingml/2006/main" noChangeAspect="1"/>
+            </wp:cNvGraphicFramePr>
+            <a:graphic xmlns:a="http://schemas.openxmlformats.org/drawingml/2006/main">
+              <a:graphicData uri="http://schemas.openxmlformats.org/drawingml/2006/picture">
+                <pic:pic xmlns:pic="http://schemas.openxmlformats.org/drawingml/2006/picture">
+                  <pic:nvPicPr>
+                    <pic:cNvPr id="690908632" name=""/>
+                    <pic:cNvPicPr/>
+                  </pic:nvPicPr>
+                  <pic:blipFill>
+                    <a:blip r:embed="rId40">
+                      <a:extLst>
+                        <a:ext uri="{28A0092B-C50C-407E-A947-70E740481C1C}">
+                          <a14:useLocalDpi xmlns:a14="http://schemas.microsoft.com/office/drawing/2010/main" val="0"/>
+                        </a:ext>
+                      </a:extLst>
+                    </a:blip>
+                    <a:stretch>
+                      <a:fillRect/>
+                    </a:stretch>
+                  </pic:blipFill>
+                  <pic:spPr>
+                    <a:xfrm>
+                      <a:off x="0" y="0"/>
+                      <a:ext cx="3411941" cy="7798252"/>
+                    </a:xfrm>
+                    <a:prstGeom prst="rect">
+                      <a:avLst/>
+                    </a:prstGeom>
+                  </pic:spPr>
+                </pic:pic>
+              </a:graphicData>
+            </a:graphic>
+            <wp14:sizeRelH relativeFrom="margin">
+              <wp14:pctWidth>0</wp14:pctWidth>
+            </wp14:sizeRelH>
+            <wp14:sizeRelV relativeFrom="margin">
+              <wp14:pctHeight>0</wp14:pctHeight>
+            </wp14:sizeRelV>
+          </wp:anchor>
+        </w:drawing>
+      </w:r>
+      <w:r>
+        <w:rPr>
           <w:rStyle w:val="Ttulo3Car"/>
         </w:rPr>
-        <w:lastRenderedPageBreak/>
         <w:t>Anexo II. Estructura técnica del proyecto</w:t>
       </w:r>
       <w:bookmarkEnd w:id="75"/>
@@ -17440,15 +17528,12 @@
       </w:r>
       <w:proofErr w:type="spellEnd"/>
       <w:r>
-        <w:t xml:space="preserve"> y la base de datos, aportando una visión más técnica del proyecto sin recargar el documento principal con capturas de código.</w:t>
+        <w:t>.</w:t>
       </w:r>
       <w:r>
         <w:br/>
       </w:r>
       <w:r>
-        <w:br/>
-      </w:r>
-      <w:r>
         <w:rPr>
           <w:rStyle w:val="Ttulo4Car"/>
         </w:rPr>
@@ -17468,13 +17553,76 @@
         </w:rPr>
         <w:t xml:space="preserve"> en Spring Boot.</w:t>
       </w:r>
+      <w:r>
+        <w:rPr>
+          <w:noProof/>
+        </w:rPr>
+        <w:t xml:space="preserve"> </w:t>
+      </w:r>
     </w:p>
     <w:p>
       <w:pPr>
         <w:pStyle w:val="Ttulo4"/>
       </w:pPr>
       <w:r>
-        <w:br/>
+        <w:lastRenderedPageBreak/>
+        <w:drawing>
+          <wp:anchor distT="0" distB="0" distL="114300" distR="114300" simplePos="0" relativeHeight="251661312" behindDoc="0" locked="0" layoutInCell="1" allowOverlap="1" wp14:anchorId="1D665A31" wp14:editId="54ED3216">
+            <wp:simplePos x="0" y="0"/>
+            <wp:positionH relativeFrom="margin">
+              <wp:align>left</wp:align>
+            </wp:positionH>
+            <wp:positionV relativeFrom="paragraph">
+              <wp:posOffset>239196</wp:posOffset>
+            </wp:positionV>
+            <wp:extent cx="5431790" cy="8506460"/>
+            <wp:effectExtent l="0" t="0" r="0" b="8890"/>
+            <wp:wrapTopAndBottom/>
+            <wp:docPr id="433337068" name="Imagen 1"/>
+            <wp:cNvGraphicFramePr>
+              <a:graphicFrameLocks xmlns:a="http://schemas.openxmlformats.org/drawingml/2006/main" noChangeAspect="1"/>
+            </wp:cNvGraphicFramePr>
+            <a:graphic xmlns:a="http://schemas.openxmlformats.org/drawingml/2006/main">
+              <a:graphicData uri="http://schemas.openxmlformats.org/drawingml/2006/picture">
+                <pic:pic xmlns:pic="http://schemas.openxmlformats.org/drawingml/2006/picture">
+                  <pic:nvPicPr>
+                    <pic:cNvPr id="433337068" name=""/>
+                    <pic:cNvPicPr/>
+                  </pic:nvPicPr>
+                  <pic:blipFill>
+                    <a:blip r:embed="rId41">
+                      <a:extLst>
+                        <a:ext uri="{28A0092B-C50C-407E-A947-70E740481C1C}">
+                          <a14:useLocalDpi xmlns:a14="http://schemas.microsoft.com/office/drawing/2010/main" val="0"/>
+                        </a:ext>
+                      </a:extLst>
+                    </a:blip>
+                    <a:stretch>
+                      <a:fillRect/>
+                    </a:stretch>
+                  </pic:blipFill>
+                  <pic:spPr>
+                    <a:xfrm>
+                      <a:off x="0" y="0"/>
+                      <a:ext cx="5438737" cy="8517927"/>
+                    </a:xfrm>
+                    <a:prstGeom prst="rect">
+                      <a:avLst/>
+                    </a:prstGeom>
+                  </pic:spPr>
+                </pic:pic>
+              </a:graphicData>
+            </a:graphic>
+            <wp14:sizeRelH relativeFrom="margin">
+              <wp14:pctWidth>0</wp14:pctWidth>
+            </wp14:sizeRelH>
+            <wp14:sizeRelV relativeFrom="margin">
+              <wp14:pctHeight>0</wp14:pctHeight>
+            </wp14:sizeRelV>
+          </wp:anchor>
+        </w:drawing>
+      </w:r>
+      <w:r>
         <w:t xml:space="preserve">Figura B2.- Estructura general del </w:t>
       </w:r>
       <w:proofErr w:type="spellStart"/>
@@ -17486,26 +17634,6 @@
         <w:t xml:space="preserve"> en Angular.</w:t>
       </w:r>
     </w:p>
-    <w:p>
-      <w:r>
-        <w:br/>
-      </w:r>
-    </w:p>
-    <w:p>
-      <w:pPr>
-        <w:pStyle w:val="Ttulo4"/>
-      </w:pPr>
-    </w:p>
-    <w:p>
-      <w:pPr>
-        <w:spacing w:line="278" w:lineRule="auto"/>
-        <w:jc w:val="left"/>
-      </w:pPr>
-      <w:r>
-        <w:t xml:space="preserve"> </w:t>
-      </w:r>
-    </w:p>
-    <w:p/>
     <w:sectPr>
       <w:pgSz w:w="11906" w:h="16838" w:code="9"/>
       <w:pgMar w:top="1418" w:right="1418" w:bottom="1418" w:left="1418" w:header="708" w:footer="708" w:gutter="0"/>

</xml_diff>